<commit_message>
Update the User Guide to v2.1 for the new review screens
Section 5 introduces the "Quy trình duyệt" step bar; 5.4 describes the
Duyệt / Từ chối decision panel, the public-visibility line (with a new
figure 22b), readable decision history and the separate conflict form.
Labels follow the Vietnamese glossary throughout (tiers, statuses, fact
card, colour table, glossary, FAQ), and figures 14, 15, 22 and 24 are
recaptured from /dev/preview. The preview's foundation badges now show the
real labels instead of raw status codes.

Co-Authored-By: Claude Opus 5.5 <noreply@anthropic.com>
</commit_message>
<xml_diff>
--- a/documents/User_Guide.docx
+++ b/documents/User_Guide.docx
@@ -59,7 +59,7 @@
         <w:spacing w:after="120" w:line="300"/>
       </w:pPr>
       <w:r>
-        <w:t xml:space="preserve">Phiên bản: 2.0 · Ngày: 2026-09-28 · Áp dụng cho các tính năng đến hết Slice 10a (crawler tự động và AI trích xuất thông tin ứng viên).</w:t>
+        <w:t xml:space="preserve">Phiên bản: 2.1 · Ngày: 2026-09-30 · Áp dụng cho các tính năng đến hết Slice 10a, cùng giao diện duyệt mới (tiếng Việt, nút Duyệt / Từ chối, quy trình duyệt).</w:t>
       </w:r>
     </w:p>
     <w:p>
@@ -138,7 +138,7 @@
         <w:pageBreakBefore/>
       </w:pPr>
       <w:r>
-        <w:t xml:space="preserve">Có gì mới trong phiên bản 2.0</w:t>
+        <w:t xml:space="preserve">Có gì mới trong phiên bản 2.1</w:t>
       </w:r>
     </w:p>
     <w:tbl>
@@ -266,24 +266,7 @@
           </w:tcPr>
           <w:p>
             <w:r>
-              <w:t xml:space="preserve">Thẻ thông tin có nhãn </w:t>
-            </w:r>
-            <w:r>
-              <w:rPr>
-                <w:b/>
-                <w:bCs/>
-              </w:rPr>
-              <w:t xml:space="preserve">Đề xuất bởi AI</w:t>
-            </w:r>
-            <w:r>
-              <w:t xml:space="preserve"> / </w:t>
-            </w:r>
-            <w:r>
-              <w:rPr>
-                <w:b/>
-                <w:bCs/>
-              </w:rPr>
-              <w:t xml:space="preserve">Trích bởi AI, đã qua người duyệt</w:t>
+              <w:t xml:space="preserve">Giao diện dùng tiếng Việt, nhãn dễ hiểu thay cho mã nội bộ (ví dụ T1 · Nhà nước, Chờ duyệt, Chưa xác minh)</w:t>
             </w:r>
           </w:p>
         </w:tc>
@@ -305,7 +288,7 @@
           </w:tcPr>
           <w:p>
             <w:r>
-              <w:t xml:space="preserve">Mọi trang có thông tin; hàng chờ duyệt</w:t>
+              <w:t xml:space="preserve">Mọi trang (các trang công khai đang được chuyển dần)</w:t>
             </w:r>
           </w:p>
         </w:tc>
@@ -327,7 +310,7 @@
           </w:tcPr>
           <w:p>
             <w:r>
-              <w:t xml:space="preserve">3.8, 5.11</w:t>
+              <w:t xml:space="preserve">1.3, 3.8, 6.1</w:t>
             </w:r>
           </w:p>
         </w:tc>
@@ -354,17 +337,7 @@
           </w:tcPr>
           <w:p>
             <w:r>
-              <w:t xml:space="preserve">Cảnh báo </w:t>
-            </w:r>
-            <w:r>
-              <w:rPr>
-                <w:b/>
-                <w:bCs/>
-              </w:rPr>
-              <w:t xml:space="preserve">Trang nguồn đã thay đổi</w:t>
-            </w:r>
-            <w:r>
-              <w:t xml:space="preserve"> trên thông tin đã công bố</w:t>
+              <w:t xml:space="preserve">Khung quyết định mới: việc cần đối chiếu, ghi chú bắt buộc, hai nút Duyệt / Từ chối</w:t>
             </w:r>
           </w:p>
         </w:tc>
@@ -386,7 +359,7 @@
           </w:tcPr>
           <w:p>
             <w:r>
-              <w:t xml:space="preserve">Mọi trang có thông tin</w:t>
+              <w:t xml:space="preserve">Bốn trang duyệt trong workspace</w:t>
             </w:r>
           </w:p>
         </w:tc>
@@ -408,7 +381,7 @@
           </w:tcPr>
           <w:p>
             <w:r>
-              <w:t xml:space="preserve">3.8, 5.10</w:t>
+              <w:t xml:space="preserve">5.4</w:t>
             </w:r>
           </w:p>
         </w:tc>
@@ -435,7 +408,7 @@
           </w:tcPr>
           <w:p>
             <w:r>
-              <w:t xml:space="preserve">Hệ thống tự lấy (crawl) trang nguồn đã đăng ký mỗi tuần</w:t>
+              <w:t xml:space="preserve">Mỗi mục cho biết có đang hiển thị công khai không, và nếu không thì vì sao</w:t>
             </w:r>
           </w:p>
         </w:tc>
@@ -457,7 +430,7 @@
           </w:tcPr>
           <w:p>
             <w:r>
-              <w:t xml:space="preserve">Quản trị → Crawler</w:t>
+              <w:t xml:space="preserve">Bốn trang duyệt trong workspace</w:t>
             </w:r>
           </w:p>
         </w:tc>
@@ -479,7 +452,7 @@
           </w:tcPr>
           <w:p>
             <w:r>
-              <w:t xml:space="preserve">5.9</w:t>
+              <w:t xml:space="preserve">5.4</w:t>
             </w:r>
           </w:p>
         </w:tc>
@@ -506,17 +479,7 @@
           </w:tcPr>
           <w:p>
             <w:r>
-              <w:t xml:space="preserve">Hàng chờ </w:t>
-            </w:r>
-            <w:r>
-              <w:rPr>
-                <w:b/>
-                <w:bCs/>
-              </w:rPr>
-              <w:t xml:space="preserve">Nguồn đã đổi</w:t>
-            </w:r>
-            <w:r>
-              <w:t xml:space="preserve"> cho người duyệt</w:t>
+              <w:t xml:space="preserve">Thanh Quy trình duyệt với số việc đang chờ ở từng bước</w:t>
             </w:r>
           </w:p>
         </w:tc>
@@ -538,7 +501,7 @@
           </w:tcPr>
           <w:p>
             <w:r>
-              <w:t xml:space="preserve">Thông tin &amp; bằng chứng</w:t>
+              <w:t xml:space="preserve">Đầu bốn trang duyệt</w:t>
             </w:r>
           </w:p>
         </w:tc>
@@ -560,7 +523,7 @@
           </w:tcPr>
           <w:p>
             <w:r>
-              <w:t xml:space="preserve">5.10</w:t>
+              <w:t xml:space="preserve">5</w:t>
             </w:r>
           </w:p>
         </w:tc>
@@ -587,7 +550,7 @@
           </w:tcPr>
           <w:p>
             <w:r>
-              <w:t xml:space="preserve">Yêu cầu AI đọc tài liệu và tạo đề xuất; nhật ký trích xuất</w:t>
+              <w:t xml:space="preserve">Lịch sử quyết định ghi tên mục và nhãn dễ đọc</w:t>
             </w:r>
           </w:p>
         </w:tc>
@@ -609,7 +572,7 @@
           </w:tcPr>
           <w:p>
             <w:r>
-              <w:t xml:space="preserve">Trang tài liệu; Quản trị → Trích xuất AI</w:t>
+              <w:t xml:space="preserve">Cuối bốn trang duyệt</w:t>
             </w:r>
           </w:p>
         </w:tc>
@@ -631,7 +594,7 @@
           </w:tcPr>
           <w:p>
             <w:r>
-              <w:t xml:space="preserve">5.11</w:t>
+              <w:t xml:space="preserve">5.4</w:t>
             </w:r>
           </w:p>
         </w:tc>
@@ -658,17 +621,7 @@
           </w:tcPr>
           <w:p>
             <w:r>
-              <w:t xml:space="preserve">Mục </w:t>
-            </w:r>
-            <w:r>
-              <w:rPr>
-                <w:b/>
-                <w:bCs/>
-              </w:rPr>
-              <w:t xml:space="preserve">Văn bản trích (nội bộ)</w:t>
-            </w:r>
-            <w:r>
-              <w:t xml:space="preserve"> trên trang tài liệu</w:t>
+              <w:t xml:space="preserve">Đánh dấu mâu thuẫn là form riêng, chỉ có ở thông tin đã duyệt</w:t>
             </w:r>
           </w:p>
         </w:tc>
@@ -690,7 +643,7 @@
           </w:tcPr>
           <w:p>
             <w:r>
-              <w:t xml:space="preserve">Trang tài liệu (chỉ biên tập viên)</w:t>
+              <w:t xml:space="preserve">Thông tin &amp; bằng chứng</w:t>
             </w:r>
           </w:p>
         </w:tc>
@@ -712,149 +665,7 @@
           </w:tcPr>
           <w:p>
             <w:r>
-              <w:t xml:space="preserve">3.9, 5.9</w:t>
-            </w:r>
-          </w:p>
-        </w:tc>
-      </w:tr>
-      <w:tr>
-        <w:trPr>
-          <w:cantSplit/>
-        </w:trPr>
-        <w:tc>
-          <w:tcPr>
-            <w:tcW w:type="dxa" w:w="4300"/>
-            <w:tcBorders>
-              <w:top w:val="single" w:color="D2D2D7" w:sz="4"/>
-              <w:left w:val="single" w:color="D2D2D7" w:sz="4"/>
-              <w:bottom w:val="single" w:color="D2D2D7" w:sz="4"/>
-              <w:right w:val="single" w:color="D2D2D7" w:sz="4"/>
-            </w:tcBorders>
-            <w:tcMar>
-              <w:top w:type="dxa" w:w="80"/>
-              <w:left w:type="dxa" w:w="120"/>
-              <w:bottom w:type="dxa" w:w="80"/>
-              <w:right w:type="dxa" w:w="120"/>
-            </w:tcMar>
-          </w:tcPr>
-          <w:p>
-            <w:r>
-              <w:t xml:space="preserve">Bỏ nhãn cố định “Extraction not started” trên trang tài liệu</w:t>
-            </w:r>
-          </w:p>
-        </w:tc>
-        <w:tc>
-          <w:tcPr>
-            <w:tcW w:type="dxa" w:w="3100"/>
-            <w:tcBorders>
-              <w:top w:val="single" w:color="D2D2D7" w:sz="4"/>
-              <w:left w:val="single" w:color="D2D2D7" w:sz="4"/>
-              <w:bottom w:val="single" w:color="D2D2D7" w:sz="4"/>
-              <w:right w:val="single" w:color="D2D2D7" w:sz="4"/>
-            </w:tcBorders>
-            <w:tcMar>
-              <w:top w:type="dxa" w:w="80"/>
-              <w:left w:type="dxa" w:w="120"/>
-              <w:bottom w:type="dxa" w:w="80"/>
-              <w:right w:type="dxa" w:w="120"/>
-            </w:tcMar>
-          </w:tcPr>
-          <w:p>
-            <w:r>
-              <w:t xml:space="preserve">Documents</w:t>
-            </w:r>
-          </w:p>
-        </w:tc>
-        <w:tc>
-          <w:tcPr>
-            <w:tcW w:type="dxa" w:w="1626"/>
-            <w:tcBorders>
-              <w:top w:val="single" w:color="D2D2D7" w:sz="4"/>
-              <w:left w:val="single" w:color="D2D2D7" w:sz="4"/>
-              <w:bottom w:val="single" w:color="D2D2D7" w:sz="4"/>
-              <w:right w:val="single" w:color="D2D2D7" w:sz="4"/>
-            </w:tcBorders>
-            <w:tcMar>
-              <w:top w:type="dxa" w:w="80"/>
-              <w:left w:type="dxa" w:w="120"/>
-              <w:bottom w:type="dxa" w:w="80"/>
-              <w:right w:type="dxa" w:w="120"/>
-            </w:tcMar>
-          </w:tcPr>
-          <w:p>
-            <w:r>
-              <w:t xml:space="preserve">3.9</w:t>
-            </w:r>
-          </w:p>
-        </w:tc>
-      </w:tr>
-      <w:tr>
-        <w:trPr>
-          <w:cantSplit/>
-        </w:trPr>
-        <w:tc>
-          <w:tcPr>
-            <w:tcW w:type="dxa" w:w="4300"/>
-            <w:tcBorders>
-              <w:top w:val="single" w:color="D2D2D7" w:sz="4"/>
-              <w:left w:val="single" w:color="D2D2D7" w:sz="4"/>
-              <w:bottom w:val="single" w:color="D2D2D7" w:sz="4"/>
-              <w:right w:val="single" w:color="D2D2D7" w:sz="4"/>
-            </w:tcBorders>
-            <w:tcMar>
-              <w:top w:type="dxa" w:w="80"/>
-              <w:left w:type="dxa" w:w="120"/>
-              <w:bottom w:type="dxa" w:w="80"/>
-              <w:right w:type="dxa" w:w="120"/>
-            </w:tcMar>
-          </w:tcPr>
-          <w:p>
-            <w:r>
-              <w:t xml:space="preserve">Ảnh minh họa chụp lại theo giao diện hiện tại</w:t>
-            </w:r>
-          </w:p>
-        </w:tc>
-        <w:tc>
-          <w:tcPr>
-            <w:tcW w:type="dxa" w:w="3100"/>
-            <w:tcBorders>
-              <w:top w:val="single" w:color="D2D2D7" w:sz="4"/>
-              <w:left w:val="single" w:color="D2D2D7" w:sz="4"/>
-              <w:bottom w:val="single" w:color="D2D2D7" w:sz="4"/>
-              <w:right w:val="single" w:color="D2D2D7" w:sz="4"/>
-            </w:tcBorders>
-            <w:tcMar>
-              <w:top w:type="dxa" w:w="80"/>
-              <w:left w:type="dxa" w:w="120"/>
-              <w:bottom w:type="dxa" w:w="80"/>
-              <w:right w:type="dxa" w:w="120"/>
-            </w:tcMar>
-          </w:tcPr>
-          <w:p>
-            <w:r>
-              <w:t xml:space="preserve">Toàn bộ tài liệu</w:t>
-            </w:r>
-          </w:p>
-        </w:tc>
-        <w:tc>
-          <w:tcPr>
-            <w:tcW w:type="dxa" w:w="1626"/>
-            <w:tcBorders>
-              <w:top w:val="single" w:color="D2D2D7" w:sz="4"/>
-              <w:left w:val="single" w:color="D2D2D7" w:sz="4"/>
-              <w:bottom w:val="single" w:color="D2D2D7" w:sz="4"/>
-              <w:right w:val="single" w:color="D2D2D7" w:sz="4"/>
-            </w:tcBorders>
-            <w:tcMar>
-              <w:top w:type="dxa" w:w="80"/>
-              <w:left w:type="dxa" w:w="120"/>
-              <w:bottom w:type="dxa" w:w="80"/>
-              <w:right w:type="dxa" w:w="120"/>
-            </w:tcMar>
-          </w:tcPr>
-          <w:p>
-            <w:r>
-              <w:t xml:space="preserve">—</w:t>
+              <w:t xml:space="preserve">5.4</w:t>
             </w:r>
           </w:p>
         </w:tc>
@@ -883,7 +694,7 @@
         <w:t xml:space="preserve">Ghi chú: </w:t>
       </w:r>
       <w:r>
-        <w:t xml:space="preserve">Phiên bản 2.0 giữ toàn bộ nội dung của bản 1.1, chỉ cập nhật chỗ giao diện đã thay đổi và bổ sung phần mới. Lịch sử phiên bản ở cuối tài liệu.</w:t>
+        <w:t xml:space="preserve">Phiên bản 2.1 giữ toàn bộ nội dung của bản 2.0, chỉ cập nhật chỗ giao diện đã thay đổi. Các thay đổi của bản 2.0 (AI, crawler, cảnh báo nguồn đã đổi) có trong Lịch sử phiên bản ở cuối tài liệu.</w:t>
       </w:r>
     </w:p>
     <w:p>
@@ -1344,7 +1155,37 @@
         <w:spacing w:after="120" w:line="300"/>
       </w:pPr>
       <w:r>
-        <w:t xml:space="preserve">Mỗi nguồn được xếp một trong bốn mức. Mức cao hơn nghĩa là nguồn có thẩm quyền hơn, nhưng không có nghĩa mọi câu trong nguồn đó đều đúng.</w:t>
+        <w:t xml:space="preserve">Mỗi nguồn được xếp một trong bốn mức. Mức cao hơn nghĩa là nguồn có thẩm quyền hơn, nhưng không có nghĩa mọi câu trong nguồn đó đều đúng. Trên giao diện, nhãn ghi cả mã và tên ngắn, ví dụ </w:t>
+      </w:r>
+      <w:r>
+        <w:rPr>
+          <w:b/>
+          <w:bCs/>
+        </w:rPr>
+        <w:t xml:space="preserve">T1 · Nhà nước</w:t>
+      </w:r>
+      <w:r>
+        <w:t xml:space="preserve">, </w:t>
+      </w:r>
+      <w:r>
+        <w:rPr>
+          <w:b/>
+          <w:bCs/>
+        </w:rPr>
+        <w:t xml:space="preserve">T4 · Cộng đồng</w:t>
+      </w:r>
+      <w:r>
+        <w:t xml:space="preserve">; nguồn chưa được xếp mức ghi </w:t>
+      </w:r>
+      <w:r>
+        <w:rPr>
+          <w:b/>
+          <w:bCs/>
+        </w:rPr>
+        <w:t xml:space="preserve">Chưa phân loại</w:t>
+      </w:r>
+      <w:r>
+        <w:t xml:space="preserve">.</w:t>
       </w:r>
     </w:p>
     <w:tbl>
@@ -3801,14 +3642,47 @@
         <w:spacing w:after="60" w:line="290"/>
       </w:pPr>
       <w:r>
-        <w:rPr>
-          <w:b/>
-          <w:bCs/>
-        </w:rPr>
-        <w:t xml:space="preserve">Dòng trên cùng</w:t>
-      </w:r>
-      <w:r>
-        <w:t xml:space="preserve">: chủ đề, và nhãn trạng thái ở góc phải (Đã duyệt bằng chứng, Có mâu thuẫn…).</w:t>
+        <w:t xml:space="preserve">Dòng trên cùng: chủ đề, và nhãn trạng thái ở góc phải (</w:t>
+      </w:r>
+      <w:r>
+        <w:rPr>
+          <w:b/>
+          <w:bCs/>
+        </w:rPr>
+        <w:t xml:space="preserve">Chờ duyệt</w:t>
+      </w:r>
+      <w:r>
+        <w:t xml:space="preserve">, </w:t>
+      </w:r>
+      <w:r>
+        <w:rPr>
+          <w:b/>
+          <w:bCs/>
+        </w:rPr>
+        <w:t xml:space="preserve">Đã duyệt bằng chứng</w:t>
+      </w:r>
+      <w:r>
+        <w:t xml:space="preserve">, </w:t>
+      </w:r>
+      <w:r>
+        <w:rPr>
+          <w:b/>
+          <w:bCs/>
+        </w:rPr>
+        <w:t xml:space="preserve">Có mâu thuẫn</w:t>
+      </w:r>
+      <w:r>
+        <w:t xml:space="preserve">, </w:t>
+      </w:r>
+      <w:r>
+        <w:rPr>
+          <w:b/>
+          <w:bCs/>
+        </w:rPr>
+        <w:t xml:space="preserve">Đã từ chối</w:t>
+      </w:r>
+      <w:r>
+        <w:t xml:space="preserve">).</w:t>
       </w:r>
     </w:p>
     <w:p>
@@ -3821,14 +3695,17 @@
         <w:spacing w:after="60" w:line="290"/>
       </w:pPr>
       <w:r>
-        <w:rPr>
-          <w:b/>
-          <w:bCs/>
-        </w:rPr>
-        <w:t xml:space="preserve">Giá trị</w:t>
-      </w:r>
-      <w:r>
-        <w:t xml:space="preserve"> in đậm; có thể kèm nhãn loại deadline, kỳ số liệu hoặc chỉ số so sánh.</w:t>
+        <w:t xml:space="preserve">Giá trị in đậm; có thể kèm nhãn hạn nộp (ví dụ </w:t>
+      </w:r>
+      <w:r>
+        <w:rPr>
+          <w:b/>
+          <w:bCs/>
+        </w:rPr>
+        <w:t xml:space="preserve">Hạn nộp: Xét tuyển liên tục</w:t>
+      </w:r>
+      <w:r>
+        <w:t xml:space="preserve">), kỳ số liệu hoặc chỉ số so sánh.</w:t>
       </w:r>
     </w:p>
     <w:p>
@@ -3865,7 +3742,27 @@
           <w:b/>
           <w:bCs/>
         </w:rPr>
-        <w:t xml:space="preserve">Nguồn và tier</w:t>
+        <w:t xml:space="preserve">Nguồn</w:t>
+      </w:r>
+      <w:r>
+        <w:t xml:space="preserve"> (kèm nhãn tier), </w:t>
+      </w:r>
+      <w:r>
+        <w:rPr>
+          <w:b/>
+          <w:bCs/>
+        </w:rPr>
+        <w:t xml:space="preserve">Hiệu lực</w:t>
+      </w:r>
+      <w:r>
+        <w:t xml:space="preserve"> (ghi rõ khi nguồn không nêu thời hạn áp dụng), </w:t>
+      </w:r>
+      <w:r>
+        <w:rPr>
+          <w:b/>
+          <w:bCs/>
+        </w:rPr>
+        <w:t xml:space="preserve">Ngày lấy trang nguồn</w:t>
       </w:r>
       <w:r>
         <w:t xml:space="preserve">, </w:t>
@@ -3875,26 +3772,6 @@
           <w:b/>
           <w:bCs/>
         </w:rPr>
-        <w:t xml:space="preserve">Hiệu lực</w:t>
-      </w:r>
-      <w:r>
-        <w:t xml:space="preserve"> (từ ngày, đến ngày, nếu nguồn có nêu), </w:t>
-      </w:r>
-      <w:r>
-        <w:rPr>
-          <w:b/>
-          <w:bCs/>
-        </w:rPr>
-        <w:t xml:space="preserve">Ngày thu thập</w:t>
-      </w:r>
-      <w:r>
-        <w:t xml:space="preserve">, </w:t>
-      </w:r>
-      <w:r>
-        <w:rPr>
-          <w:b/>
-          <w:bCs/>
-        </w:rPr>
         <w:t xml:space="preserve">Ngày duyệt bằng chứng</w:t>
       </w:r>
       <w:r>
@@ -3915,7 +3792,7 @@
           <w:b/>
           <w:bCs/>
         </w:rPr>
-        <w:t xml:space="preserve">Mở nguồn gốc</w:t>
+        <w:t xml:space="preserve">Mở trang gốc</w:t>
       </w:r>
       <w:r>
         <w:t xml:space="preserve"> để đọc trang gốc; </w:t>
@@ -3925,7 +3802,7 @@
           <w:b/>
           <w:bCs/>
         </w:rPr>
-        <w:t xml:space="preserve">Tài liệu và phiên bản bằng chứng</w:t>
+        <w:t xml:space="preserve">Tài liệu và các phiên bản</w:t>
       </w:r>
       <w:r>
         <w:t xml:space="preserve"> để xem bản ghi tài liệu trong Nordic.</w:t>
@@ -4000,7 +3877,7 @@
       <w:r>
         <w:drawing>
           <wp:inline distT="0" distB="0" distL="0" distR="0">
-            <wp:extent cx="1714500" cy="7810500"/>
+            <wp:extent cx="4495897" cy="8229600"/>
             <wp:effectExtent t="0" r="0" b="0" l="0"/>
             <wp:docPr id="1" name="fig14" descr="Minh họa các trạng thái của thẻ thông tin (dữ liệu DEMO)." title="Hình 14"/>
             <wp:cNvGraphicFramePr>
@@ -4025,7 +3902,7 @@
                   <pic:spPr bwMode="auto">
                     <a:xfrm>
                       <a:off x="0" y="0"/>
-                      <a:ext cx="1714500" cy="7810500"/>
+                      <a:ext cx="4495897" cy="8229600"/>
                     </a:xfrm>
                     <a:prstGeom prst="rect">
                       <a:avLst/>
@@ -4040,6 +3917,53 @@
     </w:p>
     <w:p>
       <w:pPr>
+        <w:keepNext/>
+        <w:spacing w:after="60" w:before="120"/>
+        <w:jc w:val="center"/>
+      </w:pPr>
+      <w:r>
+        <w:drawing>
+          <wp:inline distT="0" distB="0" distL="0" distR="0">
+            <wp:extent cx="5153565" cy="8229600"/>
+            <wp:effectExtent t="0" r="0" b="0" l="0"/>
+            <wp:docPr id="101" name="fig14b" descr="Minh họa các trạng thái của thẻ thông tin (dữ liệu DEMO)." title="Hình 14"/>
+            <wp:cNvGraphicFramePr>
+              <a:graphicFrameLocks xmlns:a="http://schemas.openxmlformats.org/drawingml/2006/main" noChangeAspect="1"/>
+            </wp:cNvGraphicFramePr>
+            <a:graphic xmlns:a="http://schemas.openxmlformats.org/drawingml/2006/main">
+              <a:graphicData uri="http://schemas.openxmlformats.org/drawingml/2006/picture">
+                <pic:pic xmlns:pic="http://schemas.openxmlformats.org/drawingml/2006/picture">
+                  <pic:nvPicPr>
+                    <pic:cNvPr id="0" name="" descr=""/>
+                    <pic:cNvPicPr>
+                      <a:picLocks noChangeAspect="1" noChangeArrowheads="1"/>
+                    </pic:cNvPicPr>
+                  </pic:nvPicPr>
+                  <pic:blipFill>
+                    <a:blip r:embed="rId34" cstate="none"/>
+                    <a:srcRect/>
+                    <a:stretch>
+                      <a:fillRect/>
+                    </a:stretch>
+                  </pic:blipFill>
+                  <pic:spPr bwMode="auto">
+                    <a:xfrm>
+                      <a:off x="0" y="0"/>
+                      <a:ext cx="5153565" cy="8229600"/>
+                    </a:xfrm>
+                    <a:prstGeom prst="rect">
+                      <a:avLst/>
+                    </a:prstGeom>
+                  </pic:spPr>
+                </pic:pic>
+              </a:graphicData>
+            </a:graphic>
+          </wp:inline>
+        </w:drawing>
+      </w:r>
+    </w:p>
+    <w:p>
+      <w:pPr>
         <w:spacing w:after="240"/>
         <w:jc w:val="center"/>
       </w:pPr>
@@ -4072,7 +3996,7 @@
         <w:t xml:space="preserve">Ghi chú: </w:t>
       </w:r>
       <w:r>
-        <w:t xml:space="preserve">“Đã duyệt bằng chứng” nghĩa là người biên tập đã đối chiếu trích đoạn với nguồn. Nhãn này không có nghĩa thông tin chắc chắn còn hiệu lực hôm nay; vì vậy thẻ luôn ghi “Chưa xác minh hiệu lực hiện tại”.</w:t>
+        <w:t xml:space="preserve">“Đã duyệt bằng chứng” nghĩa là người biên tập đã đối chiếu trích đoạn với nguồn. Nhãn này không có nghĩa thông tin chắc chắn còn hiệu lực hôm nay; vì vậy thẻ luôn ghi “Hiệu lực hiện tại chưa được xác minh”.</w:t>
       </w:r>
     </w:p>
     <w:p>
@@ -4084,7 +4008,7 @@
       <w:r>
         <w:drawing>
           <wp:inline distT="0" distB="0" distL="0" distR="0">
-            <wp:extent cx="5334000" cy="8572500"/>
+            <wp:extent cx="5317459" cy="8229600"/>
             <wp:effectExtent t="0" r="0" b="0" l="0"/>
             <wp:docPr id="1" name="fig15" descr="Ba trạng thái mới: đề xuất của AI (chỉ biên tập viên thấy), thông tin do AI trích đã được duyệt, và cảnh báo trang nguồn đã thay đổi (dữ liệu DEMO)." title="Hình 15"/>
             <wp:cNvGraphicFramePr>
@@ -4109,7 +4033,7 @@
                   <pic:spPr bwMode="auto">
                     <a:xfrm>
                       <a:off x="0" y="0"/>
-                      <a:ext cx="5334000" cy="8572500"/>
+                      <a:ext cx="5317459" cy="8229600"/>
                     </a:xfrm>
                     <a:prstGeom prst="rect">
                       <a:avLst/>
@@ -5901,7 +5825,107 @@
         <w:t xml:space="preserve">Lưu ý: </w:t>
       </w:r>
       <w:r>
-        <w:t xml:space="preserve">Không bao giờ nhập thông tin phỏng đoán. Nếu không tìm được câu nguyên văn trong nguồn để làm trích đoạn, hãy để trống. Mục nhập sai thì chọn “Không chấp nhận”; hệ thống không xóa để giữ lịch sử.</w:t>
+        <w:t xml:space="preserve">Không bao giờ nhập thông tin phỏng đoán. Nếu không tìm được câu nguyên văn trong nguồn để làm trích đoạn, hãy để trống. Mục nhập sai thì bấm </w:t>
+      </w:r>
+      <w:r>
+        <w:rPr>
+          <w:b/>
+          <w:bCs/>
+          <w:color w:val="A35200"/>
+        </w:rPr>
+        <w:t xml:space="preserve">Từ chối</w:t>
+      </w:r>
+      <w:r>
+        <w:t xml:space="preserve">; hệ thống không xóa để giữ lịch sử.</w:t>
+      </w:r>
+    </w:p>
+    <w:p>
+      <w:pPr>
+        <w:spacing w:after="120" w:line="300"/>
+      </w:pPr>
+      <w:r>
+        <w:t xml:space="preserve">Ở đầu bốn trang duyệt (</w:t>
+      </w:r>
+      <w:r>
+        <w:rPr>
+          <w:b/>
+          <w:bCs/>
+        </w:rPr>
+        <w:t xml:space="preserve">Thông tin &amp; bằng chứng</w:t>
+      </w:r>
+      <w:r>
+        <w:t xml:space="preserve">, </w:t>
+      </w:r>
+      <w:r>
+        <w:rPr>
+          <w:b/>
+          <w:bCs/>
+        </w:rPr>
+        <w:t xml:space="preserve">Trường &amp; chương trình</w:t>
+      </w:r>
+      <w:r>
+        <w:t xml:space="preserve">, </w:t>
+      </w:r>
+      <w:r>
+        <w:rPr>
+          <w:b/>
+          <w:bCs/>
+        </w:rPr>
+        <w:t xml:space="preserve">Quy định nhập cư</w:t>
+      </w:r>
+      <w:r>
+        <w:t xml:space="preserve">, </w:t>
+      </w:r>
+      <w:r>
+        <w:rPr>
+          <w:b/>
+          <w:bCs/>
+        </w:rPr>
+        <w:t xml:space="preserve">Thị trường lao động</w:t>
+      </w:r>
+      <w:r>
+        <w:t xml:space="preserve">), người có quyền duyệt thấy thanh </w:t>
+      </w:r>
+      <w:r>
+        <w:rPr>
+          <w:b/>
+          <w:bCs/>
+        </w:rPr>
+        <w:t xml:space="preserve">Quy trình duyệt</w:t>
+      </w:r>
+      <w:r>
+        <w:t xml:space="preserve"> gồm ba bước: </w:t>
+      </w:r>
+      <w:r>
+        <w:rPr>
+          <w:b/>
+          <w:bCs/>
+        </w:rPr>
+        <w:t xml:space="preserve">1 Xác minh nguồn → 2 Duyệt mục gốc → 3 Duyệt thông tin chi tiết</w:t>
+      </w:r>
+      <w:r>
+        <w:t xml:space="preserve">. Mỗi mục trong bước ghi số việc đang chờ (“Xong” khi không còn gì); bước bạn đang ở được tô xanh. Bước bạn không có quyền vẫn hiện, kèm dòng “Người quản lý nguồn thực hiện”; dấu “—” nghĩa là không đếm được lúc này.</w:t>
+      </w:r>
+    </w:p>
+    <w:p>
+      <w:pPr>
+        <w:pBdr>
+          <w:left w:val="single" w:color="1F7A38" w:sz="18" w:space="8"/>
+        </w:pBdr>
+        <w:shd w:fill="EAF7EE" w:color="auto" w:val="clear"/>
+        <w:spacing w:after="200" w:before="120" w:line="290"/>
+        <w:ind w:left="120" w:right="120"/>
+      </w:pPr>
+      <w:r>
+        <w:rPr>
+          <w:b/>
+          <w:bCs/>
+          <w:color w:val="1F7A38"/>
+        </w:rPr>
+        <w:t xml:space="preserve">Mẹo: </w:t>
+      </w:r>
+      <w:r>
+        <w:t xml:space="preserve">Làm theo thứ tự này. Nếu duyệt một quy định nhập cư khi nguồn T1 của nó chưa được xác minh, quy định vẫn bị ẩn; màn hình sẽ báo trước lý do (mục 5.4).</w:t>
       </w:r>
     </w:p>
     <w:p>
@@ -6767,7 +6791,7 @@
           <w:b/>
           <w:bCs/>
         </w:rPr>
-        <w:t xml:space="preserve">verified</w:t>
+        <w:t xml:space="preserve">Đã xác minh</w:t>
       </w:r>
       <w:r>
         <w:t xml:space="preserve"> rồi bấm </w:t>
@@ -6867,7 +6891,29 @@
         <w:t xml:space="preserve">Lưu ý: </w:t>
       </w:r>
       <w:r>
-        <w:t xml:space="preserve">Quy định nhập cư và số liệu lao động chỉ hiển thị công khai khi nguồn của chúng đang ở trạng thái verified. Chuyển nguồn về needs_verification sẽ ẩn các mục đó ngay lập tức.</w:t>
+        <w:t xml:space="preserve">Quy định nhập cư và số liệu lao động chỉ hiển thị công khai khi nguồn của chúng ở trạng thái </w:t>
+      </w:r>
+      <w:r>
+        <w:rPr>
+          <w:b/>
+          <w:bCs/>
+          <w:color w:val="A35200"/>
+        </w:rPr>
+        <w:t xml:space="preserve">Đã xác minh</w:t>
+      </w:r>
+      <w:r>
+        <w:t xml:space="preserve">. Chuyển nguồn về </w:t>
+      </w:r>
+      <w:r>
+        <w:rPr>
+          <w:b/>
+          <w:bCs/>
+          <w:color w:val="A35200"/>
+        </w:rPr>
+        <w:t xml:space="preserve">Chưa xác minh</w:t>
+      </w:r>
+      <w:r>
+        <w:t xml:space="preserve"> sẽ ẩn các mục đó ngay lập tức.</w:t>
       </w:r>
     </w:p>
     <w:p>
@@ -7206,24 +7252,34 @@
         <w:t xml:space="preserve">Chờ duyệt</w:t>
       </w:r>
       <w:r>
-        <w:t xml:space="preserve">, đọc trang gốc, mở </w:t>
-      </w:r>
-      <w:r>
-        <w:rPr>
-          <w:b/>
-          <w:bCs/>
-        </w:rPr>
-        <w:t xml:space="preserve">Duyệt đề xuất này</w:t>
-      </w:r>
-      <w:r>
-        <w:t xml:space="preserve">, chọn </w:t>
-      </w:r>
-      <w:r>
-        <w:rPr>
-          <w:b/>
-          <w:bCs/>
-        </w:rPr>
-        <w:t xml:space="preserve">Đã kiểm tra bằng chứng</w:t>
+        <w:t xml:space="preserve">. Bằng chứng và khung </w:t>
+      </w:r>
+      <w:r>
+        <w:rPr>
+          <w:b/>
+          <w:bCs/>
+        </w:rPr>
+        <w:t xml:space="preserve">Quyết định của bạn</w:t>
+      </w:r>
+      <w:r>
+        <w:t xml:space="preserve"> đã mở sẵn dưới mỗi mục. Mở trang gốc, kiểm tra theo danh sách trong khung, điền </w:t>
+      </w:r>
+      <w:r>
+        <w:rPr>
+          <w:b/>
+          <w:bCs/>
+        </w:rPr>
+        <w:t xml:space="preserve">Ghi chú kiểm tra</w:t>
+      </w:r>
+      <w:r>
+        <w:t xml:space="preserve"> (bắt buộc), rồi bấm </w:t>
+      </w:r>
+      <w:r>
+        <w:rPr>
+          <w:b/>
+          <w:bCs/>
+        </w:rPr>
+        <w:t xml:space="preserve">Duyệt</w:t>
       </w:r>
       <w:r>
         <w:t xml:space="preserve"> hoặc </w:t>
@@ -7233,20 +7289,23 @@
           <w:b/>
           <w:bCs/>
         </w:rPr>
-        <w:t xml:space="preserve">Không chấp nhận</w:t>
-      </w:r>
-      <w:r>
-        <w:t xml:space="preserve">, ghi lý do và bấm </w:t>
-      </w:r>
-      <w:r>
-        <w:rPr>
-          <w:b/>
-          <w:bCs/>
-        </w:rPr>
-        <w:t xml:space="preserve">Ghi nhận quyết định</w:t>
+        <w:t xml:space="preserve">Từ chối</w:t>
       </w:r>
       <w:r>
         <w:t xml:space="preserve">.</w:t>
+      </w:r>
+    </w:p>
+    <w:p>
+      <w:pPr>
+        <w:pStyle w:val="ListParagraph"/>
+        <w:numPr>
+          <w:ilvl w:val="0"/>
+          <w:numId w:val="21"/>
+        </w:numPr>
+        <w:spacing w:after="80" w:line="290"/>
+      </w:pPr>
+      <w:r>
+        <w:t xml:space="preserve">Không có lựa chọn nào được chọn sẵn: bạn phải bấm đúng một trong hai nút. Quyết định được lưu vào lịch sử và không sửa được; nếu nhầm, tạo đề xuất mới.</w:t>
       </w:r>
     </w:p>
     <w:p>
@@ -7258,7 +7317,7 @@
       <w:r>
         <w:drawing>
           <wp:inline distT="0" distB="0" distL="0" distR="0">
-            <wp:extent cx="5715000" cy="3533775"/>
+            <wp:extent cx="5222552" cy="8229600"/>
             <wp:effectExtent t="0" r="0" b="0" l="0"/>
             <wp:docPr id="1" name="fig22" descr="Minh họa danh sách trong workspace với tab trạng thái và phần duyệt (dữ liệu DEMO)." title="Hình 22"/>
             <wp:cNvGraphicFramePr>
@@ -7283,7 +7342,7 @@
                   <pic:spPr bwMode="auto">
                     <a:xfrm>
                       <a:off x="0" y="0"/>
-                      <a:ext cx="5715000" cy="3533775"/>
+                      <a:ext cx="5222552" cy="8229600"/>
                     </a:xfrm>
                     <a:prstGeom prst="rect">
                       <a:avLst/>
@@ -7309,7 +7368,7 @@
           <w:sz w:val="18"/>
           <w:szCs w:val="18"/>
         </w:rPr>
-        <w:t xml:space="preserve">Hình 22. Minh họa danh sách trong workspace với tab trạng thái và phần duyệt (dữ liệu DEMO).</w:t>
+        <w:t xml:space="preserve">Hình 22. Thanh Quy trình duyệt và tab Chờ duyệt: bằng chứng và khung quyết định mở sẵn; mục thứ hai được báo trước là sẽ chưa công khai (dữ liệu DEMO).</w:t>
       </w:r>
     </w:p>
     <w:p>
@@ -7348,8 +7407,249 @@
         <w:pStyle w:val="Heading3"/>
       </w:pPr>
       <w:r>
+        <w:t xml:space="preserve">Mục này có hiển thị công khai không?</w:t>
+      </w:r>
+    </w:p>
+    <w:p>
+      <w:pPr>
+        <w:spacing w:after="120" w:line="300"/>
+      </w:pPr>
+      <w:r>
+        <w:t xml:space="preserve">Dưới mỗi mục trong trang duyệt có một dòng cho biết người chưa đăng nhập có xem được mục đó không. Câu trả lời lấy trực tiếp từ cơ sở dữ liệu, không suy đoán từ trạng thái:</w:t>
+      </w:r>
+    </w:p>
+    <w:p>
+      <w:pPr>
+        <w:pStyle w:val="ListParagraph"/>
+        <w:numPr>
+          <w:ilvl w:val="0"/>
+          <w:numId w:val="2"/>
+        </w:numPr>
+        <w:spacing w:after="60" w:line="290"/>
+      </w:pPr>
+      <w:r>
+        <w:rPr>
+          <w:b/>
+          <w:bCs/>
+        </w:rPr>
+        <w:t xml:space="preserve">Đang hiển thị công khai</w:t>
+      </w:r>
+      <w:r>
+        <w:t xml:space="preserve"> (chấm xanh): người chưa đăng nhập đã xem được; bấm </w:t>
+      </w:r>
+      <w:r>
+        <w:rPr>
+          <w:b/>
+          <w:bCs/>
+        </w:rPr>
+        <w:t xml:space="preserve">Xem</w:t>
+      </w:r>
+      <w:r>
+        <w:t xml:space="preserve"> để mở.</w:t>
+      </w:r>
+    </w:p>
+    <w:p>
+      <w:pPr>
+        <w:pStyle w:val="ListParagraph"/>
+        <w:numPr>
+          <w:ilvl w:val="0"/>
+          <w:numId w:val="2"/>
+        </w:numPr>
+        <w:spacing w:after="60" w:line="290"/>
+      </w:pPr>
+      <w:r>
+        <w:rPr>
+          <w:b/>
+          <w:bCs/>
+        </w:rPr>
+        <w:t xml:space="preserve">Đã duyệt nhưng chưa hiển thị công khai</w:t>
+      </w:r>
+      <w:r>
+        <w:t xml:space="preserve"> (khung cam): kèm lý do, thường là nguồn chưa được xác minh, hoặc quy định, nghề hay trường được gắn chưa được duyệt. Nếu lý do là nguồn, khung có link </w:t>
+      </w:r>
+      <w:r>
+        <w:rPr>
+          <w:b/>
+          <w:bCs/>
+        </w:rPr>
+        <w:t xml:space="preserve">Xác minh nguồn trong Source Registry</w:t>
+      </w:r>
+      <w:r>
+        <w:t xml:space="preserve">.</w:t>
+      </w:r>
+    </w:p>
+    <w:p>
+      <w:pPr>
+        <w:pStyle w:val="ListParagraph"/>
+        <w:numPr>
+          <w:ilvl w:val="0"/>
+          <w:numId w:val="2"/>
+        </w:numPr>
+        <w:spacing w:after="60" w:line="290"/>
+      </w:pPr>
+      <w:r>
+        <w:t xml:space="preserve">Với đề xuất ở tab Chờ duyệt: “Sau khi duyệt, mục này sẽ hiển thị công khai”, hoặc khung cam </w:t>
+      </w:r>
+      <w:r>
+        <w:rPr>
+          <w:b/>
+          <w:bCs/>
+        </w:rPr>
+        <w:t xml:space="preserve">Lưu ý: kể cả khi duyệt, mục này vẫn chưa hiển thị công khai</w:t>
+      </w:r>
+      <w:r>
+        <w:t xml:space="preserve"> để bạn biết trước khi bấm Duyệt.</w:t>
+      </w:r>
+    </w:p>
+    <w:p>
+      <w:pPr>
+        <w:pStyle w:val="ListParagraph"/>
+        <w:numPr>
+          <w:ilvl w:val="0"/>
+          <w:numId w:val="2"/>
+        </w:numPr>
+        <w:spacing w:after="60" w:line="290"/>
+      </w:pPr>
+      <w:r>
+        <w:t xml:space="preserve">“Không kiểm tra được trạng thái công khai lúc này”: hệ thống không hỏi được cơ sở dữ liệu; hãy tải lại trang. Hệ thống không bao giờ đoán là đang công khai.</w:t>
+      </w:r>
+    </w:p>
+    <w:p>
+      <w:pPr>
+        <w:keepNext/>
+        <w:spacing w:after="60" w:before="120"/>
+        <w:jc w:val="center"/>
+      </w:pPr>
+      <w:r>
+        <w:drawing>
+          <wp:inline distT="0" distB="0" distL="0" distR="0">
+            <wp:extent cx="5715000" cy="5973960"/>
+            <wp:effectExtent t="0" r="0" b="0" l="0"/>
+            <wp:docPr id="102" name="fig22b" descr="Minh họa danh sách trong workspace với tab trạng thái và phần duyệt (dữ liệu DEMO)." title="Hình 22"/>
+            <wp:cNvGraphicFramePr>
+              <a:graphicFrameLocks xmlns:a="http://schemas.openxmlformats.org/drawingml/2006/main" noChangeAspect="1"/>
+            </wp:cNvGraphicFramePr>
+            <a:graphic xmlns:a="http://schemas.openxmlformats.org/drawingml/2006/main">
+              <a:graphicData uri="http://schemas.openxmlformats.org/drawingml/2006/picture">
+                <pic:pic xmlns:pic="http://schemas.openxmlformats.org/drawingml/2006/picture">
+                  <pic:nvPicPr>
+                    <pic:cNvPr id="0" name="" descr=""/>
+                    <pic:cNvPicPr>
+                      <a:picLocks noChangeAspect="1" noChangeArrowheads="1"/>
+                    </pic:cNvPicPr>
+                  </pic:nvPicPr>
+                  <pic:blipFill>
+                    <a:blip r:embed="rId35" cstate="none"/>
+                    <a:srcRect/>
+                    <a:stretch>
+                      <a:fillRect/>
+                    </a:stretch>
+                  </pic:blipFill>
+                  <pic:spPr bwMode="auto">
+                    <a:xfrm>
+                      <a:off x="0" y="0"/>
+                      <a:ext cx="5715000" cy="5973960"/>
+                    </a:xfrm>
+                    <a:prstGeom prst="rect">
+                      <a:avLst/>
+                    </a:prstGeom>
+                  </pic:spPr>
+                </pic:pic>
+              </a:graphicData>
+            </a:graphic>
+          </wp:inline>
+        </w:drawing>
+      </w:r>
+    </w:p>
+    <w:p>
+      <w:pPr>
+        <w:spacing w:after="240"/>
+        <w:jc w:val="center"/>
+      </w:pPr>
+      <w:r>
+        <w:rPr>
+          <w:i/>
+          <w:iCs/>
+          <w:color w:val="6E6E73"/>
+          <w:sz w:val="18"/>
+          <w:szCs w:val="18"/>
+        </w:rPr>
+        <w:t xml:space="preserve">Hình 22b. Tab Đã duyệt: một mục đang công khai, một mục chưa công khai vì nguồn chưa xác minh, và một mục không kiểm tra được (dữ liệu DEMO).</w:t>
+      </w:r>
+    </w:p>
+    <w:p>
+      <w:pPr>
+        <w:pStyle w:val="Heading3"/>
+      </w:pPr>
+      <w:r>
+        <w:t xml:space="preserve">Lịch sử quyết định</w:t>
+      </w:r>
+    </w:p>
+    <w:p>
+      <w:pPr>
+        <w:spacing w:after="120" w:line="300"/>
+      </w:pPr>
+      <w:r>
+        <w:t xml:space="preserve">Cuối mỗi trang duyệt, mở </w:t>
+      </w:r>
+      <w:r>
+        <w:rPr>
+          <w:b/>
+          <w:bCs/>
+        </w:rPr>
+        <w:t xml:space="preserve">20 quyết định gần nhất</w:t>
+      </w:r>
+      <w:r>
+        <w:t xml:space="preserve"> để xem tên mục, nhãn quyết định (</w:t>
+      </w:r>
+      <w:r>
+        <w:rPr>
+          <w:b/>
+          <w:bCs/>
+        </w:rPr>
+        <w:t xml:space="preserve">Đã duyệt</w:t>
+      </w:r>
+      <w:r>
+        <w:t xml:space="preserve">, </w:t>
+      </w:r>
+      <w:r>
+        <w:rPr>
+          <w:b/>
+          <w:bCs/>
+        </w:rPr>
+        <w:t xml:space="preserve">Đã từ chối</w:t>
+      </w:r>
+      <w:r>
+        <w:t xml:space="preserve">, </w:t>
+      </w:r>
+      <w:r>
+        <w:rPr>
+          <w:b/>
+          <w:bCs/>
+        </w:rPr>
         <w:t xml:space="preserve">Đánh dấu mâu thuẫn</w:t>
       </w:r>
+      <w:r>
+        <w:t xml:space="preserve">, </w:t>
+      </w:r>
+      <w:r>
+        <w:rPr>
+          <w:b/>
+          <w:bCs/>
+        </w:rPr>
+        <w:t xml:space="preserve">Vẫn khớp nguồn mới</w:t>
+      </w:r>
+      <w:r>
+        <w:t xml:space="preserve">), thời gian (giờ UTC) và ghi chú của người duyệt. Với mâu thuẫn, dòng này ghi cả thông tin bị đối chiếu.</w:t>
+      </w:r>
+    </w:p>
+    <w:p>
+      <w:pPr>
+        <w:pStyle w:val="Heading3"/>
+      </w:pPr>
+      <w:r>
+        <w:t xml:space="preserve">Đánh dấu mâu thuẫn</w:t>
+      </w:r>
     </w:p>
     <w:p>
       <w:pPr>
@@ -7361,17 +7661,40 @@
         <w:spacing w:after="80" w:line="290"/>
       </w:pPr>
       <w:r>
-        <w:t xml:space="preserve">Khi hai thông tin </w:t>
-      </w:r>
-      <w:r>
-        <w:rPr>
-          <w:b/>
-          <w:bCs/>
-        </w:rPr>
-        <w:t xml:space="preserve">đã duyệt</w:t>
-      </w:r>
-      <w:r>
-        <w:t xml:space="preserve"> nêu khác nhau, mở </w:t>
+        <w:t xml:space="preserve">Khi hai thông tin đã duyệt nêu khác nhau, ở một trong hai, mở </w:t>
+      </w:r>
+      <w:r>
+        <w:rPr>
+          <w:b/>
+          <w:bCs/>
+        </w:rPr>
+        <w:t xml:space="preserve">Đánh dấu mâu thuẫn với thông tin khác</w:t>
+      </w:r>
+      <w:r>
+        <w:t xml:space="preserve"> (chỉ có ở thông tin đã duyệt).</w:t>
+      </w:r>
+    </w:p>
+    <w:p>
+      <w:pPr>
+        <w:pStyle w:val="ListParagraph"/>
+        <w:numPr>
+          <w:ilvl w:val="0"/>
+          <w:numId w:val="22"/>
+        </w:numPr>
+        <w:spacing w:after="80" w:line="290"/>
+      </w:pPr>
+      <w:r>
+        <w:t xml:space="preserve">Chọn thông tin đối chiếu trong danh sách (hiện dạng “đối tượng — thuộc tính: giá trị”), điền </w:t>
+      </w:r>
+      <w:r>
+        <w:rPr>
+          <w:b/>
+          <w:bCs/>
+        </w:rPr>
+        <w:t xml:space="preserve">Ghi chú đối chiếu</w:t>
+      </w:r>
+      <w:r>
+        <w:t xml:space="preserve">, rồi bấm </w:t>
       </w:r>
       <w:r>
         <w:rPr>
@@ -7381,30 +7704,7 @@
         <w:t xml:space="preserve">Đánh dấu mâu thuẫn</w:t>
       </w:r>
       <w:r>
-        <w:t xml:space="preserve"> ở một trong hai.</w:t>
-      </w:r>
-    </w:p>
-    <w:p>
-      <w:pPr>
-        <w:pStyle w:val="ListParagraph"/>
-        <w:numPr>
-          <w:ilvl w:val="0"/>
-          <w:numId w:val="22"/>
-        </w:numPr>
-        <w:spacing w:after="80" w:line="290"/>
-      </w:pPr>
-      <w:r>
-        <w:t xml:space="preserve">Chọn thông tin đối chiếu, ghi lý do, rồi bấm </w:t>
-      </w:r>
-      <w:r>
-        <w:rPr>
-          <w:b/>
-          <w:bCs/>
-        </w:rPr>
-        <w:t xml:space="preserve">Ghi nhận quyết định</w:t>
-      </w:r>
-      <w:r>
-        <w:t xml:space="preserve">. Cả hai sẽ hiện với nhãn đỏ “Có mâu thuẫn”.</w:t>
+        <w:t xml:space="preserve">. Cả hai sẽ hiện với nhãn đỏ “Có mâu thuẫn”; hệ thống không tự chọn bên đúng.</w:t>
       </w:r>
     </w:p>
     <w:p>
@@ -7512,7 +7812,17 @@
         <w:t xml:space="preserve">Đề xuất chương trình học</w:t>
       </w:r>
       <w:r>
-        <w:t xml:space="preserve">: chọn trường, bậc học (chọn Not stated nếu nguồn không nêu), ngành, ngôn ngữ, trang chương trình, tài liệu và trích đoạn.</w:t>
+        <w:t xml:space="preserve">: chọn trường, bậc học (chọn </w:t>
+      </w:r>
+      <w:r>
+        <w:rPr>
+          <w:b/>
+          <w:bCs/>
+        </w:rPr>
+        <w:t xml:space="preserve">Nguồn không nêu</w:t>
+      </w:r>
+      <w:r>
+        <w:t xml:space="preserve"> nếu nguồn không nêu), ngành, ngôn ngữ, trang chương trình, tài liệu và trích đoạn.</w:t>
       </w:r>
     </w:p>
     <w:p>
@@ -7525,7 +7835,27 @@
         <w:spacing w:after="80" w:line="290"/>
       </w:pPr>
       <w:r>
-        <w:t xml:space="preserve">Người duyệt duyệt trường trước, sau đó mới duyệt được chương trình của trường đó.</w:t>
+        <w:t xml:space="preserve">Người duyệt duyệt trường trước (bấm </w:t>
+      </w:r>
+      <w:r>
+        <w:rPr>
+          <w:b/>
+          <w:bCs/>
+        </w:rPr>
+        <w:t xml:space="preserve">Duyệt</w:t>
+      </w:r>
+      <w:r>
+        <w:t xml:space="preserve"> hoặc </w:t>
+      </w:r>
+      <w:r>
+        <w:rPr>
+          <w:b/>
+          <w:bCs/>
+        </w:rPr>
+        <w:t xml:space="preserve">Từ chối</w:t>
+      </w:r>
+      <w:r>
+        <w:t xml:space="preserve">), sau đó mới duyệt được chương trình của trường đó. Một chương trình chỉ hiển thị công khai khi trường của nó đã được duyệt.</w:t>
       </w:r>
     </w:p>
     <w:p>
@@ -7648,17 +7978,27 @@
         <w:spacing w:after="80" w:line="290"/>
       </w:pPr>
       <w:r>
-        <w:t xml:space="preserve">Mỗi hàng ghi rõ nguồn đã hay chưa xác minh. Quy định chỉ hiện công khai khi đã duyệt </w:t>
-      </w:r>
-      <w:r>
-        <w:rPr>
-          <w:b/>
-          <w:bCs/>
-        </w:rPr>
-        <w:t xml:space="preserve">và</w:t>
-      </w:r>
-      <w:r>
-        <w:t xml:space="preserve"> nguồn T1 đã được xác minh.</w:t>
+        <w:t xml:space="preserve">Mỗi hàng ghi </w:t>
+      </w:r>
+      <w:r>
+        <w:rPr>
+          <w:b/>
+          <w:bCs/>
+        </w:rPr>
+        <w:t xml:space="preserve">Nguồn đã xác minh</w:t>
+      </w:r>
+      <w:r>
+        <w:t xml:space="preserve"> hoặc </w:t>
+      </w:r>
+      <w:r>
+        <w:rPr>
+          <w:b/>
+          <w:bCs/>
+        </w:rPr>
+        <w:t xml:space="preserve">Nguồn chưa xác minh</w:t>
+      </w:r>
+      <w:r>
+        <w:t xml:space="preserve">, cùng dòng trạng thái công khai (mục 5.4). Quy định chỉ hiện công khai khi đã duyệt và nguồn T1 đã được xác minh.</w:t>
       </w:r>
     </w:p>
     <w:p>
@@ -9130,7 +9470,7 @@
           <w:b/>
           <w:bCs/>
         </w:rPr>
-        <w:t xml:space="preserve">Mở nguồn gốc</w:t>
+        <w:t xml:space="preserve">Mở trang gốc</w:t>
       </w:r>
       <w:r>
         <w:t xml:space="preserve">, tìm câu trích dẫn trên trang gốc, và kiểm tra: giá trị có đúng như câu đó nói không; đối tượng/thuộc tính có mô tả đúng không; có đúng quốc gia không.</w:t>
@@ -9146,14 +9486,14 @@
         <w:spacing w:after="80" w:line="290"/>
       </w:pPr>
       <w:r>
-        <w:t xml:space="preserve">Duyệt như đề xuất thường (5.4): </w:t>
-      </w:r>
-      <w:r>
-        <w:rPr>
-          <w:b/>
-          <w:bCs/>
-        </w:rPr>
-        <w:t xml:space="preserve">Đã kiểm tra bằng chứng</w:t>
+        <w:t xml:space="preserve">Duyệt như đề xuất thường (5.4): bấm </w:t>
+      </w:r>
+      <w:r>
+        <w:rPr>
+          <w:b/>
+          <w:bCs/>
+        </w:rPr>
+        <w:t xml:space="preserve">Duyệt</w:t>
       </w:r>
       <w:r>
         <w:t xml:space="preserve"> hoặc </w:t>
@@ -9163,10 +9503,10 @@
           <w:b/>
           <w:bCs/>
         </w:rPr>
-        <w:t xml:space="preserve">Không chấp nhận</w:t>
-      </w:r>
-      <w:r>
-        <w:t xml:space="preserve">, kèm lý do.</w:t>
+        <w:t xml:space="preserve">Từ chối</w:t>
+      </w:r>
+      <w:r>
+        <w:t xml:space="preserve">, kèm ghi chú. Khung quyết định của đề xuất AI có thêm dòng nhắc: mức “mô hình tự đánh giá” không phải căn cứ để duyệt.</w:t>
       </w:r>
     </w:p>
     <w:p>
@@ -9737,7 +10077,7 @@
       <w:r>
         <w:drawing>
           <wp:inline distT="0" distB="0" distL="0" distR="0">
-            <wp:extent cx="5715000" cy="4914900"/>
+            <wp:extent cx="5715000" cy="5616773"/>
             <wp:effectExtent t="0" r="0" b="0" l="0"/>
             <wp:docPr id="1" name="fig24" descr="Các nút, nhãn và thông báo trong hệ thống (dữ liệu DEMO)." title="Hình 24"/>
             <wp:cNvGraphicFramePr>
@@ -9762,7 +10102,7 @@
                   <pic:spPr bwMode="auto">
                     <a:xfrm>
                       <a:off x="0" y="0"/>
-                      <a:ext cx="5715000" cy="4914900"/>
+                      <a:ext cx="5715000" cy="5616773"/>
                     </a:xfrm>
                     <a:prstGeom prst="rect">
                       <a:avLst/>
@@ -9959,7 +10299,7 @@
           </w:tcPr>
           <w:p>
             <w:r>
-              <w:t xml:space="preserve">Nguồn đã được xác minh trong registry; lưu thành công</w:t>
+              <w:t xml:space="preserve">Nguồn đã được xác minh trong registry; lưu thành công; chấm xanh “Đang hiển thị công khai”</w:t>
             </w:r>
           </w:p>
         </w:tc>
@@ -10008,7 +10348,7 @@
           </w:tcPr>
           <w:p>
             <w:r>
-              <w:t xml:space="preserve">Đề xuất chờ duyệt; nguồn cần xác minh; cảnh báo; nguồn không chính thức</w:t>
+              <w:t xml:space="preserve">Đề xuất chờ duyệt; nguồn chưa xác minh; cảnh báo (ví dụ mục đã duyệt nhưng chưa công khai); nguồn không chính thức</w:t>
             </w:r>
           </w:p>
         </w:tc>
@@ -10057,7 +10397,7 @@
           </w:tcPr>
           <w:p>
             <w:r>
-              <w:t xml:space="preserve">Mâu thuẫn giữa các nguồn; nguồn cần xem lại; lỗi</w:t>
+              <w:t xml:space="preserve">Mâu thuẫn giữa các nguồn; nguồn cần xem xét lại; lỗi; nút Từ chối (chữ đỏ trên nền xám)</w:t>
             </w:r>
           </w:p>
         </w:tc>
@@ -10106,7 +10446,7 @@
           </w:tcPr>
           <w:p>
             <w:r>
-              <w:t xml:space="preserve">Thông tin trung tính: tier T2–T4, chưa phân loại, không chấp nhận</w:t>
+              <w:t xml:space="preserve">Thông tin trung tính: tier T2–T4, chưa phân loại, đã từ chối</w:t>
             </w:r>
           </w:p>
         </w:tc>
@@ -10712,7 +11052,7 @@
           </w:tcPr>
           <w:p>
             <w:r>
-              <w:t xml:space="preserve">Research project</w:t>
+              <w:t xml:space="preserve">Quy trình duyệt</w:t>
             </w:r>
           </w:p>
         </w:tc>
@@ -10734,7 +11074,7 @@
           </w:tcPr>
           <w:p>
             <w:r>
-              <w:t xml:space="preserve">Không gian riêng gom mục đã lưu và ghi chú cho một kế hoạch, ví dụ “Sweden 2028”.</w:t>
+              <w:t xml:space="preserve">Ba bước ở đầu các trang duyệt: xác minh nguồn, duyệt mục gốc (trường, quy định, nghề…), rồi duyệt thông tin chi tiết gắn với chúng.</w:t>
             </w:r>
           </w:p>
         </w:tc>
@@ -10761,7 +11101,7 @@
           </w:tcPr>
           <w:p>
             <w:r>
-              <w:t xml:space="preserve">Ghi chú của bạn</w:t>
+              <w:t xml:space="preserve">Công khai</w:t>
             </w:r>
           </w:p>
         </w:tc>
@@ -10783,7 +11123,7 @@
           </w:tcPr>
           <w:p>
             <w:r>
-              <w:t xml:space="preserve">Suy nghĩ riêng của người dùng; không phải thông tin đã được kiểm chứng.</w:t>
+              <w:t xml:space="preserve">Hiển thị cho người chưa đăng nhập. Một mục đã duyệt vẫn có thể chưa công khai, ví dụ khi nguồn của nó chưa được xác minh.</w:t>
             </w:r>
           </w:p>
         </w:tc>
@@ -10810,7 +11150,7 @@
           </w:tcPr>
           <w:p>
             <w:r>
-              <w:t xml:space="preserve">Crawler</w:t>
+              <w:t xml:space="preserve">Research project</w:t>
             </w:r>
           </w:p>
         </w:tc>
@@ -10832,7 +11172,7 @@
           </w:tcPr>
           <w:p>
             <w:r>
-              <w:t xml:space="preserve">Chương trình tự động lấy lại các trang nguồn đã đăng ký mỗi tuần để phát hiện thay đổi.</w:t>
+              <w:t xml:space="preserve">Không gian riêng gom mục đã lưu và ghi chú cho một kế hoạch, ví dụ “Sweden 2028”.</w:t>
             </w:r>
           </w:p>
         </w:tc>
@@ -10859,7 +11199,7 @@
           </w:tcPr>
           <w:p>
             <w:r>
-              <w:t xml:space="preserve">Phiên bản tài liệu</w:t>
+              <w:t xml:space="preserve">Ghi chú của bạn</w:t>
             </w:r>
           </w:p>
         </w:tc>
@@ -10881,7 +11221,7 @@
           </w:tcPr>
           <w:p>
             <w:r>
-              <w:t xml:space="preserve">Bản ghi của một trang tại một thời điểm; trang đổi nội dung thì có phiên bản mới, bản cũ vẫn được giữ.</w:t>
+              <w:t xml:space="preserve">Suy nghĩ riêng của người dùng; không phải thông tin đã được kiểm chứng.</w:t>
             </w:r>
           </w:p>
         </w:tc>
@@ -10908,7 +11248,7 @@
           </w:tcPr>
           <w:p>
             <w:r>
-              <w:t xml:space="preserve">Văn bản trích (nội bộ)</w:t>
+              <w:t xml:space="preserve">Crawler</w:t>
             </w:r>
           </w:p>
         </w:tc>
@@ -10930,7 +11270,7 @@
           </w:tcPr>
           <w:p>
             <w:r>
-              <w:t xml:space="preserve">Phần chữ crawler lấy từ trang; chỉ biên tập viên xem, dùng để đối chiếu và cho AI đọc.</w:t>
+              <w:t xml:space="preserve">Chương trình tự động lấy lại các trang nguồn đã đăng ký mỗi tuần để phát hiện thay đổi.</w:t>
             </w:r>
           </w:p>
         </w:tc>
@@ -10957,7 +11297,7 @@
           </w:tcPr>
           <w:p>
             <w:r>
-              <w:t xml:space="preserve">Nguồn đã đổi</w:t>
+              <w:t xml:space="preserve">Phiên bản tài liệu</w:t>
             </w:r>
           </w:p>
         </w:tc>
@@ -10979,7 +11319,7 @@
           </w:tcPr>
           <w:p>
             <w:r>
-              <w:t xml:space="preserve">Hàng chờ các thông tin đã công bố có trang nguồn vừa thay đổi, cần người duyệt kiểm tra lại.</w:t>
+              <w:t xml:space="preserve">Bản ghi của một trang tại một thời điểm; trang đổi nội dung thì có phiên bản mới, bản cũ vẫn được giữ.</w:t>
             </w:r>
           </w:p>
         </w:tc>
@@ -11006,7 +11346,7 @@
           </w:tcPr>
           <w:p>
             <w:r>
-              <w:t xml:space="preserve">Đề xuất bởi AI</w:t>
+              <w:t xml:space="preserve">Văn bản trích (nội bộ)</w:t>
             </w:r>
           </w:p>
         </w:tc>
@@ -11028,7 +11368,7 @@
           </w:tcPr>
           <w:p>
             <w:r>
-              <w:t xml:space="preserve">Đề xuất do AI tạo từ văn bản tài liệu; phải có câu trích nguyên văn và phải được người duyệt.</w:t>
+              <w:t xml:space="preserve">Phần chữ crawler lấy từ trang; chỉ biên tập viên xem, dùng để đối chiếu và cho AI đọc.</w:t>
             </w:r>
           </w:p>
         </w:tc>
@@ -11055,6 +11395,104 @@
           </w:tcPr>
           <w:p>
             <w:r>
+              <w:t xml:space="preserve">Nguồn đã đổi</w:t>
+            </w:r>
+          </w:p>
+        </w:tc>
+        <w:tc>
+          <w:tcPr>
+            <w:tcW w:type="dxa" w:w="6626"/>
+            <w:tcBorders>
+              <w:top w:val="single" w:color="D2D2D7" w:sz="4"/>
+              <w:left w:val="single" w:color="D2D2D7" w:sz="4"/>
+              <w:bottom w:val="single" w:color="D2D2D7" w:sz="4"/>
+              <w:right w:val="single" w:color="D2D2D7" w:sz="4"/>
+            </w:tcBorders>
+            <w:tcMar>
+              <w:top w:type="dxa" w:w="80"/>
+              <w:left w:type="dxa" w:w="120"/>
+              <w:bottom w:type="dxa" w:w="80"/>
+              <w:right w:type="dxa" w:w="120"/>
+            </w:tcMar>
+          </w:tcPr>
+          <w:p>
+            <w:r>
+              <w:t xml:space="preserve">Hàng chờ các thông tin đã công bố có trang nguồn vừa thay đổi, cần người duyệt kiểm tra lại.</w:t>
+            </w:r>
+          </w:p>
+        </w:tc>
+      </w:tr>
+      <w:tr>
+        <w:trPr>
+          <w:cantSplit/>
+        </w:trPr>
+        <w:tc>
+          <w:tcPr>
+            <w:tcW w:type="dxa" w:w="2400"/>
+            <w:tcBorders>
+              <w:top w:val="single" w:color="D2D2D7" w:sz="4"/>
+              <w:left w:val="single" w:color="D2D2D7" w:sz="4"/>
+              <w:bottom w:val="single" w:color="D2D2D7" w:sz="4"/>
+              <w:right w:val="single" w:color="D2D2D7" w:sz="4"/>
+            </w:tcBorders>
+            <w:tcMar>
+              <w:top w:type="dxa" w:w="80"/>
+              <w:left w:type="dxa" w:w="120"/>
+              <w:bottom w:type="dxa" w:w="80"/>
+              <w:right w:type="dxa" w:w="120"/>
+            </w:tcMar>
+          </w:tcPr>
+          <w:p>
+            <w:r>
+              <w:t xml:space="preserve">Đề xuất bởi AI</w:t>
+            </w:r>
+          </w:p>
+        </w:tc>
+        <w:tc>
+          <w:tcPr>
+            <w:tcW w:type="dxa" w:w="6626"/>
+            <w:tcBorders>
+              <w:top w:val="single" w:color="D2D2D7" w:sz="4"/>
+              <w:left w:val="single" w:color="D2D2D7" w:sz="4"/>
+              <w:bottom w:val="single" w:color="D2D2D7" w:sz="4"/>
+              <w:right w:val="single" w:color="D2D2D7" w:sz="4"/>
+            </w:tcBorders>
+            <w:tcMar>
+              <w:top w:type="dxa" w:w="80"/>
+              <w:left w:type="dxa" w:w="120"/>
+              <w:bottom w:type="dxa" w:w="80"/>
+              <w:right w:type="dxa" w:w="120"/>
+            </w:tcMar>
+          </w:tcPr>
+          <w:p>
+            <w:r>
+              <w:t xml:space="preserve">Đề xuất do AI tạo từ văn bản tài liệu; phải có câu trích nguyên văn và phải được người duyệt.</w:t>
+            </w:r>
+          </w:p>
+        </w:tc>
+      </w:tr>
+      <w:tr>
+        <w:trPr>
+          <w:cantSplit/>
+        </w:trPr>
+        <w:tc>
+          <w:tcPr>
+            <w:tcW w:type="dxa" w:w="2400"/>
+            <w:tcBorders>
+              <w:top w:val="single" w:color="D2D2D7" w:sz="4"/>
+              <w:left w:val="single" w:color="D2D2D7" w:sz="4"/>
+              <w:bottom w:val="single" w:color="D2D2D7" w:sz="4"/>
+              <w:right w:val="single" w:color="D2D2D7" w:sz="4"/>
+            </w:tcBorders>
+            <w:tcMar>
+              <w:top w:type="dxa" w:w="80"/>
+              <w:left w:type="dxa" w:w="120"/>
+              <w:bottom w:type="dxa" w:w="80"/>
+              <w:right w:type="dxa" w:w="120"/>
+            </w:tcMar>
+          </w:tcPr>
+          <w:p>
+            <w:r>
               <w:t xml:space="preserve">Mô hình tự đánh giá x%</w:t>
             </w:r>
           </w:p>
@@ -11109,7 +11547,17 @@
         <w:spacing w:after="120" w:line="300"/>
       </w:pPr>
       <w:r>
-        <w:t xml:space="preserve">Mục cần được duyệt. Với quy định nhập cư và số liệu lao động, nguồn của chúng còn phải ở trạng thái verified trong Source Registry.</w:t>
+        <w:t xml:space="preserve">Mục cần được duyệt. Với quy định nhập cư và số liệu lao động, nguồn của chúng còn phải ở trạng thái </w:t>
+      </w:r>
+      <w:r>
+        <w:rPr>
+          <w:b/>
+          <w:bCs/>
+        </w:rPr>
+        <w:t xml:space="preserve">Đã xác minh</w:t>
+      </w:r>
+      <w:r>
+        <w:t xml:space="preserve"> trong Source Registry. Dòng trạng thái công khai dưới mỗi mục trong trang duyệt cho biết chính xác lý do (mục 5.4).</w:t>
       </w:r>
     </w:p>
     <w:p>
@@ -11125,7 +11573,7 @@
         <w:spacing w:after="120" w:line="300"/>
       </w:pPr>
       <w:r>
-        <w:t xml:space="preserve">Không. Hãy chọn “Không chấp nhận” khi duyệt, rồi tạo đề xuất mới đúng. Lịch sử được giữ lại để truy vết.</w:t>
+        <w:t xml:space="preserve">Không. Hãy bấm “Từ chối” khi duyệt, rồi tạo đề xuất mới đúng. Lịch sử được giữ lại để truy vết.</w:t>
       </w:r>
     </w:p>
     <w:p>
@@ -11586,6 +12034,77 @@
           <w:p>
             <w:r>
               <w:t xml:space="preserve">Viết lại theo giao diện hiện tại; thêm crawler (5.9), hàng chờ Nguồn đã đổi (5.10), trích xuất AI (5.11), nhãn AI và cảnh báo nguồn đổi trên thẻ thông tin (3.8); chụp lại ảnh.</w:t>
+            </w:r>
+          </w:p>
+        </w:tc>
+      </w:tr>
+      <w:tr>
+        <w:trPr>
+          <w:cantSplit/>
+        </w:trPr>
+        <w:tc>
+          <w:tcPr>
+            <w:tcW w:type="dxa" w:w="1400"/>
+            <w:tcBorders>
+              <w:top w:val="single" w:color="D2D2D7" w:sz="4"/>
+              <w:left w:val="single" w:color="D2D2D7" w:sz="4"/>
+              <w:bottom w:val="single" w:color="D2D2D7" w:sz="4"/>
+              <w:right w:val="single" w:color="D2D2D7" w:sz="4"/>
+            </w:tcBorders>
+            <w:tcMar>
+              <w:top w:type="dxa" w:w="80"/>
+              <w:left w:type="dxa" w:w="120"/>
+              <w:bottom w:type="dxa" w:w="80"/>
+              <w:right w:type="dxa" w:w="120"/>
+            </w:tcMar>
+          </w:tcPr>
+          <w:p>
+            <w:r>
+              <w:t xml:space="preserve">2.1</w:t>
+            </w:r>
+          </w:p>
+        </w:tc>
+        <w:tc>
+          <w:tcPr>
+            <w:tcW w:type="dxa" w:w="1600"/>
+            <w:tcBorders>
+              <w:top w:val="single" w:color="D2D2D7" w:sz="4"/>
+              <w:left w:val="single" w:color="D2D2D7" w:sz="4"/>
+              <w:bottom w:val="single" w:color="D2D2D7" w:sz="4"/>
+              <w:right w:val="single" w:color="D2D2D7" w:sz="4"/>
+            </w:tcBorders>
+            <w:tcMar>
+              <w:top w:type="dxa" w:w="80"/>
+              <w:left w:type="dxa" w:w="120"/>
+              <w:bottom w:type="dxa" w:w="80"/>
+              <w:right w:type="dxa" w:w="120"/>
+            </w:tcMar>
+          </w:tcPr>
+          <w:p>
+            <w:r>
+              <w:t xml:space="preserve">2026-09-30</w:t>
+            </w:r>
+          </w:p>
+        </w:tc>
+        <w:tc>
+          <w:tcPr>
+            <w:tcW w:type="dxa" w:w="6026"/>
+            <w:tcBorders>
+              <w:top w:val="single" w:color="D2D2D7" w:sz="4"/>
+              <w:left w:val="single" w:color="D2D2D7" w:sz="4"/>
+              <w:bottom w:val="single" w:color="D2D2D7" w:sz="4"/>
+              <w:right w:val="single" w:color="D2D2D7" w:sz="4"/>
+            </w:tcBorders>
+            <w:tcMar>
+              <w:top w:type="dxa" w:w="80"/>
+              <w:left w:type="dxa" w:w="120"/>
+              <w:bottom w:type="dxa" w:w="80"/>
+              <w:right w:type="dxa" w:w="120"/>
+            </w:tcMar>
+          </w:tcPr>
+          <w:p>
+            <w:r>
+              <w:t xml:space="preserve">Giao diện tiếng Việt với nhãn dễ hiểu (1.3, 3.8, 6.1); khung quyết định Duyệt / Từ chối, trạng thái công khai, lịch sử quyết định và form đánh dấu mâu thuẫn mới (5.4); thanh Quy trình duyệt (5); chụp lại hình 14, 15, 22, 24; thêm hình 14 (phần 2) và 22b.</w:t>
             </w:r>
           </w:p>
         </w:tc>

</xml_diff>

<commit_message>
Update the User Guide to v3.0 for the Vietnamese UI
New screenshots and button names for waves 0-4: five-item navigation,
account buttons and progress bar, renamed personal area, split-view
review and sources pages, and table + inspector admin pages.

Co-Authored-By: Claude Opus 5.5 <noreply@anthropic.com>
</commit_message>
<xml_diff>
--- a/documents/User_Guide.docx
+++ b/documents/User_Guide.docx
@@ -59,7 +59,7 @@
         <w:spacing w:after="120" w:line="300"/>
       </w:pPr>
       <w:r>
-        <w:t xml:space="preserve">Phiên bản: 2.1 · Ngày: 2026-09-30 · Áp dụng cho các tính năng đến hết Slice 10a, cùng giao diện duyệt mới (tiếng Việt, nút Duyệt / Từ chối, quy trình duyệt).</w:t>
+        <w:t xml:space="preserve">Phiên bản: 3.0 · Ngày: 2026-10-01 · Áp dụng cho các tính năng đến hết Slice 10a, với giao diện tiếng Việt mới ở mọi trang.</w:t>
       </w:r>
     </w:p>
     <w:p>
@@ -138,7 +138,7 @@
         <w:pageBreakBefore/>
       </w:pPr>
       <w:r>
-        <w:t xml:space="preserve">Có gì mới trong phiên bản 2.1</w:t>
+        <w:t xml:space="preserve">Có gì mới trong phiên bản 3.0</w:t>
       </w:r>
     </w:p>
     <w:tbl>
@@ -266,7 +266,7 @@
           </w:tcPr>
           <w:p>
             <w:r>
-              <w:t xml:space="preserve">Giao diện dùng tiếng Việt, nhãn dễ hiểu thay cho mã nội bộ (ví dụ T1 · Nhà nước, Chờ duyệt, Chưa xác minh)</w:t>
+              <w:t xml:space="preserve">Toàn bộ giao diện bằng tiếng Việt; thanh điều hướng gọn còn năm mục (Quốc gia, Du học, Làm việc &amp; Visa, So sánh, Bằng chứng)</w:t>
             </w:r>
           </w:p>
         </w:tc>
@@ -288,7 +288,7 @@
           </w:tcPr>
           <w:p>
             <w:r>
-              <w:t xml:space="preserve">Mọi trang (các trang công khai đang được chuyển dần)</w:t>
+              <w:t xml:space="preserve">Mọi trang</w:t>
             </w:r>
           </w:p>
         </w:tc>
@@ -310,7 +310,7 @@
           </w:tcPr>
           <w:p>
             <w:r>
-              <w:t xml:space="preserve">1.3, 3.8, 6.1</w:t>
+              <w:t xml:space="preserve">2.1</w:t>
             </w:r>
           </w:p>
         </w:tc>
@@ -337,7 +337,7 @@
           </w:tcPr>
           <w:p>
             <w:r>
-              <w:t xml:space="preserve">Khung quyết định mới: việc cần đối chiếu, ghi chú bắt buộc, hai nút Duyệt / Từ chối</w:t>
+              <w:t xml:space="preserve">Trang chủ theo mục tiêu (Đi du học, Đi làm, Visa và cư trú, So sánh quốc gia); quốc gia và trường hiện dạng thẻ</w:t>
             </w:r>
           </w:p>
         </w:tc>
@@ -359,7 +359,7 @@
           </w:tcPr>
           <w:p>
             <w:r>
-              <w:t xml:space="preserve">Bốn trang duyệt trong workspace</w:t>
+              <w:t xml:space="preserve">Trang chủ, Quốc gia, Trường đại học</w:t>
             </w:r>
           </w:p>
         </w:tc>
@@ -381,7 +381,7 @@
           </w:tcPr>
           <w:p>
             <w:r>
-              <w:t xml:space="preserve">5.4</w:t>
+              <w:t xml:space="preserve">2.1, 3.1, 3.2</w:t>
             </w:r>
           </w:p>
         </w:tc>
@@ -408,7 +408,7 @@
           </w:tcPr>
           <w:p>
             <w:r>
-              <w:t xml:space="preserve">Mỗi mục cho biết có đang hiển thị công khai không, và nếu không thì vì sao</w:t>
+              <w:t xml:space="preserve">Nút tài khoản ở góc phải mọi trang: Đăng nhập, Không gian của tôi, Biên tập (kèm số đề xuất chờ duyệt), Đăng xuất. Chỉ hiện nút bạn có quyền dùng</w:t>
             </w:r>
           </w:p>
         </w:tc>
@@ -430,7 +430,7 @@
           </w:tcPr>
           <w:p>
             <w:r>
-              <w:t xml:space="preserve">Bốn trang duyệt trong workspace</w:t>
+              <w:t xml:space="preserve">Thanh trên cùng</w:t>
             </w:r>
           </w:p>
         </w:tc>
@@ -452,7 +452,7 @@
           </w:tcPr>
           <w:p>
             <w:r>
-              <w:t xml:space="preserve">5.4</w:t>
+              <w:t xml:space="preserve">2.1, 2.2</w:t>
             </w:r>
           </w:p>
         </w:tc>
@@ -479,7 +479,7 @@
           </w:tcPr>
           <w:p>
             <w:r>
-              <w:t xml:space="preserve">Thanh Quy trình duyệt với số việc đang chờ ở từng bước</w:t>
+              <w:t xml:space="preserve">Thanh tiến trình mảnh ở mép trên khi chuyển trang</w:t>
             </w:r>
           </w:p>
         </w:tc>
@@ -501,7 +501,7 @@
           </w:tcPr>
           <w:p>
             <w:r>
-              <w:t xml:space="preserve">Đầu bốn trang duyệt</w:t>
+              <w:t xml:space="preserve">Mọi trang</w:t>
             </w:r>
           </w:p>
         </w:tc>
@@ -523,7 +523,7 @@
           </w:tcPr>
           <w:p>
             <w:r>
-              <w:t xml:space="preserve">5</w:t>
+              <w:t xml:space="preserve">2.1</w:t>
             </w:r>
           </w:p>
         </w:tc>
@@ -550,7 +550,7 @@
           </w:tcPr>
           <w:p>
             <w:r>
-              <w:t xml:space="preserve">Lịch sử quyết định ghi tên mục và nhãn dễ đọc</w:t>
+              <w:t xml:space="preserve">Trang duyệt chia đôi màn hình; khung “Các thông tin khác từ cùng trang này”</w:t>
             </w:r>
           </w:p>
         </w:tc>
@@ -572,7 +572,7 @@
           </w:tcPr>
           <w:p>
             <w:r>
-              <w:t xml:space="preserve">Cuối bốn trang duyệt</w:t>
+              <w:t xml:space="preserve">Bốn trang duyệt</w:t>
             </w:r>
           </w:p>
         </w:tc>
@@ -621,7 +621,7 @@
           </w:tcPr>
           <w:p>
             <w:r>
-              <w:t xml:space="preserve">Đánh dấu mâu thuẫn là form riêng, chỉ có ở thông tin đã duyệt</w:t>
+              <w:t xml:space="preserve">Quản lý nguồn chia đôi màn hình, form chia nhóm, giải thích từng tier ngay trong form</w:t>
             </w:r>
           </w:p>
         </w:tc>
@@ -643,7 +643,7 @@
           </w:tcPr>
           <w:p>
             <w:r>
-              <w:t xml:space="preserve">Thông tin &amp; bằng chứng</w:t>
+              <w:t xml:space="preserve">Quản lý nguồn</w:t>
             </w:r>
           </w:p>
         </w:tc>
@@ -665,7 +665,149 @@
           </w:tcPr>
           <w:p>
             <w:r>
-              <w:t xml:space="preserve">5.4</w:t>
+              <w:t xml:space="preserve">5.2</w:t>
+            </w:r>
+          </w:p>
+        </w:tc>
+      </w:tr>
+      <w:tr>
+        <w:trPr>
+          <w:cantSplit/>
+        </w:trPr>
+        <w:tc>
+          <w:tcPr>
+            <w:tcW w:type="dxa" w:w="4300"/>
+            <w:tcBorders>
+              <w:top w:val="single" w:color="D2D2D7" w:sz="4"/>
+              <w:left w:val="single" w:color="D2D2D7" w:sz="4"/>
+              <w:bottom w:val="single" w:color="D2D2D7" w:sz="4"/>
+              <w:right w:val="single" w:color="D2D2D7" w:sz="4"/>
+            </w:tcBorders>
+            <w:tcMar>
+              <w:top w:type="dxa" w:w="80"/>
+              <w:left w:type="dxa" w:w="120"/>
+              <w:bottom w:type="dxa" w:w="80"/>
+              <w:right w:type="dxa" w:w="120"/>
+            </w:tcMar>
+          </w:tcPr>
+          <w:p>
+            <w:r>
+              <w:t xml:space="preserve">Bảng có thể sắp xếp và khung chi tiết trượt từ bên phải; xem “Quyền hiện có” của một người dùng</w:t>
+            </w:r>
+          </w:p>
+        </w:tc>
+        <w:tc>
+          <w:tcPr>
+            <w:tcW w:type="dxa" w:w="3100"/>
+            <w:tcBorders>
+              <w:top w:val="single" w:color="D2D2D7" w:sz="4"/>
+              <w:left w:val="single" w:color="D2D2D7" w:sz="4"/>
+              <w:bottom w:val="single" w:color="D2D2D7" w:sz="4"/>
+              <w:right w:val="single" w:color="D2D2D7" w:sz="4"/>
+            </w:tcBorders>
+            <w:tcMar>
+              <w:top w:type="dxa" w:w="80"/>
+              <w:left w:type="dxa" w:w="120"/>
+              <w:bottom w:type="dxa" w:w="80"/>
+              <w:right w:type="dxa" w:w="120"/>
+            </w:tcMar>
+          </w:tcPr>
+          <w:p>
+            <w:r>
+              <w:t xml:space="preserve">Người dùng &amp; phân quyền, Crawler, Trích xuất AI, Chỉ số so sánh</w:t>
+            </w:r>
+          </w:p>
+        </w:tc>
+        <w:tc>
+          <w:tcPr>
+            <w:tcW w:type="dxa" w:w="1626"/>
+            <w:tcBorders>
+              <w:top w:val="single" w:color="D2D2D7" w:sz="4"/>
+              <w:left w:val="single" w:color="D2D2D7" w:sz="4"/>
+              <w:bottom w:val="single" w:color="D2D2D7" w:sz="4"/>
+              <w:right w:val="single" w:color="D2D2D7" w:sz="4"/>
+            </w:tcBorders>
+            <w:tcMar>
+              <w:top w:type="dxa" w:w="80"/>
+              <w:left w:type="dxa" w:w="120"/>
+              <w:bottom w:type="dxa" w:w="80"/>
+              <w:right w:type="dxa" w:w="120"/>
+            </w:tcMar>
+          </w:tcPr>
+          <w:p>
+            <w:r>
+              <w:t xml:space="preserve">5.1, 5.8, 5.9, 5.11</w:t>
+            </w:r>
+          </w:p>
+        </w:tc>
+      </w:tr>
+      <w:tr>
+        <w:trPr>
+          <w:cantSplit/>
+        </w:trPr>
+        <w:tc>
+          <w:tcPr>
+            <w:tcW w:type="dxa" w:w="4300"/>
+            <w:tcBorders>
+              <w:top w:val="single" w:color="D2D2D7" w:sz="4"/>
+              <w:left w:val="single" w:color="D2D2D7" w:sz="4"/>
+              <w:bottom w:val="single" w:color="D2D2D7" w:sz="4"/>
+              <w:right w:val="single" w:color="D2D2D7" w:sz="4"/>
+            </w:tcBorders>
+            <w:tcMar>
+              <w:top w:type="dxa" w:w="80"/>
+              <w:left w:type="dxa" w:w="120"/>
+              <w:bottom w:type="dxa" w:w="80"/>
+              <w:right w:type="dxa" w:w="120"/>
+            </w:tcMar>
+          </w:tcPr>
+          <w:p>
+            <w:r>
+              <w:t xml:space="preserve">Khu vực cá nhân đổi tên: Không gian của tôi, Dự án nghiên cứu, Kế hoạch châu Âu</w:t>
+            </w:r>
+          </w:p>
+        </w:tc>
+        <w:tc>
+          <w:tcPr>
+            <w:tcW w:type="dxa" w:w="3100"/>
+            <w:tcBorders>
+              <w:top w:val="single" w:color="D2D2D7" w:sz="4"/>
+              <w:left w:val="single" w:color="D2D2D7" w:sz="4"/>
+              <w:bottom w:val="single" w:color="D2D2D7" w:sz="4"/>
+              <w:right w:val="single" w:color="D2D2D7" w:sz="4"/>
+            </w:tcBorders>
+            <w:tcMar>
+              <w:top w:type="dxa" w:w="80"/>
+              <w:left w:type="dxa" w:w="120"/>
+              <w:bottom w:type="dxa" w:w="80"/>
+              <w:right w:type="dxa" w:w="120"/>
+            </w:tcMar>
+          </w:tcPr>
+          <w:p>
+            <w:r>
+              <w:t xml:space="preserve">Không gian của tôi</w:t>
+            </w:r>
+          </w:p>
+        </w:tc>
+        <w:tc>
+          <w:tcPr>
+            <w:tcW w:type="dxa" w:w="1626"/>
+            <w:tcBorders>
+              <w:top w:val="single" w:color="D2D2D7" w:sz="4"/>
+              <w:left w:val="single" w:color="D2D2D7" w:sz="4"/>
+              <w:bottom w:val="single" w:color="D2D2D7" w:sz="4"/>
+              <w:right w:val="single" w:color="D2D2D7" w:sz="4"/>
+            </w:tcBorders>
+            <w:tcMar>
+              <w:top w:type="dxa" w:w="80"/>
+              <w:left w:type="dxa" w:w="120"/>
+              <w:bottom w:type="dxa" w:w="80"/>
+              <w:right w:type="dxa" w:w="120"/>
+            </w:tcMar>
+          </w:tcPr>
+          <w:p>
+            <w:r>
+              <w:t xml:space="preserve">4</w:t>
             </w:r>
           </w:p>
         </w:tc>
@@ -694,7 +836,7 @@
         <w:t xml:space="preserve">Ghi chú: </w:t>
       </w:r>
       <w:r>
-        <w:t xml:space="preserve">Phiên bản 2.1 giữ toàn bộ nội dung của bản 2.0, chỉ cập nhật chỗ giao diện đã thay đổi. Các thay đổi của bản 2.0 (AI, crawler, cảnh báo nguồn đã đổi) có trong Lịch sử phiên bản ở cuối tài liệu.</w:t>
+        <w:t xml:space="preserve">Phiên bản 3.0 chụp lại hình và cập nhật tên nút theo giao diện tiếng Việt mới. Quy trình nghiệp vụ (đề xuất, duyệt, crawler, AI) không đổi. Các thay đổi trước có trong Lịch sử phiên bản ở cuối tài liệu.</w:t>
       </w:r>
     </w:p>
     <w:p>
@@ -1038,7 +1180,7 @@
           </w:tcPr>
           <w:p>
             <w:r>
-              <w:t xml:space="preserve">Thêm: lưu mục quan tâm, tạo research project, viết ghi chú riêng, lập My Europe Plan.</w:t>
+              <w:t xml:space="preserve">Thêm: lưu mục quan tâm, tạo dự án nghiên cứu, viết ghi chú riêng, lập Kế hoạch châu Âu.</w:t>
             </w:r>
           </w:p>
         </w:tc>
@@ -1603,7 +1745,57 @@
         <w:spacing w:after="80" w:line="290"/>
       </w:pPr>
       <w:r>
-        <w:t xml:space="preserve">Mở địa chỉ của hệ thống trên trình duyệt. Trang chủ hiển thị giới thiệu ngắn và danh sách các mục chính.</w:t>
+        <w:t xml:space="preserve">Mở địa chỉ của hệ thống trên trình duyệt. Trang chủ hỏi </w:t>
+      </w:r>
+      <w:r>
+        <w:rPr>
+          <w:b/>
+          <w:bCs/>
+        </w:rPr>
+        <w:t xml:space="preserve">Bạn muốn làm gì?</w:t>
+      </w:r>
+      <w:r>
+        <w:t xml:space="preserve"> với bốn thẻ: </w:t>
+      </w:r>
+      <w:r>
+        <w:rPr>
+          <w:b/>
+          <w:bCs/>
+        </w:rPr>
+        <w:t xml:space="preserve">Đi du học</w:t>
+      </w:r>
+      <w:r>
+        <w:t xml:space="preserve">, </w:t>
+      </w:r>
+      <w:r>
+        <w:rPr>
+          <w:b/>
+          <w:bCs/>
+        </w:rPr>
+        <w:t xml:space="preserve">Đi làm</w:t>
+      </w:r>
+      <w:r>
+        <w:t xml:space="preserve">, </w:t>
+      </w:r>
+      <w:r>
+        <w:rPr>
+          <w:b/>
+          <w:bCs/>
+        </w:rPr>
+        <w:t xml:space="preserve">Visa và cư trú</w:t>
+      </w:r>
+      <w:r>
+        <w:t xml:space="preserve">, </w:t>
+      </w:r>
+      <w:r>
+        <w:rPr>
+          <w:b/>
+          <w:bCs/>
+        </w:rPr>
+        <w:t xml:space="preserve">So sánh quốc gia</w:t>
+      </w:r>
+      <w:r>
+        <w:t xml:space="preserve">; bên dưới là lối tắt tới năm quốc gia.</w:t>
       </w:r>
     </w:p>
     <w:p>
@@ -1616,17 +1808,57 @@
         <w:spacing w:after="80" w:line="290"/>
       </w:pPr>
       <w:r>
-        <w:t xml:space="preserve">Dùng </w:t>
-      </w:r>
-      <w:r>
-        <w:rPr>
-          <w:b/>
-          <w:bCs/>
-        </w:rPr>
-        <w:t xml:space="preserve">thanh điều hướng</w:t>
-      </w:r>
-      <w:r>
-        <w:t xml:space="preserve"> trên cùng để chuyển giữa các mục: Countries, Universities, Programmes, Immigration, Occupations, Compare, Facts, Sources, Documents. Mục đang mở được tô nền xám.</w:t>
+        <w:t xml:space="preserve">Thanh điều hướng trên cùng có năm mục: </w:t>
+      </w:r>
+      <w:r>
+        <w:rPr>
+          <w:b/>
+          <w:bCs/>
+        </w:rPr>
+        <w:t xml:space="preserve">Quốc gia</w:t>
+      </w:r>
+      <w:r>
+        <w:t xml:space="preserve">, </w:t>
+      </w:r>
+      <w:r>
+        <w:rPr>
+          <w:b/>
+          <w:bCs/>
+        </w:rPr>
+        <w:t xml:space="preserve">Du học</w:t>
+      </w:r>
+      <w:r>
+        <w:t xml:space="preserve"> (Trường đại học, Chương trình học), </w:t>
+      </w:r>
+      <w:r>
+        <w:rPr>
+          <w:b/>
+          <w:bCs/>
+        </w:rPr>
+        <w:t xml:space="preserve">Làm việc &amp; Visa</w:t>
+      </w:r>
+      <w:r>
+        <w:t xml:space="preserve"> (Quy định nhập cư, Nghề nghiệp), </w:t>
+      </w:r>
+      <w:r>
+        <w:rPr>
+          <w:b/>
+          <w:bCs/>
+        </w:rPr>
+        <w:t xml:space="preserve">So sánh</w:t>
+      </w:r>
+      <w:r>
+        <w:t xml:space="preserve">, </w:t>
+      </w:r>
+      <w:r>
+        <w:rPr>
+          <w:b/>
+          <w:bCs/>
+        </w:rPr>
+        <w:t xml:space="preserve">Bằng chứng</w:t>
+      </w:r>
+      <w:r>
+        <w:t xml:space="preserve"> (Thông tin, Nguồn, Tài liệu). Bấm mục có dấu ˅ để mở danh sách con; mục đang mở được tô nền xám.</w:t>
       </w:r>
     </w:p>
     <w:p>
@@ -1662,27 +1894,60 @@
         <w:spacing w:after="80" w:line="290"/>
       </w:pPr>
       <w:r>
-        <w:t xml:space="preserve">Bấm </w:t>
-      </w:r>
-      <w:r>
-        <w:rPr>
-          <w:b/>
-          <w:bCs/>
-        </w:rPr>
-        <w:t xml:space="preserve">Workspace</w:t>
-      </w:r>
-      <w:r>
-        <w:t xml:space="preserve"> để vào Dashboard (yêu cầu đăng nhập); từ đó mở </w:t>
-      </w:r>
-      <w:r>
-        <w:rPr>
-          <w:b/>
-          <w:bCs/>
-        </w:rPr>
-        <w:t xml:space="preserve">My workspace</w:t>
-      </w:r>
-      <w:r>
-        <w:t xml:space="preserve"> hoặc các khu vực biên tập.</w:t>
+        <w:t xml:space="preserve">Góc phải là các nút tài khoản. Chưa đăng nhập: </w:t>
+      </w:r>
+      <w:r>
+        <w:rPr>
+          <w:b/>
+          <w:bCs/>
+        </w:rPr>
+        <w:t xml:space="preserve">Đăng nhập</w:t>
+      </w:r>
+      <w:r>
+        <w:t xml:space="preserve">. Đã đăng nhập: </w:t>
+      </w:r>
+      <w:r>
+        <w:rPr>
+          <w:b/>
+          <w:bCs/>
+        </w:rPr>
+        <w:t xml:space="preserve">Không gian của tôi</w:t>
+      </w:r>
+      <w:r>
+        <w:t xml:space="preserve"> (chương 4) và </w:t>
+      </w:r>
+      <w:r>
+        <w:rPr>
+          <w:b/>
+          <w:bCs/>
+        </w:rPr>
+        <w:t xml:space="preserve">Đăng xuất</w:t>
+      </w:r>
+      <w:r>
+        <w:t xml:space="preserve">. Người có quyền biên tập thấy thêm </w:t>
+      </w:r>
+      <w:r>
+        <w:rPr>
+          <w:b/>
+          <w:bCs/>
+        </w:rPr>
+        <w:t xml:space="preserve">Biên tập</w:t>
+      </w:r>
+      <w:r>
+        <w:t xml:space="preserve"> (trang Tổng quan, mục 5.1); số nhỏ cạnh nút là số đề xuất đang chờ duyệt, chỉ người duyệt mới thấy.</w:t>
+      </w:r>
+    </w:p>
+    <w:p>
+      <w:pPr>
+        <w:pStyle w:val="ListParagraph"/>
+        <w:numPr>
+          <w:ilvl w:val="0"/>
+          <w:numId w:val="3"/>
+        </w:numPr>
+        <w:spacing w:after="80" w:line="290"/>
+      </w:pPr>
+      <w:r>
+        <w:t xml:space="preserve">Khi bấm chuyển trang, một thanh màu xanh mảnh chạy ở mép trên màn hình cho tới khi trang mới hiện ra.</w:t>
       </w:r>
     </w:p>
     <w:p>
@@ -1694,7 +1959,7 @@
       <w:r>
         <w:drawing>
           <wp:inline distT="0" distB="0" distL="0" distR="0">
-            <wp:extent cx="5715000" cy="4019550"/>
+            <wp:extent cx="5715000" cy="6201667"/>
             <wp:effectExtent t="0" r="0" b="0" l="0"/>
             <wp:docPr id="1" name="fig1" descr="Trang chủ và thanh điều hướng." title="Hình 1"/>
             <wp:cNvGraphicFramePr>
@@ -1719,7 +1984,7 @@
                   <pic:spPr bwMode="auto">
                     <a:xfrm>
                       <a:off x="0" y="0"/>
-                      <a:ext cx="5715000" cy="4019550"/>
+                      <a:ext cx="5715000" cy="6201667"/>
                     </a:xfrm>
                     <a:prstGeom prst="rect">
                       <a:avLst/>
@@ -1745,7 +2010,7 @@
           <w:sz w:val="18"/>
           <w:szCs w:val="18"/>
         </w:rPr>
-        <w:t xml:space="preserve">Hình 1. Trang chủ và thanh điều hướng.</w:t>
+        <w:t xml:space="preserve">Hình 1. Trang chủ: thanh điều hướng, nút Đăng nhập và bốn thẻ mục tiêu.</w:t>
       </w:r>
     </w:p>
     <w:p>
@@ -1761,7 +2026,7 @@
         <w:spacing w:after="120" w:line="300"/>
       </w:pPr>
       <w:r>
-        <w:t xml:space="preserve">Người tra cứu không cần tài khoản. Cần đăng nhập nếu bạn muốn lưu mục, tạo project, viết ghi chú (chương 4), hoặc biên tập dữ liệu (chương 5).</w:t>
+        <w:t xml:space="preserve">Người tra cứu không cần tài khoản. Cần đăng nhập nếu bạn muốn lưu mục, tạo dự án, viết ghi chú (chương 4), hoặc biên tập dữ liệu (chương 5).</w:t>
       </w:r>
     </w:p>
     <w:p>
@@ -1781,20 +2046,10 @@
           <w:b/>
           <w:bCs/>
         </w:rPr>
-        <w:t xml:space="preserve">Sign in</w:t>
-      </w:r>
-      <w:r>
-        <w:t xml:space="preserve"> ở trang chủ, hoặc bấm </w:t>
-      </w:r>
-      <w:r>
-        <w:rPr>
-          <w:b/>
-          <w:bCs/>
-        </w:rPr>
-        <w:t xml:space="preserve">Workspace</w:t>
-      </w:r>
-      <w:r>
-        <w:t xml:space="preserve"> khi chưa đăng nhập.</w:t>
+        <w:t xml:space="preserve">Đăng nhập</w:t>
+      </w:r>
+      <w:r>
+        <w:t xml:space="preserve"> ở góc phải trên cùng.</w:t>
       </w:r>
     </w:p>
     <w:p>
@@ -1807,24 +2062,44 @@
         <w:spacing w:after="80" w:line="290"/>
       </w:pPr>
       <w:r>
-        <w:t xml:space="preserve">Nhập email và mật khẩu rồi bấm </w:t>
-      </w:r>
-      <w:r>
-        <w:rPr>
-          <w:b/>
-          <w:bCs/>
-        </w:rPr>
-        <w:t xml:space="preserve">Sign in</w:t>
-      </w:r>
-      <w:r>
-        <w:t xml:space="preserve">. Có thể dùng </w:t>
-      </w:r>
-      <w:r>
-        <w:rPr>
-          <w:b/>
-          <w:bCs/>
-        </w:rPr>
-        <w:t xml:space="preserve">Continue with Google</w:t>
+        <w:t xml:space="preserve">Nhập </w:t>
+      </w:r>
+      <w:r>
+        <w:rPr>
+          <w:b/>
+          <w:bCs/>
+        </w:rPr>
+        <w:t xml:space="preserve">Email</w:t>
+      </w:r>
+      <w:r>
+        <w:t xml:space="preserve"> và </w:t>
+      </w:r>
+      <w:r>
+        <w:rPr>
+          <w:b/>
+          <w:bCs/>
+        </w:rPr>
+        <w:t xml:space="preserve">Mật khẩu</w:t>
+      </w:r>
+      <w:r>
+        <w:t xml:space="preserve"> rồi bấm </w:t>
+      </w:r>
+      <w:r>
+        <w:rPr>
+          <w:b/>
+          <w:bCs/>
+        </w:rPr>
+        <w:t xml:space="preserve">Đăng nhập</w:t>
+      </w:r>
+      <w:r>
+        <w:t xml:space="preserve">. Có thể bấm </w:t>
+      </w:r>
+      <w:r>
+        <w:rPr>
+          <w:b/>
+          <w:bCs/>
+        </w:rPr>
+        <w:t xml:space="preserve">Tiếp tục với Google</w:t>
       </w:r>
       <w:r>
         <w:t xml:space="preserve"> nếu hệ thống đã bật.</w:t>
@@ -1847,20 +2122,20 @@
           <w:b/>
           <w:bCs/>
         </w:rPr>
-        <w:t xml:space="preserve">Create an account</w:t>
-      </w:r>
-      <w:r>
-        <w:t xml:space="preserve">, nhập email và mật khẩu (ít nhất 8 ký tự), rồi </w:t>
-      </w:r>
-      <w:r>
-        <w:rPr>
-          <w:b/>
-          <w:bCs/>
-        </w:rPr>
-        <w:t xml:space="preserve">mở email và bấm link xác nhận</w:t>
-      </w:r>
-      <w:r>
-        <w:t xml:space="preserve">.</w:t>
+        <w:t xml:space="preserve">Tạo tài khoản</w:t>
+      </w:r>
+      <w:r>
+        <w:t xml:space="preserve">, nhập email, mật khẩu (ít nhất 8 ký tự) và </w:t>
+      </w:r>
+      <w:r>
+        <w:rPr>
+          <w:b/>
+          <w:bCs/>
+        </w:rPr>
+        <w:t xml:space="preserve">Nhập lại mật khẩu</w:t>
+      </w:r>
+      <w:r>
+        <w:t xml:space="preserve">, rồi mở email và bấm link xác nhận.</w:t>
       </w:r>
     </w:p>
     <w:p>
@@ -1880,10 +2155,20 @@
           <w:b/>
           <w:bCs/>
         </w:rPr>
-        <w:t xml:space="preserve">Dashboard</w:t>
-      </w:r>
-      <w:r>
-        <w:t xml:space="preserve">.</w:t>
+        <w:t xml:space="preserve">Tổng quan</w:t>
+      </w:r>
+      <w:r>
+        <w:t xml:space="preserve">. Từ đó mở </w:t>
+      </w:r>
+      <w:r>
+        <w:rPr>
+          <w:b/>
+          <w:bCs/>
+        </w:rPr>
+        <w:t xml:space="preserve">Không gian của tôi</w:t>
+      </w:r>
+      <w:r>
+        <w:t xml:space="preserve">, hoặc các khu vực biên tập nếu được cấp quyền.</w:t>
       </w:r>
     </w:p>
     <w:p>
@@ -1895,7 +2180,7 @@
       <w:r>
         <w:drawing>
           <wp:inline distT="0" distB="0" distL="0" distR="0">
-            <wp:extent cx="5715000" cy="3571875"/>
+            <wp:extent cx="5715000" cy="4464843"/>
             <wp:effectExtent t="0" r="0" b="0" l="0"/>
             <wp:docPr id="1" name="fig2" descr="Màn hình đăng nhập." title="Hình 2"/>
             <wp:cNvGraphicFramePr>
@@ -1920,7 +2205,7 @@
                   <pic:spPr bwMode="auto">
                     <a:xfrm>
                       <a:off x="0" y="0"/>
-                      <a:ext cx="5715000" cy="3571875"/>
+                      <a:ext cx="5715000" cy="4464843"/>
                     </a:xfrm>
                     <a:prstGeom prst="rect">
                       <a:avLst/>
@@ -2004,10 +2289,10 @@
           <w:b/>
           <w:bCs/>
         </w:rPr>
-        <w:t xml:space="preserve">Countries</w:t>
-      </w:r>
-      <w:r>
-        <w:t xml:space="preserve"> trên thanh điều hướng. Danh sách hiện năm quốc gia, kèm trạng thái nghiên cứu và số nguồn đã đăng ký.</w:t>
+        <w:t xml:space="preserve">Quốc gia</w:t>
+      </w:r>
+      <w:r>
+        <w:t xml:space="preserve"> trên thanh điều hướng. Mỗi quốc gia là một thẻ, kèm trạng thái nghiên cứu và số nguồn đã đăng ký.</w:t>
       </w:r>
     </w:p>
     <w:p>
@@ -2040,10 +2325,10 @@
           <w:b/>
           <w:bCs/>
         </w:rPr>
-        <w:t xml:space="preserve">Explore</w:t>
-      </w:r>
-      <w:r>
-        <w:t xml:space="preserve">, chọn: trường đã duyệt, chương trình đã duyệt, quy định nhập cư, so sánh với quốc gia khác, hoặc nghề nghiệp.</w:t>
+        <w:t xml:space="preserve">Khám phá</w:t>
+      </w:r>
+      <w:r>
+        <w:t xml:space="preserve">, chọn: trường, chương trình, quy định nhập cư, so sánh với quốc gia khác, hoặc nghề nghiệp.</w:t>
       </w:r>
     </w:p>
     <w:p>
@@ -2063,7 +2348,7 @@
           <w:b/>
           <w:bCs/>
         </w:rPr>
-        <w:t xml:space="preserve">Evidence-backed facts</w:t>
+        <w:t xml:space="preserve">Thông tin có bằng chứng</w:t>
       </w:r>
       <w:r>
         <w:t xml:space="preserve"> hiện 5 thông tin mới nhất về quốc gia; bấm </w:t>
@@ -2073,7 +2358,7 @@
           <w:b/>
           <w:bCs/>
         </w:rPr>
-        <w:t xml:space="preserve">All facts</w:t>
+        <w:t xml:space="preserve">Xem tất cả</w:t>
       </w:r>
       <w:r>
         <w:t xml:space="preserve"> để xem toàn bộ.</w:t>
@@ -2096,10 +2381,10 @@
           <w:b/>
           <w:bCs/>
         </w:rPr>
-        <w:t xml:space="preserve">Linked sources</w:t>
-      </w:r>
-      <w:r>
-        <w:t xml:space="preserve"> liệt kê các nguồn gắn với quốc gia này.</w:t>
+        <w:t xml:space="preserve">Nguồn của quốc gia này</w:t>
+      </w:r>
+      <w:r>
+        <w:t xml:space="preserve"> liệt kê các nguồn gắn với quốc gia.</w:t>
       </w:r>
     </w:p>
     <w:p>
@@ -2111,7 +2396,7 @@
       <w:r>
         <w:drawing>
           <wp:inline distT="0" distB="0" distL="0" distR="0">
-            <wp:extent cx="5715000" cy="2857500"/>
+            <wp:extent cx="5715000" cy="3366492"/>
             <wp:effectExtent t="0" r="0" b="0" l="0"/>
             <wp:docPr id="1" name="fig3" descr="Danh sách quốc gia." title="Hình 3"/>
             <wp:cNvGraphicFramePr>
@@ -2136,7 +2421,7 @@
                   <pic:spPr bwMode="auto">
                     <a:xfrm>
                       <a:off x="0" y="0"/>
-                      <a:ext cx="5715000" cy="2857500"/>
+                      <a:ext cx="5715000" cy="3366492"/>
                     </a:xfrm>
                     <a:prstGeom prst="rect">
                       <a:avLst/>
@@ -2162,7 +2447,7 @@
           <w:sz w:val="18"/>
           <w:szCs w:val="18"/>
         </w:rPr>
-        <w:t xml:space="preserve">Hình 3. Danh sách quốc gia.</w:t>
+        <w:t xml:space="preserve">Hình 3. Danh sách quốc gia dạng thẻ.</w:t>
       </w:r>
     </w:p>
     <w:p>
@@ -2174,7 +2459,7 @@
       <w:r>
         <w:drawing>
           <wp:inline distT="0" distB="0" distL="0" distR="0">
-            <wp:extent cx="5715000" cy="5695950"/>
+            <wp:extent cx="4389120" cy="8229600"/>
             <wp:effectExtent t="0" r="0" b="0" l="0"/>
             <wp:docPr id="1" name="fig4" descr="Trang hồ sơ quốc gia." title="Hình 4"/>
             <wp:cNvGraphicFramePr>
@@ -2199,7 +2484,7 @@
                   <pic:spPr bwMode="auto">
                     <a:xfrm>
                       <a:off x="0" y="0"/>
-                      <a:ext cx="5715000" cy="5695950"/>
+                      <a:ext cx="4389120" cy="8229600"/>
                     </a:xfrm>
                     <a:prstGeom prst="rect">
                       <a:avLst/>
@@ -2253,7 +2538,7 @@
           <w:b/>
           <w:bCs/>
         </w:rPr>
-        <w:t xml:space="preserve">Universities</w:t>
+        <w:t xml:space="preserve">Du học → Trường đại học</w:t>
       </w:r>
       <w:r>
         <w:t xml:space="preserve">.</w:t>
@@ -2276,7 +2561,7 @@
           <w:b/>
           <w:bCs/>
         </w:rPr>
-        <w:t xml:space="preserve">Search</w:t>
+        <w:t xml:space="preserve">Tìm tên trường</w:t>
       </w:r>
       <w:r>
         <w:t xml:space="preserve">, chọn </w:t>
@@ -2286,7 +2571,7 @@
           <w:b/>
           <w:bCs/>
         </w:rPr>
-        <w:t xml:space="preserve">Country</w:t>
+        <w:t xml:space="preserve">Quốc gia</w:t>
       </w:r>
       <w:r>
         <w:t xml:space="preserve"> nếu muốn, rồi bấm </w:t>
@@ -2296,7 +2581,7 @@
           <w:b/>
           <w:bCs/>
         </w:rPr>
-        <w:t xml:space="preserve">Apply</w:t>
+        <w:t xml:space="preserve">Lọc</w:t>
       </w:r>
       <w:r>
         <w:t xml:space="preserve">. Bấm </w:t>
@@ -2306,7 +2591,7 @@
           <w:b/>
           <w:bCs/>
         </w:rPr>
-        <w:t xml:space="preserve">Reset</w:t>
+        <w:t xml:space="preserve">Bỏ lọc</w:t>
       </w:r>
       <w:r>
         <w:t xml:space="preserve"> để xóa bộ lọc.</w:t>
@@ -2329,7 +2614,7 @@
           <w:b/>
           <w:bCs/>
         </w:rPr>
-        <w:t xml:space="preserve">Why this university is listed</w:t>
+        <w:t xml:space="preserve">Vì sao trường này có trong danh sách</w:t>
       </w:r>
       <w:r>
         <w:t xml:space="preserve"> (trích đoạn chứng minh trường tồn tại, tên nguồn, ngày thu thập).</w:t>
@@ -2344,7 +2629,7 @@
       <w:r>
         <w:drawing>
           <wp:inline distT="0" distB="0" distL="0" distR="0">
-            <wp:extent cx="5715000" cy="2657475"/>
+            <wp:extent cx="5715000" cy="7143750"/>
             <wp:effectExtent t="0" r="0" b="0" l="0"/>
             <wp:docPr id="1" name="fig5" descr="Danh sách trường có ô tìm kiếm và bộ lọc quốc gia." title="Hình 5"/>
             <wp:cNvGraphicFramePr>
@@ -2369,7 +2654,7 @@
                   <pic:spPr bwMode="auto">
                     <a:xfrm>
                       <a:off x="0" y="0"/>
-                      <a:ext cx="5715000" cy="2657475"/>
+                      <a:ext cx="5715000" cy="7143750"/>
                     </a:xfrm>
                     <a:prstGeom prst="rect">
                       <a:avLst/>
@@ -2395,7 +2680,7 @@
           <w:sz w:val="18"/>
           <w:szCs w:val="18"/>
         </w:rPr>
-        <w:t xml:space="preserve">Hình 5. Danh sách trường có ô tìm kiếm và bộ lọc quốc gia.</w:t>
+        <w:t xml:space="preserve">Hình 5. Danh sách trường dạng thẻ, có ô tìm kiếm và bộ lọc quốc gia.</w:t>
       </w:r>
     </w:p>
     <w:p>
@@ -2407,7 +2692,7 @@
       <w:r>
         <w:drawing>
           <wp:inline distT="0" distB="0" distL="0" distR="0">
-            <wp:extent cx="5715000" cy="3733800"/>
+            <wp:extent cx="5715000" cy="4009429"/>
             <wp:effectExtent t="0" r="0" b="0" l="0"/>
             <wp:docPr id="1" name="fig6" descr="Trang chi tiết một trường." title="Hình 6"/>
             <wp:cNvGraphicFramePr>
@@ -2432,7 +2717,7 @@
                   <pic:spPr bwMode="auto">
                     <a:xfrm>
                       <a:off x="0" y="0"/>
-                      <a:ext cx="5715000" cy="3733800"/>
+                      <a:ext cx="5715000" cy="4009429"/>
                     </a:xfrm>
                     <a:prstGeom prst="rect">
                       <a:avLst/>
@@ -2507,7 +2792,7 @@
           <w:b/>
           <w:bCs/>
         </w:rPr>
-        <w:t xml:space="preserve">Programmes</w:t>
+        <w:t xml:space="preserve">Du học → Chương trình học</w:t>
       </w:r>
       <w:r>
         <w:t xml:space="preserve">.</w:t>
@@ -2530,7 +2815,7 @@
           <w:b/>
           <w:bCs/>
         </w:rPr>
-        <w:t xml:space="preserve">Country</w:t>
+        <w:t xml:space="preserve">Quốc gia</w:t>
       </w:r>
       <w:r>
         <w:t xml:space="preserve">, </w:t>
@@ -2540,27 +2825,27 @@
           <w:b/>
           <w:bCs/>
         </w:rPr>
-        <w:t xml:space="preserve">Degree</w:t>
-      </w:r>
-      <w:r>
-        <w:t xml:space="preserve"> (bậc học) và </w:t>
-      </w:r>
-      <w:r>
-        <w:rPr>
-          <w:b/>
-          <w:bCs/>
-        </w:rPr>
-        <w:t xml:space="preserve">Field contains</w:t>
-      </w:r>
-      <w:r>
-        <w:t xml:space="preserve"> (ngành); bấm </w:t>
-      </w:r>
-      <w:r>
-        <w:rPr>
-          <w:b/>
-          <w:bCs/>
-        </w:rPr>
-        <w:t xml:space="preserve">Apply</w:t>
+        <w:t xml:space="preserve">Bậc học</w:t>
+      </w:r>
+      <w:r>
+        <w:t xml:space="preserve"> và </w:t>
+      </w:r>
+      <w:r>
+        <w:rPr>
+          <w:b/>
+          <w:bCs/>
+        </w:rPr>
+        <w:t xml:space="preserve">Ngành có chứa</w:t>
+      </w:r>
+      <w:r>
+        <w:t xml:space="preserve">; bấm </w:t>
+      </w:r>
+      <w:r>
+        <w:rPr>
+          <w:b/>
+          <w:bCs/>
+        </w:rPr>
+        <w:t xml:space="preserve">Lọc</w:t>
       </w:r>
       <w:r>
         <w:t xml:space="preserve">.</w:t>
@@ -2583,7 +2868,17 @@
           <w:b/>
           <w:bCs/>
         </w:rPr>
-        <w:t xml:space="preserve">Previous / Next</w:t>
+        <w:t xml:space="preserve">Trang trước</w:t>
+      </w:r>
+      <w:r>
+        <w:t xml:space="preserve"> / </w:t>
+      </w:r>
+      <w:r>
+        <w:rPr>
+          <w:b/>
+          <w:bCs/>
+        </w:rPr>
+        <w:t xml:space="preserve">Trang sau</w:t>
       </w:r>
       <w:r>
         <w:t xml:space="preserve"> ở cuối danh sách để chuyển trang.</w:t>
@@ -2619,7 +2914,7 @@
           <w:b/>
           <w:bCs/>
         </w:rPr>
-        <w:t xml:space="preserve">Tuition, deadlines and other facts</w:t>
+        <w:t xml:space="preserve">Học phí, hạn nộp và thông tin khác</w:t>
       </w:r>
       <w:r>
         <w:t xml:space="preserve"> hiện học phí, hạn nộp hồ sơ… nếu đã có thông tin được duyệt. Nếu chưa có, trang ghi rõ và khuyên bạn kiểm tra trang chính thức.</w:t>
@@ -2634,7 +2929,7 @@
       <w:r>
         <w:drawing>
           <wp:inline distT="0" distB="0" distL="0" distR="0">
-            <wp:extent cx="5715000" cy="3057525"/>
+            <wp:extent cx="5715000" cy="2951261"/>
             <wp:effectExtent t="0" r="0" b="0" l="0"/>
             <wp:docPr id="1" name="fig7" descr="Danh sách chương trình với bộ lọc." title="Hình 7"/>
             <wp:cNvGraphicFramePr>
@@ -2659,7 +2954,7 @@
                   <pic:spPr bwMode="auto">
                     <a:xfrm>
                       <a:off x="0" y="0"/>
-                      <a:ext cx="5715000" cy="3057525"/>
+                      <a:ext cx="5715000" cy="2951261"/>
                     </a:xfrm>
                     <a:prstGeom prst="rect">
                       <a:avLst/>
@@ -2697,7 +2992,7 @@
       <w:r>
         <w:drawing>
           <wp:inline distT="0" distB="0" distL="0" distR="0">
-            <wp:extent cx="5715000" cy="5686425"/>
+            <wp:extent cx="5715000" cy="5790902"/>
             <wp:effectExtent t="0" r="0" b="0" l="0"/>
             <wp:docPr id="1" name="fig8" descr="Trang chi tiết chương trình." title="Hình 8"/>
             <wp:cNvGraphicFramePr>
@@ -2722,7 +3017,7 @@
                   <pic:spPr bwMode="auto">
                     <a:xfrm>
                       <a:off x="0" y="0"/>
-                      <a:ext cx="5715000" cy="5686425"/>
+                      <a:ext cx="5715000" cy="5790902"/>
                     </a:xfrm>
                     <a:prstGeom prst="rect">
                       <a:avLst/>
@@ -2776,7 +3071,7 @@
           <w:b/>
           <w:bCs/>
         </w:rPr>
-        <w:t xml:space="preserve">Immigration</w:t>
+        <w:t xml:space="preserve">Làm việc &amp; Visa → Quy định nhập cư</w:t>
       </w:r>
       <w:r>
         <w:t xml:space="preserve">. Khung màu cam ở đầu trang nhắc rằng đây là thông tin nghiên cứu, không phải tư vấn di trú.</w:t>
@@ -2799,7 +3094,7 @@
           <w:b/>
           <w:bCs/>
         </w:rPr>
-        <w:t xml:space="preserve">Country</w:t>
+        <w:t xml:space="preserve">Quốc gia</w:t>
       </w:r>
       <w:r>
         <w:t xml:space="preserve"> và </w:t>
@@ -2809,7 +3104,7 @@
           <w:b/>
           <w:bCs/>
         </w:rPr>
-        <w:t xml:space="preserve">Rule type</w:t>
+        <w:t xml:space="preserve">Loại quy định</w:t>
       </w:r>
       <w:r>
         <w:t xml:space="preserve"> (giấy phép du học, lao động, ở lại sau tốt nghiệp, thường trú, quốc tịch).</w:t>
@@ -2832,7 +3127,7 @@
           <w:b/>
           <w:bCs/>
         </w:rPr>
-        <w:t xml:space="preserve">Requirements</w:t>
+        <w:t xml:space="preserve">Điều kiện</w:t>
       </w:r>
       <w:r>
         <w:t xml:space="preserve"> (điều kiện cụ thể như mức tài chính, bảo hiểm…).</w:t>
@@ -2855,7 +3150,7 @@
           <w:b/>
           <w:bCs/>
         </w:rPr>
-        <w:t xml:space="preserve">Official immigration authorities</w:t>
+        <w:t xml:space="preserve">Cơ quan di trú (nguồn T1)</w:t>
       </w:r>
       <w:r>
         <w:t xml:space="preserve"> cuối trang liệt kê website của các cơ quan di trú chính thức.</w:t>
@@ -2870,7 +3165,7 @@
       <w:r>
         <w:drawing>
           <wp:inline distT="0" distB="0" distL="0" distR="0">
-            <wp:extent cx="5715000" cy="5334000"/>
+            <wp:extent cx="5715000" cy="7143750"/>
             <wp:effectExtent t="0" r="0" b="0" l="0"/>
             <wp:docPr id="1" name="fig9" descr="Trang quy định nhập cư với khung cảnh báo và danh sách cơ quan chính thức." title="Hình 9"/>
             <wp:cNvGraphicFramePr>
@@ -2895,7 +3190,7 @@
                   <pic:spPr bwMode="auto">
                     <a:xfrm>
                       <a:off x="0" y="0"/>
-                      <a:ext cx="5715000" cy="5334000"/>
+                      <a:ext cx="5715000" cy="7143750"/>
                     </a:xfrm>
                     <a:prstGeom prst="rect">
                       <a:avLst/>
@@ -2970,7 +3265,7 @@
           <w:b/>
           <w:bCs/>
         </w:rPr>
-        <w:t xml:space="preserve">Occupations</w:t>
+        <w:t xml:space="preserve">Làm việc &amp; Visa → Nghề nghiệp</w:t>
       </w:r>
       <w:r>
         <w:t xml:space="preserve"> và tìm tên nghề.</w:t>
@@ -3006,7 +3301,7 @@
           <w:b/>
           <w:bCs/>
         </w:rPr>
-        <w:t xml:space="preserve">Labour-market figures</w:t>
+        <w:t xml:space="preserve">Số liệu thị trường lao động</w:t>
       </w:r>
       <w:r>
         <w:t xml:space="preserve"> để lọc số liệu theo từng nước; số bên cạnh tên nước là số liệu hiện có.</w:t>
@@ -3044,7 +3339,7 @@
       <w:r>
         <w:drawing>
           <wp:inline distT="0" distB="0" distL="0" distR="0">
-            <wp:extent cx="5715000" cy="2781300"/>
+            <wp:extent cx="5715000" cy="4871144"/>
             <wp:effectExtent t="0" r="0" b="0" l="0"/>
             <wp:docPr id="1" name="fig10" descr="Danh sách nghề." title="Hình 10"/>
             <wp:cNvGraphicFramePr>
@@ -3069,7 +3364,7 @@
                   <pic:spPr bwMode="auto">
                     <a:xfrm>
                       <a:off x="0" y="0"/>
-                      <a:ext cx="5715000" cy="2781300"/>
+                      <a:ext cx="5715000" cy="4871144"/>
                     </a:xfrm>
                     <a:prstGeom prst="rect">
                       <a:avLst/>
@@ -3144,7 +3439,7 @@
           <w:b/>
           <w:bCs/>
         </w:rPr>
-        <w:t xml:space="preserve">Compare</w:t>
+        <w:t xml:space="preserve">So sánh</w:t>
       </w:r>
       <w:r>
         <w:t xml:space="preserve">.</w:t>
@@ -3304,7 +3599,7 @@
       <w:r>
         <w:drawing>
           <wp:inline distT="0" distB="0" distL="0" distR="0">
-            <wp:extent cx="5448300" cy="7239000"/>
+            <wp:extent cx="5421455" cy="8229600"/>
             <wp:effectExtent t="0" r="0" b="0" l="0"/>
             <wp:docPr id="1" name="fig11" descr="Trang so sánh hai quốc gia." title="Hình 11"/>
             <wp:cNvGraphicFramePr>
@@ -3329,7 +3624,7 @@
                   <pic:spPr bwMode="auto">
                     <a:xfrm>
                       <a:off x="0" y="0"/>
-                      <a:ext cx="5448300" cy="7239000"/>
+                      <a:ext cx="5421455" cy="8229600"/>
                     </a:xfrm>
                     <a:prstGeom prst="rect">
                       <a:avLst/>
@@ -3367,7 +3662,7 @@
       <w:r>
         <w:drawing>
           <wp:inline distT="0" distB="0" distL="0" distR="0">
-            <wp:extent cx="5715000" cy="3638550"/>
+            <wp:extent cx="5715000" cy="3906738"/>
             <wp:effectExtent t="0" r="0" b="0" l="0"/>
             <wp:docPr id="1" name="fig12" descr="Minh họa một bảng chỉ số có dữ liệu (dữ liệu DEMO): ô có nhiều giá trị, giá trị mâu thuẫn, nguồn không chính thức và ô trống." title="Hình 12"/>
             <wp:cNvGraphicFramePr>
@@ -3392,7 +3687,7 @@
                   <pic:spPr bwMode="auto">
                     <a:xfrm>
                       <a:off x="0" y="0"/>
-                      <a:ext cx="5715000" cy="3638550"/>
+                      <a:ext cx="5715000" cy="3906738"/>
                     </a:xfrm>
                     <a:prstGeom prst="rect">
                       <a:avLst/>
@@ -3490,7 +3785,7 @@
           <w:b/>
           <w:bCs/>
         </w:rPr>
-        <w:t xml:space="preserve">Search</w:t>
+        <w:t xml:space="preserve">Tìm kiếm</w:t>
       </w:r>
       <w:r>
         <w:t xml:space="preserve">. Không cần gõ dấu: “malmo” vẫn tìm thấy “Malmö”.</w:t>
@@ -3513,7 +3808,7 @@
           <w:b/>
           <w:bCs/>
         </w:rPr>
-        <w:t xml:space="preserve">See all</w:t>
+        <w:t xml:space="preserve">Xem tất cả</w:t>
       </w:r>
       <w:r>
         <w:t xml:space="preserve"> để xem đầy đủ trong danh sách tương ứng.</w:t>
@@ -3541,7 +3836,7 @@
       <w:r>
         <w:drawing>
           <wp:inline distT="0" distB="0" distL="0" distR="0">
-            <wp:extent cx="5715000" cy="5048250"/>
+            <wp:extent cx="5715000" cy="5143500"/>
             <wp:effectExtent t="0" r="0" b="0" l="0"/>
             <wp:docPr id="1" name="fig13" descr="Kết quả tìm kiếm được chia nhóm." title="Hình 13"/>
             <wp:cNvGraphicFramePr>
@@ -3566,7 +3861,7 @@
                   <pic:spPr bwMode="auto">
                     <a:xfrm>
                       <a:off x="0" y="0"/>
-                      <a:ext cx="5715000" cy="5048250"/>
+                      <a:ext cx="5715000" cy="5143500"/>
                     </a:xfrm>
                     <a:prstGeom prst="rect">
                       <a:avLst/>
@@ -4108,7 +4403,7 @@
           <w:b/>
           <w:bCs/>
         </w:rPr>
-        <w:t xml:space="preserve">Sources</w:t>
+        <w:t xml:space="preserve">Bằng chứng → Nguồn</w:t>
       </w:r>
       <w:r>
         <w:t xml:space="preserve"> để xem danh sách nguồn; lọc theo quốc gia, tier, trạng thái xác minh, hoặc tìm theo tên/URL.</w:t>
@@ -4144,7 +4439,7 @@
           <w:b/>
           <w:bCs/>
         </w:rPr>
-        <w:t xml:space="preserve">Documents</w:t>
+        <w:t xml:space="preserve">Bằng chứng → Tài liệu</w:t>
       </w:r>
       <w:r>
         <w:t xml:space="preserve"> để xem các tài liệu đã nhập (tiêu đề, nguồn, ngày thu thập). Mở một tài liệu để xem trích đoạn và các phiên bản đã ghi nhận.</w:t>
@@ -4167,7 +4462,7 @@
           <w:b/>
           <w:bCs/>
         </w:rPr>
-        <w:t xml:space="preserve">Recorded versions</w:t>
+        <w:t xml:space="preserve">Các phiên bản đã lưu</w:t>
       </w:r>
       <w:r>
         <w:t xml:space="preserve"> liệt kê các lần hệ thống ghi nhận trang này (mỗi lần trang thay đổi nội dung là một phiên bản mới); bấm một phiên bản để xem.</w:t>
@@ -4182,7 +4477,7 @@
       <w:r>
         <w:drawing>
           <wp:inline distT="0" distB="0" distL="0" distR="0">
-            <wp:extent cx="5715000" cy="5800725"/>
+            <wp:extent cx="5715000" cy="7143750"/>
             <wp:effectExtent t="0" r="0" b="0" l="0"/>
             <wp:docPr id="1" name="fig16" descr="Danh sách nguồn." title="Hình 16"/>
             <wp:cNvGraphicFramePr>
@@ -4207,7 +4502,7 @@
                   <pic:spPr bwMode="auto">
                     <a:xfrm>
                       <a:off x="0" y="0"/>
-                      <a:ext cx="5715000" cy="5800725"/>
+                      <a:ext cx="5715000" cy="7143750"/>
                     </a:xfrm>
                     <a:prstGeom prst="rect">
                       <a:avLst/>
@@ -4245,7 +4540,7 @@
       <w:r>
         <w:drawing>
           <wp:inline distT="0" distB="0" distL="0" distR="0">
-            <wp:extent cx="5715000" cy="5857875"/>
+            <wp:extent cx="5715000" cy="5420320"/>
             <wp:effectExtent t="0" r="0" b="0" l="0"/>
             <wp:docPr id="1" name="fig17" descr="Trang chi tiết một nguồn." title="Hình 17"/>
             <wp:cNvGraphicFramePr>
@@ -4270,7 +4565,7 @@
                   <pic:spPr bwMode="auto">
                     <a:xfrm>
                       <a:off x="0" y="0"/>
-                      <a:ext cx="5715000" cy="5857875"/>
+                      <a:ext cx="5715000" cy="5420320"/>
                     </a:xfrm>
                     <a:prstGeom prst="rect">
                       <a:avLst/>
@@ -4308,7 +4603,7 @@
       <w:r>
         <w:drawing>
           <wp:inline distT="0" distB="0" distL="0" distR="0">
-            <wp:extent cx="5715000" cy="5800725"/>
+            <wp:extent cx="5715000" cy="5795367"/>
             <wp:effectExtent t="0" r="0" b="0" l="0"/>
             <wp:docPr id="1" name="fig18" descr="Trang chi tiết một tài liệu (người xem công khai)." title="Hình 18"/>
             <wp:cNvGraphicFramePr>
@@ -4333,7 +4628,7 @@
                   <pic:spPr bwMode="auto">
                     <a:xfrm>
                       <a:off x="0" y="0"/>
-                      <a:ext cx="5715000" cy="5800725"/>
+                      <a:ext cx="5715000" cy="5795367"/>
                     </a:xfrm>
                     <a:prstGeom prst="rect">
                       <a:avLst/>
@@ -4416,7 +4711,7 @@
         <w:spacing w:after="120" w:line="300"/>
       </w:pPr>
       <w:r>
-        <w:t xml:space="preserve">Giao diện tự co giãn theo màn hình: bộ lọc xếp dọc, thanh điều hướng vuốt ngang được, bảng so sánh cuộn ngang và cột tiêu chí luôn đứng yên.</w:t>
+        <w:t xml:space="preserve">Giao diện tự co giãn theo màn hình: bộ lọc xếp dọc; thanh điều hướng thu vào nút ☰ ở góc phải; bảng so sánh cuộn ngang và cột tiêu chí luôn đứng yên. Ở các trang chia đôi màn hình (mục 5.2, 5.4), danh sách và chi tiết hiện lần lượt; khung chi tiết của các trang bảng (5.1) trượt lên từ dưới.</w:t>
       </w:r>
     </w:p>
     <w:p>
@@ -4428,7 +4723,7 @@
       <w:r>
         <w:drawing>
           <wp:inline distT="0" distB="0" distL="0" distR="0">
-            <wp:extent cx="2943225" cy="5905500"/>
+            <wp:extent cx="4363520" cy="8229600"/>
             <wp:effectExtent t="0" r="0" b="0" l="0"/>
             <wp:docPr id="1" name="fig19" descr="Trang chương trình trên màn hình hẹp." title="Hình 19"/>
             <wp:cNvGraphicFramePr>
@@ -4453,7 +4748,7 @@
                   <pic:spPr bwMode="auto">
                     <a:xfrm>
                       <a:off x="0" y="0"/>
-                      <a:ext cx="2943225" cy="5905500"/>
+                      <a:ext cx="4363520" cy="8229600"/>
                     </a:xfrm>
                     <a:prstGeom prst="rect">
                       <a:avLst/>
@@ -4479,7 +4774,7 @@
           <w:sz w:val="18"/>
           <w:szCs w:val="18"/>
         </w:rPr>
-        <w:t xml:space="preserve">Hình 19. Trang chương trình trên màn hình hẹp.</w:t>
+        <w:t xml:space="preserve">Hình 19. Danh sách chương trình trên màn hình hẹp.</w:t>
       </w:r>
     </w:p>
     <w:p>
@@ -4595,7 +4890,7 @@
       <w:r>
         <w:drawing>
           <wp:inline distT="0" distB="0" distL="0" distR="0">
-            <wp:extent cx="5715000" cy="1876425"/>
+            <wp:extent cx="5715000" cy="2500312"/>
             <wp:effectExtent t="0" r="0" b="0" l="0"/>
             <wp:docPr id="1" name="fig20" descr="Nút lưu trên trang chi tiết chương trình (khi chưa đăng nhập)." title="Hình 20"/>
             <wp:cNvGraphicFramePr>
@@ -4620,7 +4915,7 @@
                   <pic:spPr bwMode="auto">
                     <a:xfrm>
                       <a:off x="0" y="0"/>
-                      <a:ext cx="5715000" cy="1876425"/>
+                      <a:ext cx="5715000" cy="2500312"/>
                     </a:xfrm>
                     <a:prstGeom prst="rect">
                       <a:avLst/>
@@ -4675,7 +4970,7 @@
         <w:pStyle w:val="Heading2"/>
       </w:pPr>
       <w:r>
-        <w:t xml:space="preserve">4.2 My workspace</w:t>
+        <w:t xml:space="preserve">4.2 Không gian của tôi</w:t>
       </w:r>
     </w:p>
     <w:p>
@@ -4695,20 +4990,10 @@
           <w:b/>
           <w:bCs/>
         </w:rPr>
-        <w:t xml:space="preserve">Workspace</w:t>
-      </w:r>
-      <w:r>
-        <w:t xml:space="preserve"> → </w:t>
-      </w:r>
-      <w:r>
-        <w:rPr>
-          <w:b/>
-          <w:bCs/>
-        </w:rPr>
-        <w:t xml:space="preserve">My workspace</w:t>
-      </w:r>
-      <w:r>
-        <w:t xml:space="preserve"> (hoặc mở /workspace).</w:t>
+        <w:t xml:space="preserve">Không gian của tôi</w:t>
+      </w:r>
+      <w:r>
+        <w:t xml:space="preserve"> ở góc phải trên cùng (hoặc mở /workspace).</w:t>
       </w:r>
     </w:p>
     <w:p>
@@ -4728,10 +5013,10 @@
           <w:b/>
           <w:bCs/>
         </w:rPr>
-        <w:t xml:space="preserve">Research projects</w:t>
-      </w:r>
-      <w:r>
-        <w:t xml:space="preserve"> liệt kê project của bạn, chia tab </w:t>
+        <w:t xml:space="preserve">Dự án nghiên cứu</w:t>
+      </w:r>
+      <w:r>
+        <w:t xml:space="preserve"> liệt kê dự án của bạn, chia tab </w:t>
       </w:r>
       <w:r>
         <w:rPr>
@@ -4758,10 +5043,20 @@
           <w:b/>
           <w:bCs/>
         </w:rPr>
-        <w:t xml:space="preserve">Tạo project mới</w:t>
-      </w:r>
-      <w:r>
-        <w:t xml:space="preserve"> để thêm: tên (ví dụ “Sweden 2028”), năm mục tiêu, vai trò mục tiêu, quốc gia mục tiêu, mô tả.</w:t>
+        <w:t xml:space="preserve">Tạo dự án mới</w:t>
+      </w:r>
+      <w:r>
+        <w:t xml:space="preserve"> để thêm: tên (ví dụ “Sweden 2028”), năm mục tiêu, vai trò mục tiêu, quốc gia mục tiêu, mô tả; bấm </w:t>
+      </w:r>
+      <w:r>
+        <w:rPr>
+          <w:b/>
+          <w:bCs/>
+        </w:rPr>
+        <w:t xml:space="preserve">Tạo dự án</w:t>
+      </w:r>
+      <w:r>
+        <w:t xml:space="preserve">.</w:t>
       </w:r>
     </w:p>
     <w:p>
@@ -4784,7 +5079,37 @@
         <w:t xml:space="preserve">Đã lưu</w:t>
       </w:r>
       <w:r>
-        <w:t xml:space="preserve"> liệt kê những gì bạn đã lưu; lọc theo loại bằng các nút phía trên. Chọn một project trong ô bên dưới mỗi mục để gắn mục đó vào project; bấm </w:t>
+        <w:t xml:space="preserve"> liệt kê những gì bạn đã lưu; lọc theo loại bằng các nút phía trên (</w:t>
+      </w:r>
+      <w:r>
+        <w:rPr>
+          <w:b/>
+          <w:bCs/>
+        </w:rPr>
+        <w:t xml:space="preserve">Tất cả</w:t>
+      </w:r>
+      <w:r>
+        <w:t xml:space="preserve">, </w:t>
+      </w:r>
+      <w:r>
+        <w:rPr>
+          <w:b/>
+          <w:bCs/>
+        </w:rPr>
+        <w:t xml:space="preserve">Quốc gia</w:t>
+      </w:r>
+      <w:r>
+        <w:t xml:space="preserve">, </w:t>
+      </w:r>
+      <w:r>
+        <w:rPr>
+          <w:b/>
+          <w:bCs/>
+        </w:rPr>
+        <w:t xml:space="preserve">Chương trình</w:t>
+      </w:r>
+      <w:r>
+        <w:t xml:space="preserve">…). Chọn một dự án trong ô bên dưới mỗi mục để gắn mục đó vào dự án; bấm </w:t>
       </w:r>
       <w:r>
         <w:rPr>
@@ -4862,7 +5187,7 @@
       <w:r>
         <w:drawing>
           <wp:inline distT="0" distB="0" distL="0" distR="0">
-            <wp:extent cx="5715000" cy="7162800"/>
+            <wp:extent cx="5715000" cy="7161609"/>
             <wp:effectExtent t="0" r="0" b="0" l="0"/>
             <wp:docPr id="1" name="fig21" descr="Minh họa My workspace: nút lưu, project, mục đã lưu, ghi chú và lối tắt (dữ liệu DEMO)." title="Hình 21"/>
             <wp:cNvGraphicFramePr>
@@ -4887,7 +5212,7 @@
                   <pic:spPr bwMode="auto">
                     <a:xfrm>
                       <a:off x="0" y="0"/>
-                      <a:ext cx="5715000" cy="7162800"/>
+                      <a:ext cx="5715000" cy="7161609"/>
                     </a:xfrm>
                     <a:prstGeom prst="rect">
                       <a:avLst/>
@@ -4913,7 +5238,7 @@
           <w:sz w:val="18"/>
           <w:szCs w:val="18"/>
         </w:rPr>
-        <w:t xml:space="preserve">Hình 21. Minh họa My workspace: nút lưu, project, mục đã lưu, ghi chú và lối tắt (dữ liệu DEMO).</w:t>
+        <w:t xml:space="preserve">Hình 21. Minh họa Không gian của tôi: nút lưu, dự án, mục đã lưu, ghi chú và lối tắt (dữ liệu DEMO).</w:t>
       </w:r>
     </w:p>
     <w:p>
@@ -4921,7 +5246,7 @@
         <w:pStyle w:val="Heading2"/>
       </w:pPr>
       <w:r>
-        <w:t xml:space="preserve">4.3 Làm việc trong một project</w:t>
+        <w:t xml:space="preserve">4.3 Làm việc trong một dự án</w:t>
       </w:r>
     </w:p>
     <w:p>
@@ -4934,7 +5259,7 @@
         <w:spacing w:after="80" w:line="290"/>
       </w:pPr>
       <w:r>
-        <w:t xml:space="preserve">Bấm vào tên project để mở trang project.</w:t>
+        <w:t xml:space="preserve">Bấm vào tên dự án để mở trang dự án.</w:t>
       </w:r>
     </w:p>
     <w:p>
@@ -4987,10 +5312,10 @@
           <w:b/>
           <w:bCs/>
         </w:rPr>
-        <w:t xml:space="preserve">Mục đã lưu trong project</w:t>
-      </w:r>
-      <w:r>
-        <w:t xml:space="preserve"> hiện các mục bạn đã gắn vào project.</w:t>
+        <w:t xml:space="preserve">Mục đã lưu trong dự án</w:t>
+      </w:r>
+      <w:r>
+        <w:t xml:space="preserve"> hiện các mục bạn đã gắn vào dự án.</w:t>
       </w:r>
     </w:p>
     <w:p>
@@ -5013,7 +5338,7 @@
         <w:t xml:space="preserve">Ghi chú</w:t>
       </w:r>
       <w:r>
-        <w:t xml:space="preserve">: viết ghi chú cho cả project, ví dụ các việc cần chuẩn bị.</w:t>
+        <w:t xml:space="preserve">: viết ghi chú cho cả dự án, ví dụ các việc cần chuẩn bị.</w:t>
       </w:r>
     </w:p>
     <w:p>
@@ -5033,30 +5358,10 @@
           <w:b/>
           <w:bCs/>
         </w:rPr>
-        <w:t xml:space="preserve">Cài đặt project</w:t>
-      </w:r>
-      <w:r>
-        <w:t xml:space="preserve">: </w:t>
-      </w:r>
-      <w:r>
-        <w:rPr>
-          <w:b/>
-          <w:bCs/>
-        </w:rPr>
-        <w:t xml:space="preserve">Sửa project</w:t>
-      </w:r>
-      <w:r>
-        <w:t xml:space="preserve">, hoặc </w:t>
-      </w:r>
-      <w:r>
-        <w:rPr>
-          <w:b/>
-          <w:bCs/>
-        </w:rPr>
-        <w:t xml:space="preserve">Xóa project</w:t>
-      </w:r>
-      <w:r>
-        <w:t xml:space="preserve"> (gõ XÓA để xác nhận). Nút </w:t>
+        <w:t xml:space="preserve">Cài đặt dự án</w:t>
+      </w:r>
+      <w:r>
+        <w:t xml:space="preserve">: sửa dự án, hoặc xóa dự án (gõ XÓA để xác nhận). Nút </w:t>
       </w:r>
       <w:r>
         <w:rPr>
@@ -5066,7 +5371,7 @@
         <w:t xml:space="preserve">Lưu trữ</w:t>
       </w:r>
       <w:r>
-        <w:t xml:space="preserve"> ở đầu trang ẩn project khỏi tab Đang làm mà không xóa.</w:t>
+        <w:t xml:space="preserve"> ở đầu trang ẩn dự án khỏi tab Đang làm mà không xóa.</w:t>
       </w:r>
     </w:p>
     <w:p>
@@ -5087,7 +5392,7 @@
         <w:t xml:space="preserve">Ghi chú: </w:t>
       </w:r>
       <w:r>
-        <w:t xml:space="preserve">Xóa project sẽ xóa các ghi chú trong project; các mục đã lưu vẫn còn, chỉ được bỏ khỏi project.</w:t>
+        <w:t xml:space="preserve">Xóa dự án sẽ xóa các ghi chú trong dự án; các mục đã lưu vẫn còn, chỉ được bỏ khỏi dự án.</w:t>
       </w:r>
     </w:p>
     <w:p>
@@ -5095,7 +5400,7 @@
         <w:pStyle w:val="Heading2"/>
       </w:pPr>
       <w:r>
-        <w:t xml:space="preserve">4.4 My Europe Plan</w:t>
+        <w:t xml:space="preserve">4.4 Kế hoạch châu Âu</w:t>
       </w:r>
     </w:p>
     <w:p>
@@ -5108,24 +5413,34 @@
         <w:spacing w:after="80" w:line="290"/>
       </w:pPr>
       <w:r>
-        <w:t xml:space="preserve">Mở </w:t>
-      </w:r>
-      <w:r>
-        <w:rPr>
-          <w:b/>
-          <w:bCs/>
-        </w:rPr>
-        <w:t xml:space="preserve">Workspace</w:t>
-      </w:r>
-      <w:r>
-        <w:t xml:space="preserve"> → </w:t>
-      </w:r>
-      <w:r>
-        <w:rPr>
-          <w:b/>
-          <w:bCs/>
-        </w:rPr>
-        <w:t xml:space="preserve">My Europe Plan</w:t>
+        <w:t xml:space="preserve">Ở trang </w:t>
+      </w:r>
+      <w:r>
+        <w:rPr>
+          <w:b/>
+          <w:bCs/>
+        </w:rPr>
+        <w:t xml:space="preserve">Tổng quan</w:t>
+      </w:r>
+      <w:r>
+        <w:t xml:space="preserve"> hoặc </w:t>
+      </w:r>
+      <w:r>
+        <w:rPr>
+          <w:b/>
+          <w:bCs/>
+        </w:rPr>
+        <w:t xml:space="preserve">Không gian của tôi</w:t>
+      </w:r>
+      <w:r>
+        <w:t xml:space="preserve">, mở </w:t>
+      </w:r>
+      <w:r>
+        <w:rPr>
+          <w:b/>
+          <w:bCs/>
+        </w:rPr>
+        <w:t xml:space="preserve">Kế hoạch châu Âu</w:t>
       </w:r>
       <w:r>
         <w:t xml:space="preserve"> (hoặc /workspace/plan).</w:t>
@@ -5204,7 +5519,7 @@
           <w:b/>
           <w:bCs/>
         </w:rPr>
-        <w:t xml:space="preserve">Lưu My Europe Plan</w:t>
+        <w:t xml:space="preserve">Lưu kế hoạch</w:t>
       </w:r>
       <w:r>
         <w:t xml:space="preserve">. Phần </w:t>
@@ -5259,17 +5574,7 @@
         <w:spacing w:after="80" w:line="290"/>
       </w:pPr>
       <w:r>
-        <w:t xml:space="preserve">Ở cuối trang </w:t>
-      </w:r>
-      <w:r>
-        <w:rPr>
-          <w:b/>
-          <w:bCs/>
-        </w:rPr>
-        <w:t xml:space="preserve">My workspace</w:t>
-      </w:r>
-      <w:r>
-        <w:t xml:space="preserve">, mở </w:t>
+        <w:t xml:space="preserve">Ở cuối trang Không gian của tôi, mở </w:t>
       </w:r>
       <w:r>
         <w:rPr>
@@ -5292,17 +5597,7 @@
         <w:spacing w:after="80" w:line="290"/>
       </w:pPr>
       <w:r>
-        <w:t xml:space="preserve">Gõ </w:t>
-      </w:r>
-      <w:r>
-        <w:rPr>
-          <w:b/>
-          <w:bCs/>
-        </w:rPr>
-        <w:t xml:space="preserve">XÓA</w:t>
-      </w:r>
-      <w:r>
-        <w:t xml:space="preserve"> vào ô xác nhận rồi bấm nút xóa. Toàn bộ project, mục đã lưu, ghi chú và My Europe Plan của bạn bị xóa vĩnh viễn.</w:t>
+        <w:t xml:space="preserve">Gõ XÓA vào ô xác nhận rồi bấm nút xóa. Toàn bộ dự án, mục đã lưu, ghi chú và Kế hoạch châu Âu của bạn bị xóa vĩnh viễn.</w:t>
       </w:r>
     </w:p>
     <w:p>
@@ -5933,7 +6228,7 @@
         <w:pStyle w:val="Heading2"/>
       </w:pPr>
       <w:r>
-        <w:t xml:space="preserve">5.1 Dashboard và phân quyền</w:t>
+        <w:t xml:space="preserve">5.1 Trang Tổng quan và phân quyền</w:t>
       </w:r>
     </w:p>
     <w:p>
@@ -5946,17 +6241,7 @@
         <w:spacing w:after="80" w:line="290"/>
       </w:pPr>
       <w:r>
-        <w:t xml:space="preserve">Sau khi đăng nhập, </w:t>
-      </w:r>
-      <w:r>
-        <w:rPr>
-          <w:b/>
-          <w:bCs/>
-        </w:rPr>
-        <w:t xml:space="preserve">Dashboard</w:t>
-      </w:r>
-      <w:r>
-        <w:t xml:space="preserve"> hiện các khu vực bạn được phép dùng, chia hai nhóm </w:t>
+        <w:t xml:space="preserve">Bấm </w:t>
       </w:r>
       <w:r>
         <w:rPr>
@@ -5966,6 +6251,36 @@
         <w:t xml:space="preserve">Biên tập</w:t>
       </w:r>
       <w:r>
+        <w:t xml:space="preserve"> ở góc phải để mở trang </w:t>
+      </w:r>
+      <w:r>
+        <w:rPr>
+          <w:b/>
+          <w:bCs/>
+        </w:rPr>
+        <w:t xml:space="preserve">Tổng quan</w:t>
+      </w:r>
+      <w:r>
+        <w:t xml:space="preserve">. Phần </w:t>
+      </w:r>
+      <w:r>
+        <w:rPr>
+          <w:b/>
+          <w:bCs/>
+        </w:rPr>
+        <w:t xml:space="preserve">Cần xử lý</w:t>
+      </w:r>
+      <w:r>
+        <w:t xml:space="preserve"> đếm các việc đang chờ (bấm một ô để mở); bên dưới là các khu vực bạn được phép dùng, chia nhóm </w:t>
+      </w:r>
+      <w:r>
+        <w:rPr>
+          <w:b/>
+          <w:bCs/>
+        </w:rPr>
+        <w:t xml:space="preserve">Biên tập</w:t>
+      </w:r>
+      <w:r>
         <w:t xml:space="preserve"> và </w:t>
       </w:r>
       <w:r>
@@ -5999,7 +6314,60 @@
         <w:t xml:space="preserve">Người dùng &amp; phân quyền</w:t>
       </w:r>
       <w:r>
-        <w:t xml:space="preserve"> (/admin/access) để tạo vai trò: bấm </w:t>
+        <w:t xml:space="preserve"> (/admin/access). Trang có ba tab dạng bảng: </w:t>
+      </w:r>
+      <w:r>
+        <w:rPr>
+          <w:b/>
+          <w:bCs/>
+        </w:rPr>
+        <w:t xml:space="preserve">Người dùng</w:t>
+      </w:r>
+      <w:r>
+        <w:t xml:space="preserve">, </w:t>
+      </w:r>
+      <w:r>
+        <w:rPr>
+          <w:b/>
+          <w:bCs/>
+        </w:rPr>
+        <w:t xml:space="preserve">Vai trò</w:t>
+      </w:r>
+      <w:r>
+        <w:t xml:space="preserve">, </w:t>
+      </w:r>
+      <w:r>
+        <w:rPr>
+          <w:b/>
+          <w:bCs/>
+        </w:rPr>
+        <w:t xml:space="preserve">Nhật ký</w:t>
+      </w:r>
+      <w:r>
+        <w:t xml:space="preserve">. Bấm tiêu đề cột có mũi tên để sắp xếp; bấm một hàng để mở khung chi tiết bên phải (bấm ✕ để đóng).</w:t>
+      </w:r>
+    </w:p>
+    <w:p>
+      <w:pPr>
+        <w:pStyle w:val="ListParagraph"/>
+        <w:numPr>
+          <w:ilvl w:val="0"/>
+          <w:numId w:val="18"/>
+        </w:numPr>
+        <w:spacing w:after="80" w:line="290"/>
+      </w:pPr>
+      <w:r>
+        <w:t xml:space="preserve">Tab </w:t>
+      </w:r>
+      <w:r>
+        <w:rPr>
+          <w:b/>
+          <w:bCs/>
+        </w:rPr>
+        <w:t xml:space="preserve">Vai trò</w:t>
+      </w:r>
+      <w:r>
+        <w:t xml:space="preserve">: bấm </w:t>
       </w:r>
       <w:r>
         <w:rPr>
@@ -6009,7 +6377,17 @@
         <w:t xml:space="preserve">Tạo vai trò mới</w:t>
       </w:r>
       <w:r>
-        <w:t xml:space="preserve">, đặt tên, tick các quyền, rồi bấm </w:t>
+        <w:t xml:space="preserve">, đặt tên, tick các quyền (chia theo nhóm), rồi bấm </w:t>
+      </w:r>
+      <w:r>
+        <w:rPr>
+          <w:b/>
+          <w:bCs/>
+        </w:rPr>
+        <w:t xml:space="preserve">Tạo vai trò</w:t>
+      </w:r>
+      <w:r>
+        <w:t xml:space="preserve">. Để sửa, bấm hàng của vai trò, chỉnh trong khung bên phải rồi bấm </w:t>
       </w:r>
       <w:r>
         <w:rPr>
@@ -6032,7 +6410,7 @@
         <w:spacing w:after="80" w:line="290"/>
       </w:pPr>
       <w:r>
-        <w:t xml:space="preserve">Trong phần </w:t>
+        <w:t xml:space="preserve">Tab </w:t>
       </w:r>
       <w:r>
         <w:rPr>
@@ -6042,27 +6420,57 @@
         <w:t xml:space="preserve">Người dùng</w:t>
       </w:r>
       <w:r>
-        <w:t xml:space="preserve">, tìm theo email, chọn vai trò, chọn </w:t>
-      </w:r>
-      <w:r>
-        <w:rPr>
-          <w:b/>
-          <w:bCs/>
-        </w:rPr>
-        <w:t xml:space="preserve">Gán vai trò</w:t>
-      </w:r>
-      <w:r>
-        <w:t xml:space="preserve"> và bấm </w:t>
-      </w:r>
-      <w:r>
-        <w:rPr>
-          <w:b/>
-          <w:bCs/>
-        </w:rPr>
-        <w:t xml:space="preserve">Áp dụng</w:t>
-      </w:r>
-      <w:r>
-        <w:t xml:space="preserve">.</w:t>
+        <w:t xml:space="preserve">: tìm theo email rồi bấm một hàng. Khung chi tiết có </w:t>
+      </w:r>
+      <w:r>
+        <w:rPr>
+          <w:b/>
+          <w:bCs/>
+        </w:rPr>
+        <w:t xml:space="preserve">Vai trò hiện có</w:t>
+      </w:r>
+      <w:r>
+        <w:t xml:space="preserve"> (bấm </w:t>
+      </w:r>
+      <w:r>
+        <w:rPr>
+          <w:b/>
+          <w:bCs/>
+        </w:rPr>
+        <w:t xml:space="preserve">Gỡ</w:t>
+      </w:r>
+      <w:r>
+        <w:t xml:space="preserve"> để gỡ), </w:t>
+      </w:r>
+      <w:r>
+        <w:rPr>
+          <w:b/>
+          <w:bCs/>
+        </w:rPr>
+        <w:t xml:space="preserve">Thêm vai trò</w:t>
+      </w:r>
+      <w:r>
+        <w:t xml:space="preserve"> (chọn vai trò rồi bấm </w:t>
+      </w:r>
+      <w:r>
+        <w:rPr>
+          <w:b/>
+          <w:bCs/>
+        </w:rPr>
+        <w:t xml:space="preserve">Thêm</w:t>
+      </w:r>
+      <w:r>
+        <w:t xml:space="preserve">), và </w:t>
+      </w:r>
+      <w:r>
+        <w:rPr>
+          <w:b/>
+          <w:bCs/>
+        </w:rPr>
+        <w:t xml:space="preserve">Quyền hiện có</w:t>
+      </w:r>
+      <w:r>
+        <w:t xml:space="preserve">: mọi quyền người đó đang có, gộp từ các vai trò, ghi rõ mỗi quyền đến từ vai trò nào.</w:t>
       </w:r>
     </w:p>
     <w:p>
@@ -6075,17 +6483,80 @@
         <w:spacing w:after="80" w:line="290"/>
       </w:pPr>
       <w:r>
-        <w:t xml:space="preserve">Mọi thay đổi được ghi vào </w:t>
-      </w:r>
-      <w:r>
-        <w:rPr>
-          <w:b/>
-          <w:bCs/>
-        </w:rPr>
-        <w:t xml:space="preserve">Nhật ký thay đổi</w:t>
-      </w:r>
-      <w:r>
-        <w:t xml:space="preserve"> ở cuối trang.</w:t>
+        <w:t xml:space="preserve">Mọi thay đổi được ghi vào tab </w:t>
+      </w:r>
+      <w:r>
+        <w:rPr>
+          <w:b/>
+          <w:bCs/>
+        </w:rPr>
+        <w:t xml:space="preserve">Nhật ký</w:t>
+      </w:r>
+      <w:r>
+        <w:t xml:space="preserve"> (thời gian, thao tác, người thực hiện).</w:t>
+      </w:r>
+    </w:p>
+    <w:p>
+      <w:pPr>
+        <w:keepNext/>
+        <w:spacing w:after="60" w:before="120"/>
+        <w:jc w:val="center"/>
+      </w:pPr>
+      <w:r>
+        <w:drawing>
+          <wp:inline distT="0" distB="0" distL="0" distR="0">
+            <wp:extent cx="5715000" cy="4911328"/>
+            <wp:effectExtent t="0" r="0" b="0" l="0"/>
+            <wp:docPr id="201" name="fig21b" descr="Trang chủ và thanh điều hướng." title="Hình 1"/>
+            <wp:cNvGraphicFramePr>
+              <a:graphicFrameLocks xmlns:a="http://schemas.openxmlformats.org/drawingml/2006/main" noChangeAspect="1"/>
+            </wp:cNvGraphicFramePr>
+            <a:graphic xmlns:a="http://schemas.openxmlformats.org/drawingml/2006/main">
+              <a:graphicData uri="http://schemas.openxmlformats.org/drawingml/2006/picture">
+                <pic:pic xmlns:pic="http://schemas.openxmlformats.org/drawingml/2006/picture">
+                  <pic:nvPicPr>
+                    <pic:cNvPr id="0" name="" descr=""/>
+                    <pic:cNvPicPr>
+                      <a:picLocks noChangeAspect="1" noChangeArrowheads="1"/>
+                    </pic:cNvPicPr>
+                  </pic:nvPicPr>
+                  <pic:blipFill>
+                    <a:blip r:embed="rId40" cstate="none"/>
+                    <a:srcRect/>
+                    <a:stretch>
+                      <a:fillRect/>
+                    </a:stretch>
+                  </pic:blipFill>
+                  <pic:spPr bwMode="auto">
+                    <a:xfrm>
+                      <a:off x="0" y="0"/>
+                      <a:ext cx="5715000" cy="4911328"/>
+                    </a:xfrm>
+                    <a:prstGeom prst="rect">
+                      <a:avLst/>
+                    </a:prstGeom>
+                  </pic:spPr>
+                </pic:pic>
+              </a:graphicData>
+            </a:graphic>
+          </wp:inline>
+        </w:drawing>
+      </w:r>
+    </w:p>
+    <w:p>
+      <w:pPr>
+        <w:spacing w:after="240"/>
+        <w:jc w:val="center"/>
+      </w:pPr>
+      <w:r>
+        <w:rPr>
+          <w:i/>
+          <w:iCs/>
+          <w:color w:val="6E6E73"/>
+          <w:sz w:val="18"/>
+          <w:szCs w:val="18"/>
+        </w:rPr>
+        <w:t xml:space="preserve">Hình 21b. Tab Người dùng với khung chi tiết: vai trò hiện có, thêm vai trò và Quyền hiện có (dữ liệu DEMO).</w:t>
       </w:r>
     </w:p>
     <w:tbl>
@@ -6185,7 +6656,14 @@
           </w:tcPr>
           <w:p>
             <w:r>
-              <w:t xml:space="preserve">facts.propose</w:t>
+              <w:rPr>
+                <w:b/>
+                <w:bCs/>
+              </w:rPr>
+              <w:t xml:space="preserve">Đề xuất thông tin</w:t>
+            </w:r>
+            <w:r>
+              <w:t xml:space="preserve"> (facts.propose)</w:t>
             </w:r>
           </w:p>
         </w:tc>
@@ -6234,7 +6712,14 @@
           </w:tcPr>
           <w:p>
             <w:r>
-              <w:t xml:space="preserve">facts.review</w:t>
+              <w:rPr>
+                <w:b/>
+                <w:bCs/>
+              </w:rPr>
+              <w:t xml:space="preserve">Duyệt đề xuất</w:t>
+            </w:r>
+            <w:r>
+              <w:t xml:space="preserve"> (facts.review)</w:t>
             </w:r>
           </w:p>
         </w:tc>
@@ -6283,7 +6768,14 @@
           </w:tcPr>
           <w:p>
             <w:r>
-              <w:t xml:space="preserve">documents.ingest</w:t>
+              <w:rPr>
+                <w:b/>
+                <w:bCs/>
+              </w:rPr>
+              <w:t xml:space="preserve">Nhập tài liệu</w:t>
+            </w:r>
+            <w:r>
+              <w:t xml:space="preserve"> (documents.ingest)</w:t>
             </w:r>
           </w:p>
         </w:tc>
@@ -6332,7 +6824,14 @@
           </w:tcPr>
           <w:p>
             <w:r>
-              <w:t xml:space="preserve">sources.manage</w:t>
+              <w:rPr>
+                <w:b/>
+                <w:bCs/>
+              </w:rPr>
+              <w:t xml:space="preserve">Quản lý nguồn</w:t>
+            </w:r>
+            <w:r>
+              <w:t xml:space="preserve"> (sources.manage)</w:t>
             </w:r>
           </w:p>
         </w:tc>
@@ -6381,7 +6880,14 @@
           </w:tcPr>
           <w:p>
             <w:r>
-              <w:t xml:space="preserve">education.manage</w:t>
+              <w:rPr>
+                <w:b/>
+                <w:bCs/>
+              </w:rPr>
+              <w:t xml:space="preserve">Đề xuất trường &amp; chương trình</w:t>
+            </w:r>
+            <w:r>
+              <w:t xml:space="preserve"> (education.manage)</w:t>
             </w:r>
           </w:p>
         </w:tc>
@@ -6430,7 +6936,14 @@
           </w:tcPr>
           <w:p>
             <w:r>
-              <w:t xml:space="preserve">immigration.manage</w:t>
+              <w:rPr>
+                <w:b/>
+                <w:bCs/>
+              </w:rPr>
+              <w:t xml:space="preserve">Đề xuất quy định nhập cư</w:t>
+            </w:r>
+            <w:r>
+              <w:t xml:space="preserve"> (immigration.manage)</w:t>
             </w:r>
           </w:p>
         </w:tc>
@@ -6479,7 +6992,14 @@
           </w:tcPr>
           <w:p>
             <w:r>
-              <w:t xml:space="preserve">labour.manage</w:t>
+              <w:rPr>
+                <w:b/>
+                <w:bCs/>
+              </w:rPr>
+              <w:t xml:space="preserve">Đề xuất nghề</w:t>
+            </w:r>
+            <w:r>
+              <w:t xml:space="preserve"> (labour.manage)</w:t>
             </w:r>
           </w:p>
         </w:tc>
@@ -6528,7 +7048,14 @@
           </w:tcPr>
           <w:p>
             <w:r>
-              <w:t xml:space="preserve">metrics.manage</w:t>
+              <w:rPr>
+                <w:b/>
+                <w:bCs/>
+              </w:rPr>
+              <w:t xml:space="preserve">Quản lý chỉ số so sánh</w:t>
+            </w:r>
+            <w:r>
+              <w:t xml:space="preserve"> (metrics.manage)</w:t>
             </w:r>
           </w:p>
         </w:tc>
@@ -6577,7 +7104,14 @@
           </w:tcPr>
           <w:p>
             <w:r>
-              <w:t xml:space="preserve">crawler.manage</w:t>
+              <w:rPr>
+                <w:b/>
+                <w:bCs/>
+              </w:rPr>
+              <w:t xml:space="preserve">Quản lý crawler</w:t>
+            </w:r>
+            <w:r>
+              <w:t xml:space="preserve"> (crawler.manage)</w:t>
             </w:r>
           </w:p>
         </w:tc>
@@ -6626,7 +7160,24 @@
           </w:tcPr>
           <w:p>
             <w:r>
-              <w:t xml:space="preserve">roles.manage / users.assign_roles</w:t>
+              <w:rPr>
+                <w:b/>
+                <w:bCs/>
+              </w:rPr>
+              <w:t xml:space="preserve">Quản lý vai trò</w:t>
+            </w:r>
+            <w:r>
+              <w:t xml:space="preserve"> (roles.manage) / </w:t>
+            </w:r>
+            <w:r>
+              <w:rPr>
+                <w:b/>
+                <w:bCs/>
+              </w:rPr>
+              <w:t xml:space="preserve">Gán vai trò cho người dùng</w:t>
+            </w:r>
+            <w:r>
+              <w:t xml:space="preserve"> (users.assign_roles)</w:t>
             </w:r>
           </w:p>
         </w:tc>
@@ -6698,17 +7249,17 @@
         <w:spacing w:after="80" w:line="290"/>
       </w:pPr>
       <w:r>
-        <w:t xml:space="preserve">Vào </w:t>
-      </w:r>
-      <w:r>
-        <w:rPr>
-          <w:b/>
-          <w:bCs/>
-        </w:rPr>
-        <w:t xml:space="preserve">Dashboard → Quản lý Source Registry</w:t>
-      </w:r>
-      <w:r>
-        <w:t xml:space="preserve">. Trang mở sẵn tab </w:t>
+        <w:t xml:space="preserve">Bấm </w:t>
+      </w:r>
+      <w:r>
+        <w:rPr>
+          <w:b/>
+          <w:bCs/>
+        </w:rPr>
+        <w:t xml:space="preserve">Biên tập → Quản lý nguồn</w:t>
+      </w:r>
+      <w:r>
+        <w:t xml:space="preserve">. Trang chia đôi: bên trái là danh sách nguồn (mở sẵn tab </w:t>
       </w:r>
       <w:r>
         <w:rPr>
@@ -6718,6 +7269,89 @@
         <w:t xml:space="preserve">Cần xác minh</w:t>
       </w:r>
       <w:r>
+        <w:t xml:space="preserve">; các tab khác: </w:t>
+      </w:r>
+      <w:r>
+        <w:rPr>
+          <w:b/>
+          <w:bCs/>
+        </w:rPr>
+        <w:t xml:space="preserve">Cần xem lại</w:t>
+      </w:r>
+      <w:r>
+        <w:t xml:space="preserve">, </w:t>
+      </w:r>
+      <w:r>
+        <w:rPr>
+          <w:b/>
+          <w:bCs/>
+        </w:rPr>
+        <w:t xml:space="preserve">Đã xác minh</w:t>
+      </w:r>
+      <w:r>
+        <w:t xml:space="preserve">, </w:t>
+      </w:r>
+      <w:r>
+        <w:rPr>
+          <w:b/>
+          <w:bCs/>
+        </w:rPr>
+        <w:t xml:space="preserve">Tất cả</w:t>
+      </w:r>
+      <w:r>
+        <w:t xml:space="preserve">), bên phải là nguồn đang chọn.</w:t>
+      </w:r>
+    </w:p>
+    <w:p>
+      <w:pPr>
+        <w:pStyle w:val="ListParagraph"/>
+        <w:numPr>
+          <w:ilvl w:val="0"/>
+          <w:numId w:val="19"/>
+        </w:numPr>
+        <w:spacing w:after="80" w:line="290"/>
+      </w:pPr>
+      <w:r>
+        <w:t xml:space="preserve">Để thêm nguồn: bấm </w:t>
+      </w:r>
+      <w:r>
+        <w:rPr>
+          <w:b/>
+          <w:bCs/>
+        </w:rPr>
+        <w:t xml:space="preserve">Thêm nguồn mới</w:t>
+      </w:r>
+      <w:r>
+        <w:t xml:space="preserve">, điền nhóm </w:t>
+      </w:r>
+      <w:r>
+        <w:rPr>
+          <w:b/>
+          <w:bCs/>
+        </w:rPr>
+        <w:t xml:space="preserve">Thông tin nguồn</w:t>
+      </w:r>
+      <w:r>
+        <w:t xml:space="preserve"> (tên, URL gốc, quốc gia, loại nguồn, ngôn ngữ, chủ đề) và nhóm </w:t>
+      </w:r>
+      <w:r>
+        <w:rPr>
+          <w:b/>
+          <w:bCs/>
+        </w:rPr>
+        <w:t xml:space="preserve">Phân loại và xác minh</w:t>
+      </w:r>
+      <w:r>
+        <w:t xml:space="preserve"> (tier); bấm </w:t>
+      </w:r>
+      <w:r>
+        <w:rPr>
+          <w:b/>
+          <w:bCs/>
+        </w:rPr>
+        <w:t xml:space="preserve">Tạo nguồn</w:t>
+      </w:r>
+      <w:r>
         <w:t xml:space="preserve">.</w:t>
       </w:r>
     </w:p>
@@ -6731,24 +7365,87 @@
         <w:spacing w:after="80" w:line="290"/>
       </w:pPr>
       <w:r>
-        <w:t xml:space="preserve">Để thêm nguồn: bấm </w:t>
-      </w:r>
-      <w:r>
-        <w:rPr>
-          <w:b/>
-          <w:bCs/>
-        </w:rPr>
-        <w:t xml:space="preserve">Thêm nguồn mới</w:t>
-      </w:r>
-      <w:r>
-        <w:t xml:space="preserve">, nhập tên, canonical URL, quốc gia, tier, loại nguồn, ngôn ngữ, chủ đề; bấm </w:t>
-      </w:r>
-      <w:r>
-        <w:rPr>
-          <w:b/>
-          <w:bCs/>
-        </w:rPr>
-        <w:t xml:space="preserve">Tạo nguồn</w:t>
+        <w:t xml:space="preserve">Để xác minh một nguồn: bấm nguồn trong danh sách, tự đối chiếu thẩm quyền của nguồn, ghi cách bạn xác minh vào </w:t>
+      </w:r>
+      <w:r>
+        <w:rPr>
+          <w:b/>
+          <w:bCs/>
+        </w:rPr>
+        <w:t xml:space="preserve">Căn cứ xác minh (authority notes)</w:t>
+      </w:r>
+      <w:r>
+        <w:t xml:space="preserve">, chọn </w:t>
+      </w:r>
+      <w:r>
+        <w:rPr>
+          <w:b/>
+          <w:bCs/>
+        </w:rPr>
+        <w:t xml:space="preserve">Trạng thái xác minh</w:t>
+      </w:r>
+      <w:r>
+        <w:t xml:space="preserve"> là </w:t>
+      </w:r>
+      <w:r>
+        <w:rPr>
+          <w:b/>
+          <w:bCs/>
+        </w:rPr>
+        <w:t xml:space="preserve">Đã xác minh</w:t>
+      </w:r>
+      <w:r>
+        <w:t xml:space="preserve"> rồi bấm </w:t>
+      </w:r>
+      <w:r>
+        <w:rPr>
+          <w:b/>
+          <w:bCs/>
+        </w:rPr>
+        <w:t xml:space="preserve">Lưu thay đổi</w:t>
+      </w:r>
+      <w:r>
+        <w:t xml:space="preserve"> (nút luôn nằm ở đáy màn hình).</w:t>
+      </w:r>
+    </w:p>
+    <w:p>
+      <w:pPr>
+        <w:pStyle w:val="ListParagraph"/>
+        <w:numPr>
+          <w:ilvl w:val="0"/>
+          <w:numId w:val="19"/>
+        </w:numPr>
+        <w:spacing w:after="80" w:line="290"/>
+      </w:pPr>
+      <w:r>
+        <w:t xml:space="preserve">Chưa chắc chọn tier nào? Ngay dưới ô </w:t>
+      </w:r>
+      <w:r>
+        <w:rPr>
+          <w:b/>
+          <w:bCs/>
+        </w:rPr>
+        <w:t xml:space="preserve">Tier</w:t>
+      </w:r>
+      <w:r>
+        <w:t xml:space="preserve"> có giải thích ngắn cho từng mức T1–T4. Nếu vẫn chưa chắc, để </w:t>
+      </w:r>
+      <w:r>
+        <w:rPr>
+          <w:b/>
+          <w:bCs/>
+        </w:rPr>
+        <w:t xml:space="preserve">Chưa phân loại</w:t>
+      </w:r>
+      <w:r>
+        <w:t xml:space="preserve"> và </w:t>
+      </w:r>
+      <w:r>
+        <w:rPr>
+          <w:b/>
+          <w:bCs/>
+        </w:rPr>
+        <w:t xml:space="preserve">Chưa xác minh</w:t>
       </w:r>
       <w:r>
         <w:t xml:space="preserve">.</w:t>
@@ -6764,47 +7461,17 @@
         <w:spacing w:after="80" w:line="290"/>
       </w:pPr>
       <w:r>
-        <w:t xml:space="preserve">Để xác minh một nguồn: mở </w:t>
-      </w:r>
-      <w:r>
-        <w:rPr>
-          <w:b/>
-          <w:bCs/>
-        </w:rPr>
-        <w:t xml:space="preserve">Chỉnh sửa</w:t>
-      </w:r>
-      <w:r>
-        <w:t xml:space="preserve"> ở hàng của nguồn, tự đối chiếu thẩm quyền của nguồn, ghi rõ cách bạn xác minh vào </w:t>
-      </w:r>
-      <w:r>
-        <w:rPr>
-          <w:b/>
-          <w:bCs/>
-        </w:rPr>
-        <w:t xml:space="preserve">Authority notes</w:t>
-      </w:r>
-      <w:r>
-        <w:t xml:space="preserve">, chọn trạng thái </w:t>
-      </w:r>
-      <w:r>
-        <w:rPr>
-          <w:b/>
-          <w:bCs/>
-        </w:rPr>
-        <w:t xml:space="preserve">Đã xác minh</w:t>
-      </w:r>
-      <w:r>
-        <w:t xml:space="preserve"> rồi bấm </w:t>
-      </w:r>
-      <w:r>
-        <w:rPr>
-          <w:b/>
-          <w:bCs/>
-        </w:rPr>
-        <w:t xml:space="preserve">Lưu thay đổi</w:t>
-      </w:r>
-      <w:r>
-        <w:t xml:space="preserve">.</w:t>
+        <w:t xml:space="preserve">Khi xác minh lại một nguồn đã xác minh, tick </w:t>
+      </w:r>
+      <w:r>
+        <w:rPr>
+          <w:b/>
+          <w:bCs/>
+        </w:rPr>
+        <w:t xml:space="preserve">Tôi vừa xác minh lại nguồn này hôm nay</w:t>
+      </w:r>
+      <w:r>
+        <w:t xml:space="preserve"> để cập nhật ngày xác minh. Ô này bắt buộc khi đổi URL hoặc tier.</w:t>
       </w:r>
     </w:p>
     <w:p>
@@ -6817,60 +7484,90 @@
         <w:spacing w:after="80" w:line="290"/>
       </w:pPr>
       <w:r>
-        <w:t xml:space="preserve">Khi đã xác minh lại một nguồn đang verified, tick </w:t>
-      </w:r>
-      <w:r>
-        <w:rPr>
-          <w:b/>
-          <w:bCs/>
-        </w:rPr>
-        <w:t xml:space="preserve">Tôi vừa xác minh lại nguồn này hôm nay</w:t>
-      </w:r>
-      <w:r>
-        <w:t xml:space="preserve"> để cập nhật ngày xác minh. Ô này bắt buộc khi đổi URL hoặc tier.</w:t>
-      </w:r>
-    </w:p>
-    <w:p>
-      <w:pPr>
-        <w:pStyle w:val="ListParagraph"/>
-        <w:numPr>
-          <w:ilvl w:val="0"/>
-          <w:numId w:val="19"/>
-        </w:numPr>
-        <w:spacing w:after="80" w:line="290"/>
-      </w:pPr>
-      <w:r>
-        <w:t xml:space="preserve">Chỉ bật crawl khi crawl policy là </w:t>
-      </w:r>
-      <w:r>
-        <w:rPr>
-          <w:b/>
-          <w:bCs/>
-        </w:rPr>
-        <w:t xml:space="preserve">approved</w:t>
-      </w:r>
-      <w:r>
-        <w:t xml:space="preserve"> và trạng thái là </w:t>
-      </w:r>
-      <w:r>
-        <w:rPr>
-          <w:b/>
-          <w:bCs/>
-        </w:rPr>
-        <w:t xml:space="preserve">verified</w:t>
-      </w:r>
-      <w:r>
-        <w:t xml:space="preserve">. Bật crawl chưa đủ: cần đăng ký URL cụ thể ở trang </w:t>
-      </w:r>
-      <w:r>
-        <w:rPr>
-          <w:b/>
-          <w:bCs/>
-        </w:rPr>
-        <w:t xml:space="preserve">Crawler</w:t>
-      </w:r>
-      <w:r>
-        <w:t xml:space="preserve"> (mục 5.9).</w:t>
+        <w:t xml:space="preserve">Nhóm </w:t>
+      </w:r>
+      <w:r>
+        <w:rPr>
+          <w:b/>
+          <w:bCs/>
+        </w:rPr>
+        <w:t xml:space="preserve">Crawl</w:t>
+      </w:r>
+      <w:r>
+        <w:t xml:space="preserve">: chỉ bật crawl khi </w:t>
+      </w:r>
+      <w:r>
+        <w:rPr>
+          <w:b/>
+          <w:bCs/>
+        </w:rPr>
+        <w:t xml:space="preserve">Chính sách crawl</w:t>
+      </w:r>
+      <w:r>
+        <w:t xml:space="preserve"> là “Được phép crawl” và nguồn đã xác minh. Bật crawl chưa đủ: cần đăng ký URL cụ thể ở trang Crawler (mục 5.9).</w:t>
+      </w:r>
+    </w:p>
+    <w:p>
+      <w:pPr>
+        <w:keepNext/>
+        <w:spacing w:after="60" w:before="120"/>
+        <w:jc w:val="center"/>
+      </w:pPr>
+      <w:r>
+        <w:drawing>
+          <wp:inline distT="0" distB="0" distL="0" distR="0">
+            <wp:extent cx="5296072" cy="8229600"/>
+            <wp:effectExtent t="0" r="0" b="0" l="0"/>
+            <wp:docPr id="202" name="fig21c" descr="Trang chủ và thanh điều hướng." title="Hình 1"/>
+            <wp:cNvGraphicFramePr>
+              <a:graphicFrameLocks xmlns:a="http://schemas.openxmlformats.org/drawingml/2006/main" noChangeAspect="1"/>
+            </wp:cNvGraphicFramePr>
+            <a:graphic xmlns:a="http://schemas.openxmlformats.org/drawingml/2006/main">
+              <a:graphicData uri="http://schemas.openxmlformats.org/drawingml/2006/picture">
+                <pic:pic xmlns:pic="http://schemas.openxmlformats.org/drawingml/2006/picture">
+                  <pic:nvPicPr>
+                    <pic:cNvPr id="0" name="" descr=""/>
+                    <pic:cNvPicPr>
+                      <a:picLocks noChangeAspect="1" noChangeArrowheads="1"/>
+                    </pic:cNvPicPr>
+                  </pic:nvPicPr>
+                  <pic:blipFill>
+                    <a:blip r:embed="rId41" cstate="none"/>
+                    <a:srcRect/>
+                    <a:stretch>
+                      <a:fillRect/>
+                    </a:stretch>
+                  </pic:blipFill>
+                  <pic:spPr bwMode="auto">
+                    <a:xfrm>
+                      <a:off x="0" y="0"/>
+                      <a:ext cx="5296072" cy="8229600"/>
+                    </a:xfrm>
+                    <a:prstGeom prst="rect">
+                      <a:avLst/>
+                    </a:prstGeom>
+                  </pic:spPr>
+                </pic:pic>
+              </a:graphicData>
+            </a:graphic>
+          </wp:inline>
+        </w:drawing>
+      </w:r>
+    </w:p>
+    <w:p>
+      <w:pPr>
+        <w:spacing w:after="240"/>
+        <w:jc w:val="center"/>
+      </w:pPr>
+      <w:r>
+        <w:rPr>
+          <w:i/>
+          <w:iCs/>
+          <w:color w:val="6E6E73"/>
+          <w:sz w:val="18"/>
+          <w:szCs w:val="18"/>
+        </w:rPr>
+        <w:t xml:space="preserve">Hình 21c. Quản lý nguồn: danh sách bên trái, form chia nhóm bên phải với giải thích tier (dữ liệu DEMO).</w:t>
       </w:r>
     </w:p>
     <w:p>
@@ -6947,14 +7644,14 @@
         <w:spacing w:after="80" w:line="290"/>
       </w:pPr>
       <w:r>
-        <w:t xml:space="preserve">Vào </w:t>
-      </w:r>
-      <w:r>
-        <w:rPr>
-          <w:b/>
-          <w:bCs/>
-        </w:rPr>
-        <w:t xml:space="preserve">Dashboard → Nhập tài liệu</w:t>
+        <w:t xml:space="preserve">Bấm </w:t>
+      </w:r>
+      <w:r>
+        <w:rPr>
+          <w:b/>
+          <w:bCs/>
+        </w:rPr>
+        <w:t xml:space="preserve">Biên tập → Nhập tài liệu</w:t>
       </w:r>
       <w:r>
         <w:t xml:space="preserve">.</w:t>
@@ -7067,14 +7764,14 @@
         <w:spacing w:after="80" w:line="290"/>
       </w:pPr>
       <w:r>
-        <w:t xml:space="preserve">Vào </w:t>
-      </w:r>
-      <w:r>
-        <w:rPr>
-          <w:b/>
-          <w:bCs/>
-        </w:rPr>
-        <w:t xml:space="preserve">Dashboard → Thông tin &amp; bằng chứng</w:t>
+        <w:t xml:space="preserve">Bấm </w:t>
+      </w:r>
+      <w:r>
+        <w:rPr>
+          <w:b/>
+          <w:bCs/>
+        </w:rPr>
+        <w:t xml:space="preserve">Biên tập → Thông tin &amp; bằng chứng</w:t>
       </w:r>
       <w:r>
         <w:t xml:space="preserve">, hoặc từ trang một tài liệu bấm </w:t>
@@ -7252,7 +7949,7 @@
         <w:t xml:space="preserve">Chờ duyệt</w:t>
       </w:r>
       <w:r>
-        <w:t xml:space="preserve">. Bằng chứng và khung </w:t>
+        <w:t xml:space="preserve">. Trang chia đôi: bên trái là danh sách gọn (cuộn riêng), bên phải là mục đang chọn với bằng chứng và khung </w:t>
       </w:r>
       <w:r>
         <w:rPr>
@@ -7262,7 +7959,7 @@
         <w:t xml:space="preserve">Quyết định của bạn</w:t>
       </w:r>
       <w:r>
-        <w:t xml:space="preserve"> đã mở sẵn dưới mỗi mục. Mở trang gốc, kiểm tra theo danh sách trong khung, điền </w:t>
+        <w:t xml:space="preserve">. Mở trang gốc, kiểm tra theo danh sách trong khung, điền </w:t>
       </w:r>
       <w:r>
         <w:rPr>
@@ -7306,6 +8003,39 @@
       </w:pPr>
       <w:r>
         <w:t xml:space="preserve">Không có lựa chọn nào được chọn sẵn: bạn phải bấm đúng một trong hai nút. Quyết định được lưu vào lịch sử và không sửa được; nếu nhầm, tạo đề xuất mới.</w:t>
+      </w:r>
+    </w:p>
+    <w:p>
+      <w:pPr>
+        <w:pStyle w:val="ListParagraph"/>
+        <w:numPr>
+          <w:ilvl w:val="0"/>
+          <w:numId w:val="21"/>
+        </w:numPr>
+        <w:spacing w:after="80" w:line="290"/>
+      </w:pPr>
+      <w:r>
+        <w:t xml:space="preserve">Chuyển sang mục khác bằng cách bấm vào danh sách, hoặc dùng </w:t>
+      </w:r>
+      <w:r>
+        <w:rPr>
+          <w:b/>
+          <w:bCs/>
+        </w:rPr>
+        <w:t xml:space="preserve">‹ Trước</w:t>
+      </w:r>
+      <w:r>
+        <w:t xml:space="preserve"> / </w:t>
+      </w:r>
+      <w:r>
+        <w:rPr>
+          <w:b/>
+          <w:bCs/>
+        </w:rPr>
+        <w:t xml:space="preserve">Sau ›</w:t>
+      </w:r>
+      <w:r>
+        <w:t xml:space="preserve"> ở đầu khung bên phải.</w:t>
       </w:r>
     </w:p>
     <w:p>
@@ -7317,7 +8047,7 @@
       <w:r>
         <w:drawing>
           <wp:inline distT="0" distB="0" distL="0" distR="0">
-            <wp:extent cx="5222552" cy="8229600"/>
+            <wp:extent cx="5266944" cy="8229600"/>
             <wp:effectExtent t="0" r="0" b="0" l="0"/>
             <wp:docPr id="1" name="fig22" descr="Minh họa danh sách trong workspace với tab trạng thái và phần duyệt (dữ liệu DEMO)." title="Hình 22"/>
             <wp:cNvGraphicFramePr>
@@ -7342,7 +8072,7 @@
                   <pic:spPr bwMode="auto">
                     <a:xfrm>
                       <a:off x="0" y="0"/>
-                      <a:ext cx="5222552" cy="8229600"/>
+                      <a:ext cx="5266944" cy="8229600"/>
                     </a:xfrm>
                     <a:prstGeom prst="rect">
                       <a:avLst/>
@@ -7368,7 +8098,7 @@
           <w:sz w:val="18"/>
           <w:szCs w:val="18"/>
         </w:rPr>
-        <w:t xml:space="preserve">Hình 22. Thanh Quy trình duyệt và tab Chờ duyệt: bằng chứng và khung quyết định mở sẵn; mục thứ hai được báo trước là sẽ chưa công khai (dữ liệu DEMO).</w:t>
+        <w:t xml:space="preserve">Hình 22. Trang duyệt chia đôi: danh sách bên trái; bên phải là mục đang chọn, khung “Các thông tin khác từ cùng trang này” và khung quyết định (dữ liệu DEMO).</w:t>
       </w:r>
     </w:p>
     <w:p>
@@ -7400,6 +8130,32 @@
       </w:r>
       <w:r>
         <w:t xml:space="preserve"> nằm cạnh tab Chờ duyệt: đó là hàng chờ các thông tin đã công bố có trang nguồn vừa thay đổi (mục 5.10). Đề xuất do AI tạo nằm chung tab Chờ duyệt, có nhãn “Đề xuất bởi AI” (mục 5.11).</w:t>
+      </w:r>
+    </w:p>
+    <w:p>
+      <w:pPr>
+        <w:pStyle w:val="Heading3"/>
+      </w:pPr>
+      <w:r>
+        <w:t xml:space="preserve">Các thông tin khác từ cùng trang này</w:t>
+      </w:r>
+    </w:p>
+    <w:p>
+      <w:pPr>
+        <w:spacing w:after="120" w:line="300"/>
+      </w:pPr>
+      <w:r>
+        <w:t xml:space="preserve">Một trang nguồn thường chứng minh nhiều điều khác nhau (ví dụ lệ phí, thời gian xử lý, mức tài chính). Khung này liệt kê các đề xuất và thông tin khác lấy từ cùng tài liệu, kèm trạng thái, và gắn nhãn </w:t>
+      </w:r>
+      <w:r>
+        <w:rPr>
+          <w:b/>
+          <w:bCs/>
+        </w:rPr>
+        <w:t xml:space="preserve">Có thể trùng</w:t>
+      </w:r>
+      <w:r>
+        <w:t xml:space="preserve"> khi cùng đối tượng và thuộc tính. Hãy so sánh trước khi từ chối vì “trùng”: hai mục cùng trang nhưng khác giá trị thường là hai thông tin khác nhau.</w:t>
       </w:r>
     </w:p>
     <w:p>
@@ -7746,14 +8502,14 @@
         <w:spacing w:after="80" w:line="290"/>
       </w:pPr>
       <w:r>
-        <w:t xml:space="preserve">Vào </w:t>
-      </w:r>
-      <w:r>
-        <w:rPr>
-          <w:b/>
-          <w:bCs/>
-        </w:rPr>
-        <w:t xml:space="preserve">Dashboard → Trường &amp; chương trình</w:t>
+        <w:t xml:space="preserve">Bấm </w:t>
+      </w:r>
+      <w:r>
+        <w:rPr>
+          <w:b/>
+          <w:bCs/>
+        </w:rPr>
+        <w:t xml:space="preserve">Biên tập → Trường &amp; chương trình</w:t>
       </w:r>
       <w:r>
         <w:t xml:space="preserve">.</w:t>
@@ -7899,14 +8655,14 @@
         <w:spacing w:after="80" w:line="290"/>
       </w:pPr>
       <w:r>
-        <w:t xml:space="preserve">Vào </w:t>
-      </w:r>
-      <w:r>
-        <w:rPr>
-          <w:b/>
-          <w:bCs/>
-        </w:rPr>
-        <w:t xml:space="preserve">Dashboard → Quy định nhập cư</w:t>
+        <w:t xml:space="preserve">Bấm </w:t>
+      </w:r>
+      <w:r>
+        <w:rPr>
+          <w:b/>
+          <w:bCs/>
+        </w:rPr>
+        <w:t xml:space="preserve">Biên tập → Quy định nhập cư</w:t>
       </w:r>
       <w:r>
         <w:t xml:space="preserve">.</w:t>
@@ -8032,14 +8788,14 @@
         <w:spacing w:after="80" w:line="290"/>
       </w:pPr>
       <w:r>
-        <w:t xml:space="preserve">Vào </w:t>
-      </w:r>
-      <w:r>
-        <w:rPr>
-          <w:b/>
-          <w:bCs/>
-        </w:rPr>
-        <w:t xml:space="preserve">Dashboard → Thị trường lao động</w:t>
+        <w:t xml:space="preserve">Bấm </w:t>
+      </w:r>
+      <w:r>
+        <w:rPr>
+          <w:b/>
+          <w:bCs/>
+        </w:rPr>
+        <w:t xml:space="preserve">Biên tập → Thị trường lao động</w:t>
       </w:r>
       <w:r>
         <w:t xml:space="preserve">.</w:t>
@@ -8139,14 +8895,218 @@
         <w:spacing w:after="80" w:line="290"/>
       </w:pPr>
       <w:r>
-        <w:t xml:space="preserve">Vào </w:t>
-      </w:r>
-      <w:r>
-        <w:rPr>
-          <w:b/>
-          <w:bCs/>
-        </w:rPr>
-        <w:t xml:space="preserve">Dashboard → Chỉ số so sánh</w:t>
+        <w:t xml:space="preserve">Bấm </w:t>
+      </w:r>
+      <w:r>
+        <w:rPr>
+          <w:b/>
+          <w:bCs/>
+        </w:rPr>
+        <w:t xml:space="preserve">Biên tập → Chỉ số so sánh</w:t>
+      </w:r>
+      <w:r>
+        <w:t xml:space="preserve">. Các chỉ số hiện thành bảng; bấm tiêu đề cột để sắp xếp.</w:t>
+      </w:r>
+    </w:p>
+    <w:p>
+      <w:pPr>
+        <w:pStyle w:val="ListParagraph"/>
+        <w:numPr>
+          <w:ilvl w:val="0"/>
+          <w:numId w:val="26"/>
+        </w:numPr>
+        <w:spacing w:after="80" w:line="290"/>
+      </w:pPr>
+      <w:r>
+        <w:t xml:space="preserve">Bấm </w:t>
+      </w:r>
+      <w:r>
+        <w:rPr>
+          <w:b/>
+          <w:bCs/>
+        </w:rPr>
+        <w:t xml:space="preserve">Tạo chỉ số mới</w:t>
+      </w:r>
+      <w:r>
+        <w:t xml:space="preserve">: khung bên phải mở ra. Nhập key (chữ thường, số, dấu gạch dưới; ví dụ living_cost_student_month), nhóm, tên hiển thị, đơn vị gợi ý, và định nghĩa đủ rõ để hai người nhập độc lập chọn cùng một con số.</w:t>
+      </w:r>
+    </w:p>
+    <w:p>
+      <w:pPr>
+        <w:pStyle w:val="ListParagraph"/>
+        <w:numPr>
+          <w:ilvl w:val="0"/>
+          <w:numId w:val="26"/>
+        </w:numPr>
+        <w:spacing w:after="80" w:line="290"/>
+      </w:pPr>
+      <w:r>
+        <w:t xml:space="preserve">Bấm </w:t>
+      </w:r>
+      <w:r>
+        <w:rPr>
+          <w:b/>
+          <w:bCs/>
+        </w:rPr>
+        <w:t xml:space="preserve">Tạo chỉ số</w:t>
+      </w:r>
+      <w:r>
+        <w:t xml:space="preserve">. Key và nhóm không đổi được sau khi tạo. Để sửa, bấm hàng của chỉ số rồi chỉnh trong khung bên phải.</w:t>
+      </w:r>
+    </w:p>
+    <w:p>
+      <w:pPr>
+        <w:pStyle w:val="ListParagraph"/>
+        <w:numPr>
+          <w:ilvl w:val="0"/>
+          <w:numId w:val="26"/>
+        </w:numPr>
+        <w:spacing w:after="80" w:line="290"/>
+      </w:pPr>
+      <w:r>
+        <w:t xml:space="preserve">Khi nhập thông tin (mục 5.4), chọn chỉ số ở ô </w:t>
+      </w:r>
+      <w:r>
+        <w:rPr>
+          <w:b/>
+          <w:bCs/>
+        </w:rPr>
+        <w:t xml:space="preserve">Chỉ số so sánh</w:t>
+      </w:r>
+      <w:r>
+        <w:t xml:space="preserve"> và chọn quốc gia; giá trị sẽ xuất hiện trong bảng so sánh sau khi được duyệt.</w:t>
+      </w:r>
+    </w:p>
+    <w:p>
+      <w:pPr>
+        <w:pStyle w:val="ListParagraph"/>
+        <w:numPr>
+          <w:ilvl w:val="0"/>
+          <w:numId w:val="26"/>
+        </w:numPr>
+        <w:spacing w:after="80" w:line="290"/>
+      </w:pPr>
+      <w:r>
+        <w:t xml:space="preserve">Để ngừng dùng một chỉ số, mở chỉ số đó và bỏ chọn </w:t>
+      </w:r>
+      <w:r>
+        <w:rPr>
+          <w:b/>
+          <w:bCs/>
+        </w:rPr>
+        <w:t xml:space="preserve">Đang dùng</w:t>
+      </w:r>
+      <w:r>
+        <w:t xml:space="preserve">; các giá trị cũ vẫn được giữ.</w:t>
+      </w:r>
+    </w:p>
+    <w:p>
+      <w:pPr>
+        <w:pStyle w:val="Heading2"/>
+      </w:pPr>
+      <w:r>
+        <w:t xml:space="preserve">5.9 Crawler: tự động lấy trang nguồn</w:t>
+      </w:r>
+    </w:p>
+    <w:p>
+      <w:pPr>
+        <w:spacing w:after="120" w:line="300"/>
+      </w:pPr>
+      <w:r>
+        <w:t xml:space="preserve">Crawler là chương trình chạy </w:t>
+      </w:r>
+      <w:r>
+        <w:rPr>
+          <w:b/>
+          <w:bCs/>
+        </w:rPr>
+        <w:t xml:space="preserve">mỗi thứ Hai</w:t>
+      </w:r>
+      <w:r>
+        <w:t xml:space="preserve"> (và khi quản trị viên bấm chạy tay) để lấy lại các trang nguồn đã đăng ký. Nếu nội dung trang thay đổi, hệ thống lưu một </w:t>
+      </w:r>
+      <w:r>
+        <w:rPr>
+          <w:b/>
+          <w:bCs/>
+        </w:rPr>
+        <w:t xml:space="preserve">phiên bản tài liệu mới</w:t>
+      </w:r>
+      <w:r>
+        <w:t xml:space="preserve">; nếu không đổi, không tạo gì thêm. Crawler </w:t>
+      </w:r>
+      <w:r>
+        <w:rPr>
+          <w:b/>
+          <w:bCs/>
+        </w:rPr>
+        <w:t xml:space="preserve">chỉ</w:t>
+      </w:r>
+      <w:r>
+        <w:t xml:space="preserve"> lấy các URL được đăng ký, tôn trọng robots.txt của website, mỗi lần một trang và nghỉ vài giây giữa các lần, không tự đi theo link sang trang khác.</w:t>
+      </w:r>
+    </w:p>
+    <w:p>
+      <w:pPr>
+        <w:pStyle w:val="ListParagraph"/>
+        <w:numPr>
+          <w:ilvl w:val="0"/>
+          <w:numId w:val="27"/>
+        </w:numPr>
+        <w:spacing w:after="80" w:line="290"/>
+      </w:pPr>
+      <w:r>
+        <w:t xml:space="preserve">Ở Quản lý nguồn (5.2), đảm bảo nguồn đã xác minh, chính sách crawl là “Được phép crawl”, và đã bật crawl.</w:t>
+      </w:r>
+    </w:p>
+    <w:p>
+      <w:pPr>
+        <w:pStyle w:val="ListParagraph"/>
+        <w:numPr>
+          <w:ilvl w:val="0"/>
+          <w:numId w:val="27"/>
+        </w:numPr>
+        <w:spacing w:after="80" w:line="290"/>
+      </w:pPr>
+      <w:r>
+        <w:t xml:space="preserve">Bấm </w:t>
+      </w:r>
+      <w:r>
+        <w:rPr>
+          <w:b/>
+          <w:bCs/>
+        </w:rPr>
+        <w:t xml:space="preserve">Biên tập → Crawler</w:t>
+      </w:r>
+      <w:r>
+        <w:t xml:space="preserve"> (/admin/crawler). Cần quyền </w:t>
+      </w:r>
+      <w:r>
+        <w:rPr>
+          <w:b/>
+          <w:bCs/>
+        </w:rPr>
+        <w:t xml:space="preserve">Quản lý crawler</w:t>
+      </w:r>
+      <w:r>
+        <w:t xml:space="preserve">. Trang có hai tab dạng bảng: </w:t>
+      </w:r>
+      <w:r>
+        <w:rPr>
+          <w:b/>
+          <w:bCs/>
+        </w:rPr>
+        <w:t xml:space="preserve">URL theo dõi</w:t>
+      </w:r>
+      <w:r>
+        <w:t xml:space="preserve"> và </w:t>
+      </w:r>
+      <w:r>
+        <w:rPr>
+          <w:b/>
+          <w:bCs/>
+        </w:rPr>
+        <w:t xml:space="preserve">Lần chạy</w:t>
       </w:r>
       <w:r>
         <w:t xml:space="preserve">.</w:t>
@@ -8157,7 +9117,7 @@
         <w:pStyle w:val="ListParagraph"/>
         <w:numPr>
           <w:ilvl w:val="0"/>
-          <w:numId w:val="26"/>
+          <w:numId w:val="27"/>
         </w:numPr>
         <w:spacing w:after="80" w:line="290"/>
       </w:pPr>
@@ -8169,62 +9129,108 @@
           <w:b/>
           <w:bCs/>
         </w:rPr>
-        <w:t xml:space="preserve">Tạo chỉ số mới</w:t>
-      </w:r>
-      <w:r>
-        <w:t xml:space="preserve">. Nhập </w:t>
-      </w:r>
-      <w:r>
-        <w:rPr>
-          <w:b/>
-          <w:bCs/>
-        </w:rPr>
-        <w:t xml:space="preserve">key</w:t>
-      </w:r>
-      <w:r>
-        <w:t xml:space="preserve"> (chữ thường, số, dấu gạch dưới; ví dụ living_cost_student_month), </w:t>
-      </w:r>
-      <w:r>
-        <w:rPr>
-          <w:b/>
-          <w:bCs/>
-        </w:rPr>
-        <w:t xml:space="preserve">nhóm</w:t>
-      </w:r>
-      <w:r>
-        <w:t xml:space="preserve">, </w:t>
-      </w:r>
-      <w:r>
-        <w:rPr>
-          <w:b/>
-          <w:bCs/>
-        </w:rPr>
-        <w:t xml:space="preserve">tên hiển thị</w:t>
-      </w:r>
-      <w:r>
-        <w:t xml:space="preserve">, đơn vị gợi ý, và </w:t>
-      </w:r>
-      <w:r>
-        <w:rPr>
-          <w:b/>
-          <w:bCs/>
-        </w:rPr>
-        <w:t xml:space="preserve">định nghĩa</w:t>
-      </w:r>
-      <w:r>
-        <w:t xml:space="preserve"> đủ rõ để hai người nhập độc lập chọn cùng một con số.</w:t>
-      </w:r>
-    </w:p>
-    <w:p>
-      <w:pPr>
-        <w:pStyle w:val="ListParagraph"/>
-        <w:numPr>
-          <w:ilvl w:val="0"/>
-          <w:numId w:val="26"/>
+        <w:t xml:space="preserve">Đăng ký URL mới</w:t>
+      </w:r>
+      <w:r>
+        <w:t xml:space="preserve"> (khung bên phải mở ra), chọn nguồn, dán URL (phải cùng domain với nguồn).</w:t>
+      </w:r>
+    </w:p>
+    <w:p>
+      <w:pPr>
+        <w:pStyle w:val="ListParagraph"/>
+        <w:numPr>
+          <w:ilvl w:val="0"/>
+          <w:numId w:val="27"/>
         </w:numPr>
         <w:spacing w:after="80" w:line="290"/>
       </w:pPr>
       <w:r>
+        <w:t xml:space="preserve">Chọn </w:t>
+      </w:r>
+      <w:r>
+        <w:rPr>
+          <w:b/>
+          <w:bCs/>
+        </w:rPr>
+        <w:t xml:space="preserve">Loại</w:t>
+      </w:r>
+      <w:r>
+        <w:t xml:space="preserve">: </w:t>
+      </w:r>
+      <w:r>
+        <w:rPr>
+          <w:b/>
+          <w:bCs/>
+        </w:rPr>
+        <w:t xml:space="preserve">Trang</w:t>
+      </w:r>
+      <w:r>
+        <w:t xml:space="preserve"> (lấy đúng URL đó) hoặc </w:t>
+      </w:r>
+      <w:r>
+        <w:rPr>
+          <w:b/>
+          <w:bCs/>
+        </w:rPr>
+        <w:t xml:space="preserve">Sitemap</w:t>
+      </w:r>
+      <w:r>
+        <w:t xml:space="preserve"> (lấy danh sách trang trong sitemap của website, lọc theo </w:t>
+      </w:r>
+      <w:r>
+        <w:rPr>
+          <w:b/>
+          <w:bCs/>
+        </w:rPr>
+        <w:t xml:space="preserve">Tiền tố đường dẫn</w:t>
+      </w:r>
+      <w:r>
+        <w:t xml:space="preserve">, tối đa </w:t>
+      </w:r>
+      <w:r>
+        <w:rPr>
+          <w:b/>
+          <w:bCs/>
+        </w:rPr>
+        <w:t xml:space="preserve">Số URL tối đa</w:t>
+      </w:r>
+      <w:r>
+        <w:t xml:space="preserve">).</w:t>
+      </w:r>
+    </w:p>
+    <w:p>
+      <w:pPr>
+        <w:pStyle w:val="ListParagraph"/>
+        <w:numPr>
+          <w:ilvl w:val="0"/>
+          <w:numId w:val="27"/>
+        </w:numPr>
+        <w:spacing w:after="80" w:line="290"/>
+      </w:pPr>
+      <w:r>
+        <w:t xml:space="preserve">Tùy chọn </w:t>
+      </w:r>
+      <w:r>
+        <w:rPr>
+          <w:b/>
+          <w:bCs/>
+        </w:rPr>
+        <w:t xml:space="preserve">CSS selector nội dung chính</w:t>
+      </w:r>
+      <w:r>
+        <w:t xml:space="preserve"> (ví dụ main) để chỉ lấy phần nội dung, bỏ menu và chân trang. Nếu không chắc, để trống.</w:t>
+      </w:r>
+    </w:p>
+    <w:p>
+      <w:pPr>
+        <w:pStyle w:val="ListParagraph"/>
+        <w:numPr>
+          <w:ilvl w:val="0"/>
+          <w:numId w:val="27"/>
+        </w:numPr>
+        <w:spacing w:after="80" w:line="290"/>
+      </w:pPr>
+      <w:r>
         <w:t xml:space="preserve">Bấm </w:t>
       </w:r>
       <w:r>
@@ -8232,436 +9238,33 @@
           <w:b/>
           <w:bCs/>
         </w:rPr>
-        <w:t xml:space="preserve">Tạo chỉ số</w:t>
-      </w:r>
-      <w:r>
-        <w:t xml:space="preserve">. Key và nhóm không đổi được sau khi tạo.</w:t>
-      </w:r>
-    </w:p>
-    <w:p>
-      <w:pPr>
-        <w:pStyle w:val="ListParagraph"/>
-        <w:numPr>
-          <w:ilvl w:val="0"/>
-          <w:numId w:val="26"/>
+        <w:t xml:space="preserve">Đăng ký URL</w:t>
+      </w:r>
+      <w:r>
+        <w:t xml:space="preserve">. Trong bảng, nếu nguồn còn thiếu điều kiện để crawl, dưới tên nguồn có dòng chữ cam ghi rõ thiếu gì; bấm hàng để xem chi tiết và sửa URL.</w:t>
+      </w:r>
+    </w:p>
+    <w:p>
+      <w:pPr>
+        <w:pStyle w:val="ListParagraph"/>
+        <w:numPr>
+          <w:ilvl w:val="0"/>
+          <w:numId w:val="27"/>
         </w:numPr>
         <w:spacing w:after="80" w:line="290"/>
       </w:pPr>
       <w:r>
-        <w:t xml:space="preserve">Khi nhập thông tin (mục 5.4), chọn chỉ số ở ô </w:t>
-      </w:r>
-      <w:r>
-        <w:rPr>
-          <w:b/>
-          <w:bCs/>
-        </w:rPr>
-        <w:t xml:space="preserve">Chỉ số so sánh</w:t>
-      </w:r>
-      <w:r>
-        <w:t xml:space="preserve"> và chọn quốc gia; giá trị sẽ xuất hiện trong bảng so sánh sau khi được duyệt.</w:t>
-      </w:r>
-    </w:p>
-    <w:p>
-      <w:pPr>
-        <w:pStyle w:val="ListParagraph"/>
-        <w:numPr>
-          <w:ilvl w:val="0"/>
-          <w:numId w:val="26"/>
-        </w:numPr>
-        <w:spacing w:after="80" w:line="290"/>
-      </w:pPr>
-      <w:r>
-        <w:t xml:space="preserve">Để ngừng dùng một chỉ số, bỏ chọn </w:t>
-      </w:r>
-      <w:r>
-        <w:rPr>
-          <w:b/>
-          <w:bCs/>
-        </w:rPr>
-        <w:t xml:space="preserve">Đang dùng</w:t>
-      </w:r>
-      <w:r>
-        <w:t xml:space="preserve">; các giá trị cũ vẫn được giữ.</w:t>
-      </w:r>
-    </w:p>
-    <w:p>
-      <w:pPr>
-        <w:pStyle w:val="Heading2"/>
-      </w:pPr>
-      <w:r>
-        <w:t xml:space="preserve">5.9 Crawler: tự động lấy trang nguồn</w:t>
-      </w:r>
-    </w:p>
-    <w:p>
-      <w:pPr>
-        <w:spacing w:after="120" w:line="300"/>
-      </w:pPr>
-      <w:r>
-        <w:t xml:space="preserve">Crawler là chương trình chạy </w:t>
-      </w:r>
-      <w:r>
-        <w:rPr>
-          <w:b/>
-          <w:bCs/>
-        </w:rPr>
-        <w:t xml:space="preserve">mỗi thứ Hai</w:t>
-      </w:r>
-      <w:r>
-        <w:t xml:space="preserve"> (và khi quản trị viên bấm chạy tay) để lấy lại các trang nguồn đã đăng ký. Nếu nội dung trang thay đổi, hệ thống lưu một </w:t>
-      </w:r>
-      <w:r>
-        <w:rPr>
-          <w:b/>
-          <w:bCs/>
-        </w:rPr>
-        <w:t xml:space="preserve">phiên bản tài liệu mới</w:t>
-      </w:r>
-      <w:r>
-        <w:t xml:space="preserve">; nếu không đổi, không tạo gì thêm. Crawler </w:t>
-      </w:r>
-      <w:r>
-        <w:rPr>
-          <w:b/>
-          <w:bCs/>
-        </w:rPr>
-        <w:t xml:space="preserve">chỉ</w:t>
-      </w:r>
-      <w:r>
-        <w:t xml:space="preserve"> lấy các URL được đăng ký, tôn trọng robots.txt của website, mỗi lần một trang và nghỉ vài giây giữa các lần, không tự đi theo link sang trang khác.</w:t>
-      </w:r>
-    </w:p>
-    <w:p>
-      <w:pPr>
-        <w:pStyle w:val="ListParagraph"/>
-        <w:numPr>
-          <w:ilvl w:val="0"/>
-          <w:numId w:val="27"/>
-        </w:numPr>
-        <w:spacing w:after="80" w:line="290"/>
-      </w:pPr>
-      <w:r>
-        <w:t xml:space="preserve">Ở </w:t>
-      </w:r>
-      <w:r>
-        <w:rPr>
-          <w:b/>
-          <w:bCs/>
-        </w:rPr>
-        <w:t xml:space="preserve">Source Registry</w:t>
-      </w:r>
-      <w:r>
-        <w:t xml:space="preserve"> (5.2), đảm bảo nguồn có trạng thái </w:t>
-      </w:r>
-      <w:r>
-        <w:rPr>
-          <w:b/>
-          <w:bCs/>
-        </w:rPr>
-        <w:t xml:space="preserve">verified</w:t>
-      </w:r>
-      <w:r>
-        <w:t xml:space="preserve">, crawl policy </w:t>
-      </w:r>
-      <w:r>
-        <w:rPr>
-          <w:b/>
-          <w:bCs/>
-        </w:rPr>
-        <w:t xml:space="preserve">approved</w:t>
-      </w:r>
-      <w:r>
-        <w:t xml:space="preserve">, và đã bật </w:t>
-      </w:r>
-      <w:r>
-        <w:rPr>
-          <w:b/>
-          <w:bCs/>
-        </w:rPr>
-        <w:t xml:space="preserve">crawl</w:t>
-      </w:r>
-      <w:r>
-        <w:t xml:space="preserve">.</w:t>
-      </w:r>
-    </w:p>
-    <w:p>
-      <w:pPr>
-        <w:pStyle w:val="ListParagraph"/>
-        <w:numPr>
-          <w:ilvl w:val="0"/>
-          <w:numId w:val="27"/>
-        </w:numPr>
-        <w:spacing w:after="80" w:line="290"/>
-      </w:pPr>
-      <w:r>
-        <w:t xml:space="preserve">Vào </w:t>
-      </w:r>
-      <w:r>
-        <w:rPr>
-          <w:b/>
-          <w:bCs/>
-        </w:rPr>
-        <w:t xml:space="preserve">Dashboard → Crawler</w:t>
-      </w:r>
-      <w:r>
-        <w:t xml:space="preserve"> (/admin/crawler). Cần quyền </w:t>
-      </w:r>
-      <w:r>
-        <w:rPr>
-          <w:b/>
-          <w:bCs/>
-        </w:rPr>
-        <w:t xml:space="preserve">crawler.manage</w:t>
-      </w:r>
-      <w:r>
-        <w:t xml:space="preserve">.</w:t>
-      </w:r>
-    </w:p>
-    <w:p>
-      <w:pPr>
-        <w:pStyle w:val="ListParagraph"/>
-        <w:numPr>
-          <w:ilvl w:val="0"/>
-          <w:numId w:val="27"/>
-        </w:numPr>
-        <w:spacing w:after="80" w:line="290"/>
-      </w:pPr>
-      <w:r>
-        <w:t xml:space="preserve">Mở </w:t>
-      </w:r>
-      <w:r>
-        <w:rPr>
-          <w:b/>
-          <w:bCs/>
-        </w:rPr>
-        <w:t xml:space="preserve">Đăng ký URL mới</w:t>
-      </w:r>
-      <w:r>
-        <w:t xml:space="preserve">, chọn nguồn, dán URL (phải cùng domain với nguồn).</w:t>
-      </w:r>
-    </w:p>
-    <w:p>
-      <w:pPr>
-        <w:pStyle w:val="ListParagraph"/>
-        <w:numPr>
-          <w:ilvl w:val="0"/>
-          <w:numId w:val="27"/>
-        </w:numPr>
-        <w:spacing w:after="80" w:line="290"/>
-      </w:pPr>
-      <w:r>
-        <w:t xml:space="preserve">Chọn </w:t>
-      </w:r>
-      <w:r>
-        <w:rPr>
-          <w:b/>
-          <w:bCs/>
-        </w:rPr>
-        <w:t xml:space="preserve">Loại</w:t>
-      </w:r>
-      <w:r>
-        <w:t xml:space="preserve">: </w:t>
-      </w:r>
-      <w:r>
-        <w:rPr>
-          <w:b/>
-          <w:bCs/>
-        </w:rPr>
-        <w:t xml:space="preserve">Trang</w:t>
-      </w:r>
-      <w:r>
-        <w:t xml:space="preserve"> (lấy đúng URL đó) hoặc </w:t>
-      </w:r>
-      <w:r>
-        <w:rPr>
-          <w:b/>
-          <w:bCs/>
-        </w:rPr>
-        <w:t xml:space="preserve">Sitemap</w:t>
-      </w:r>
-      <w:r>
-        <w:t xml:space="preserve"> (lấy danh sách trang trong sitemap của website, lọc theo </w:t>
-      </w:r>
-      <w:r>
-        <w:rPr>
-          <w:b/>
-          <w:bCs/>
-        </w:rPr>
-        <w:t xml:space="preserve">Tiền tố đường dẫn</w:t>
-      </w:r>
-      <w:r>
-        <w:t xml:space="preserve">, tối đa </w:t>
-      </w:r>
-      <w:r>
-        <w:rPr>
-          <w:b/>
-          <w:bCs/>
-        </w:rPr>
-        <w:t xml:space="preserve">Số URL tối đa</w:t>
-      </w:r>
-      <w:r>
-        <w:t xml:space="preserve">).</w:t>
-      </w:r>
-    </w:p>
-    <w:p>
-      <w:pPr>
-        <w:pStyle w:val="ListParagraph"/>
-        <w:numPr>
-          <w:ilvl w:val="0"/>
-          <w:numId w:val="27"/>
-        </w:numPr>
-        <w:spacing w:after="80" w:line="290"/>
-      </w:pPr>
-      <w:r>
-        <w:t xml:space="preserve">Tùy chọn </w:t>
-      </w:r>
-      <w:r>
-        <w:rPr>
-          <w:b/>
-          <w:bCs/>
-        </w:rPr>
-        <w:t xml:space="preserve">CSS selector nội dung chính</w:t>
-      </w:r>
-      <w:r>
-        <w:t xml:space="preserve"> (ví dụ main) để chỉ lấy phần nội dung, bỏ menu và chân trang. Nếu không chắc, để trống.</w:t>
-      </w:r>
-    </w:p>
-    <w:p>
-      <w:pPr>
-        <w:pStyle w:val="ListParagraph"/>
-        <w:numPr>
-          <w:ilvl w:val="0"/>
-          <w:numId w:val="27"/>
-        </w:numPr>
-        <w:spacing w:after="80" w:line="290"/>
-      </w:pPr>
-      <w:r>
-        <w:t xml:space="preserve">Bấm </w:t>
-      </w:r>
-      <w:r>
-        <w:rPr>
-          <w:b/>
-          <w:bCs/>
-        </w:rPr>
-        <w:t xml:space="preserve">Đăng ký URL</w:t>
-      </w:r>
-      <w:r>
-        <w:t xml:space="preserve">. Cạnh tên nguồn hiện nhãn xanh </w:t>
-      </w:r>
-      <w:r>
-        <w:rPr>
-          <w:b/>
-          <w:bCs/>
-        </w:rPr>
-        <w:t xml:space="preserve">“Sẽ được crawl ở lần chạy tới”</w:t>
-      </w:r>
-      <w:r>
-        <w:t xml:space="preserve">; nếu nhãn cam, nó ghi rõ nguồn còn thiếu điều kiện gì.</w:t>
-      </w:r>
-    </w:p>
-    <w:p>
-      <w:pPr>
-        <w:pStyle w:val="ListParagraph"/>
-        <w:numPr>
-          <w:ilvl w:val="0"/>
-          <w:numId w:val="27"/>
-        </w:numPr>
-        <w:spacing w:after="80" w:line="290"/>
-      </w:pPr>
-      <w:r>
-        <w:t xml:space="preserve">Sau mỗi lần chạy, xem mục </w:t>
-      </w:r>
-      <w:r>
-        <w:rPr>
-          <w:b/>
-          <w:bCs/>
-        </w:rPr>
-        <w:t xml:space="preserve">10 lần chạy gần nhất</w:t>
-      </w:r>
-      <w:r>
-        <w:t xml:space="preserve">: trạng thái, số URL theo kết quả, và </w:t>
-      </w:r>
-      <w:r>
-        <w:rPr>
-          <w:b/>
-          <w:bCs/>
-        </w:rPr>
-        <w:t xml:space="preserve">Chi tiết</w:t>
-      </w:r>
-      <w:r>
-        <w:t xml:space="preserve"> từng URL. Bấm </w:t>
-      </w:r>
-      <w:r>
-        <w:rPr>
-          <w:b/>
-          <w:bCs/>
-        </w:rPr>
-        <w:t xml:space="preserve">Tài liệu mới nhất</w:t>
-      </w:r>
-      <w:r>
-        <w:t xml:space="preserve"> để mở tài liệu vừa lấy.</w:t>
-      </w:r>
-    </w:p>
-    <w:p>
-      <w:pPr>
-        <w:keepNext/>
-        <w:spacing w:after="60" w:before="120"/>
-        <w:jc w:val="center"/>
-      </w:pPr>
-      <w:r>
-        <w:drawing>
-          <wp:inline distT="0" distB="0" distL="0" distR="0">
-            <wp:extent cx="5715000" cy="6438900"/>
-            <wp:effectExtent t="0" r="0" b="0" l="0"/>
-            <wp:docPr id="1" name="fig23" descr="Minh họa trang Crawler, mục Trích xuất bằng AI trên trang tài liệu và nhật ký trích xuất (dữ liệu DEMO)." title="Hình 23"/>
-            <wp:cNvGraphicFramePr>
-              <a:graphicFrameLocks xmlns:a="http://schemas.openxmlformats.org/drawingml/2006/main" noChangeAspect="1"/>
-            </wp:cNvGraphicFramePr>
-            <a:graphic xmlns:a="http://schemas.openxmlformats.org/drawingml/2006/main">
-              <a:graphicData uri="http://schemas.openxmlformats.org/drawingml/2006/picture">
-                <pic:pic xmlns:pic="http://schemas.openxmlformats.org/drawingml/2006/picture">
-                  <pic:nvPicPr>
-                    <pic:cNvPr id="0" name="" descr=""/>
-                    <pic:cNvPicPr>
-                      <a:picLocks noChangeAspect="1" noChangeArrowheads="1"/>
-                    </pic:cNvPicPr>
-                  </pic:nvPicPr>
-                  <pic:blipFill>
-                    <a:blip r:embed="rId31" cstate="none"/>
-                    <a:srcRect/>
-                    <a:stretch>
-                      <a:fillRect/>
-                    </a:stretch>
-                  </pic:blipFill>
-                  <pic:spPr bwMode="auto">
-                    <a:xfrm>
-                      <a:off x="0" y="0"/>
-                      <a:ext cx="5715000" cy="6438900"/>
-                    </a:xfrm>
-                    <a:prstGeom prst="rect">
-                      <a:avLst/>
-                    </a:prstGeom>
-                  </pic:spPr>
-                </pic:pic>
-              </a:graphicData>
-            </a:graphic>
-          </wp:inline>
-        </w:drawing>
-      </w:r>
-    </w:p>
-    <w:p>
-      <w:pPr>
-        <w:spacing w:after="240"/>
-        <w:jc w:val="center"/>
-      </w:pPr>
-      <w:r>
-        <w:rPr>
-          <w:i/>
-          <w:iCs/>
-          <w:color w:val="6E6E73"/>
-          <w:sz w:val="18"/>
-          <w:szCs w:val="18"/>
-        </w:rPr>
-        <w:t xml:space="preserve">Hình 23. Minh họa trang Crawler, mục Trích xuất bằng AI trên trang tài liệu và nhật ký trích xuất (dữ liệu DEMO).</w:t>
+        <w:t xml:space="preserve">Sau mỗi lần chạy, mở tab </w:t>
+      </w:r>
+      <w:r>
+        <w:rPr>
+          <w:b/>
+          <w:bCs/>
+        </w:rPr>
+        <w:t xml:space="preserve">Lần chạy</w:t>
+      </w:r>
+      <w:r>
+        <w:t xml:space="preserve">: mỗi hàng ghi trạng thái, cách chạy, số URL theo kết quả và số thông tin cần xem lại. Bấm một hàng để xem từng URL; bấm URL để mở tài liệu vừa lấy.</w:t>
       </w:r>
     </w:p>
     <w:tbl>
@@ -9272,14 +9875,24 @@
         <w:spacing w:after="80" w:line="290"/>
       </w:pPr>
       <w:r>
-        <w:t xml:space="preserve">Mở trang một tài liệu do crawler lấy (Documents → chọn tài liệu). Cần quyền </w:t>
-      </w:r>
-      <w:r>
-        <w:rPr>
-          <w:b/>
-          <w:bCs/>
-        </w:rPr>
-        <w:t xml:space="preserve">facts.propose</w:t>
+        <w:t xml:space="preserve">Mở trang một tài liệu do crawler lấy (</w:t>
+      </w:r>
+      <w:r>
+        <w:rPr>
+          <w:b/>
+          <w:bCs/>
+        </w:rPr>
+        <w:t xml:space="preserve">Bằng chứng → Tài liệu</w:t>
+      </w:r>
+      <w:r>
+        <w:t xml:space="preserve"> → chọn tài liệu). Cần quyền </w:t>
+      </w:r>
+      <w:r>
+        <w:rPr>
+          <w:b/>
+          <w:bCs/>
+        </w:rPr>
+        <w:t xml:space="preserve">Đề xuất thông tin</w:t>
       </w:r>
       <w:r>
         <w:t xml:space="preserve">.</w:t>
@@ -9566,27 +10179,27 @@
         <w:spacing w:after="120" w:line="300"/>
       </w:pPr>
       <w:r>
-        <w:t xml:space="preserve">Trước khi thành đề xuất, mỗi gợi ý của AI được hệ thống kiểm tra tự động. Gợi ý không đạt bị loại và ghi lý do trong </w:t>
-      </w:r>
-      <w:r>
-        <w:rPr>
-          <w:b/>
-          <w:bCs/>
-        </w:rPr>
-        <w:t xml:space="preserve">Dashboard → Trích xuất AI</w:t>
-      </w:r>
-      <w:r>
-        <w:t xml:space="preserve"> (/admin/extraction), mục </w:t>
-      </w:r>
-      <w:r>
-        <w:rPr>
-          <w:b/>
-          <w:bCs/>
-        </w:rPr>
-        <w:t xml:space="preserve">10 lần chạy gần nhất → Chi tiết … ứng viên</w:t>
-      </w:r>
-      <w:r>
-        <w:t xml:space="preserve">.</w:t>
+        <w:t xml:space="preserve">Trước khi thành đề xuất, mỗi gợi ý của AI được hệ thống kiểm tra tự động. Gợi ý không đạt bị loại và ghi lý do ở trang </w:t>
+      </w:r>
+      <w:r>
+        <w:rPr>
+          <w:b/>
+          <w:bCs/>
+        </w:rPr>
+        <w:t xml:space="preserve">Trích xuất AI</w:t>
+      </w:r>
+      <w:r>
+        <w:t xml:space="preserve"> (Biên tập → Trích xuất AI), tab </w:t>
+      </w:r>
+      <w:r>
+        <w:rPr>
+          <w:b/>
+          <w:bCs/>
+        </w:rPr>
+        <w:t xml:space="preserve">Lần chạy</w:t>
+      </w:r>
+      <w:r>
+        <w:t xml:space="preserve"> → bấm một lần chạy. Lý do được giải thích bằng tiếng Việt, kèm câu gốc tiếng Anh để đối chiếu với nhật ký.</w:t>
       </w:r>
     </w:p>
     <w:tbl>
@@ -9628,11 +10241,7 @@
           </w:tcPr>
           <w:p>
             <w:r>
-              <w:rPr>
-                <w:b/>
-                <w:bCs/>
-              </w:rPr>
-              <w:t xml:space="preserve">Lý do hiển thị</w:t>
+              <w:t xml:space="preserve">Lý do gốc (tiếng Anh)</w:t>
             </w:r>
           </w:p>
         </w:tc>
@@ -9982,17 +10591,37 @@
         <w:spacing w:after="60" w:line="290"/>
       </w:pPr>
       <w:r>
-        <w:t xml:space="preserve">Trang </w:t>
-      </w:r>
-      <w:r>
-        <w:rPr>
-          <w:b/>
-          <w:bCs/>
-        </w:rPr>
-        <w:t xml:space="preserve">Trích xuất AI</w:t>
-      </w:r>
-      <w:r>
-        <w:t xml:space="preserve"> hiện yêu cầu đang mở, 10 lần chạy gần nhất (mô hình, số token đã dùng) và chi tiết từng gợi ý.</w:t>
+        <w:t xml:space="preserve">Trang Trích xuất AI có ba tab: </w:t>
+      </w:r>
+      <w:r>
+        <w:rPr>
+          <w:b/>
+          <w:bCs/>
+        </w:rPr>
+        <w:t xml:space="preserve">Yêu cầu đang mở</w:t>
+      </w:r>
+      <w:r>
+        <w:t xml:space="preserve">, </w:t>
+      </w:r>
+      <w:r>
+        <w:rPr>
+          <w:b/>
+          <w:bCs/>
+        </w:rPr>
+        <w:t xml:space="preserve">Lần chạy</w:t>
+      </w:r>
+      <w:r>
+        <w:t xml:space="preserve"> (bấm một hàng để xem mô hình, số token đã dùng và từng gợi ý) và </w:t>
+      </w:r>
+      <w:r>
+        <w:rPr>
+          <w:b/>
+          <w:bCs/>
+        </w:rPr>
+        <w:t xml:space="preserve">Cài đặt</w:t>
+      </w:r>
+      <w:r>
+        <w:t xml:space="preserve">.</w:t>
       </w:r>
     </w:p>
     <w:p>
@@ -10005,27 +10634,17 @@
         <w:spacing w:after="60" w:line="290"/>
       </w:pPr>
       <w:r>
-        <w:t xml:space="preserve">Mục </w:t>
-      </w:r>
-      <w:r>
-        <w:rPr>
-          <w:b/>
-          <w:bCs/>
-        </w:rPr>
-        <w:t xml:space="preserve">Tài khoản AI</w:t>
-      </w:r>
-      <w:r>
-        <w:t xml:space="preserve"> (cần roles.manage): chọn tài khoản đứng tên các đề xuất của AI. Tài khoản này phải có quyền đề xuất và </w:t>
-      </w:r>
-      <w:r>
-        <w:rPr>
-          <w:b/>
-          <w:bCs/>
-        </w:rPr>
-        <w:t xml:space="preserve">không</w:t>
-      </w:r>
-      <w:r>
-        <w:t xml:space="preserve"> có quyền duyệt, để AI không bao giờ tự duyệt đề xuất của mình. Nếu chưa chọn, AI không chạy.</w:t>
+        <w:t xml:space="preserve">Tab </w:t>
+      </w:r>
+      <w:r>
+        <w:rPr>
+          <w:b/>
+          <w:bCs/>
+        </w:rPr>
+        <w:t xml:space="preserve">Cài đặt</w:t>
+      </w:r>
+      <w:r>
+        <w:t xml:space="preserve"> (chỉ quản trị viên): chọn tài khoản đứng tên các đề xuất của AI. Tài khoản này phải có quyền đề xuất và không có quyền duyệt, để AI không bao giờ tự duyệt đề xuất của mình. Nếu chưa chọn, AI không chạy và trang hiện cảnh báo “Chưa chọn tài khoản AI”.</w:t>
       </w:r>
     </w:p>
     <w:p>
@@ -10077,7 +10696,7 @@
       <w:r>
         <w:drawing>
           <wp:inline distT="0" distB="0" distL="0" distR="0">
-            <wp:extent cx="5715000" cy="5616773"/>
+            <wp:extent cx="5715000" cy="6250781"/>
             <wp:effectExtent t="0" r="0" b="0" l="0"/>
             <wp:docPr id="1" name="fig24" descr="Các nút, nhãn và thông báo trong hệ thống (dữ liệu DEMO)." title="Hình 24"/>
             <wp:cNvGraphicFramePr>
@@ -10102,7 +10721,7 @@
                   <pic:spPr bwMode="auto">
                     <a:xfrm>
                       <a:off x="0" y="0"/>
-                      <a:ext cx="5715000" cy="5616773"/>
+                      <a:ext cx="5715000" cy="6250781"/>
                     </a:xfrm>
                     <a:prstGeom prst="rect">
                       <a:avLst/>
@@ -10128,7 +10747,7 @@
           <w:sz w:val="18"/>
           <w:szCs w:val="18"/>
         </w:rPr>
-        <w:t xml:space="preserve">Hình 24. Các nút, nhãn và thông báo trong hệ thống (dữ liệu DEMO).</w:t>
+        <w:t xml:space="preserve">Hình 23. Các nút, nhãn và thông báo trong hệ thống (dữ liệu DEMO).</w:t>
       </w:r>
     </w:p>
     <w:tbl>
@@ -11150,7 +11769,7 @@
           </w:tcPr>
           <w:p>
             <w:r>
-              <w:t xml:space="preserve">Research project</w:t>
+              <w:t xml:space="preserve">Dự án nghiên cứu</w:t>
             </w:r>
           </w:p>
         </w:tc>
@@ -11613,7 +12232,7 @@
         <w:pStyle w:val="Heading3"/>
       </w:pPr>
       <w:r>
-        <w:t xml:space="preserve">Người khác có xem được project và ghi chú của tôi không?</w:t>
+        <w:t xml:space="preserve">Người khác có xem được dự án và ghi chú của tôi không?</w:t>
       </w:r>
     </w:p>
     <w:p>
@@ -11621,7 +12240,7 @@
         <w:spacing w:after="120" w:line="300"/>
       </w:pPr>
       <w:r>
-        <w:t xml:space="preserve">Không. Dữ liệu trong My workspace chỉ chủ sở hữu xem được, kể cả quản trị viên cũng không đọc được qua hệ thống.</w:t>
+        <w:t xml:space="preserve">Không. Dữ liệu trong Không gian của tôi chỉ chủ sở hữu xem được, kể cả quản trị viên cũng không đọc được qua hệ thống.</w:t>
       </w:r>
     </w:p>
     <w:p>
@@ -12105,6 +12724,77 @@
           <w:p>
             <w:r>
               <w:t xml:space="preserve">Giao diện tiếng Việt với nhãn dễ hiểu (1.3, 3.8, 6.1); khung quyết định Duyệt / Từ chối, trạng thái công khai, lịch sử quyết định và form đánh dấu mâu thuẫn mới (5.4); thanh Quy trình duyệt (5); chụp lại hình 14, 15, 22, 24; thêm hình 14 (phần 2) và 22b.</w:t>
+            </w:r>
+          </w:p>
+        </w:tc>
+      </w:tr>
+      <w:tr>
+        <w:trPr>
+          <w:cantSplit/>
+        </w:trPr>
+        <w:tc>
+          <w:tcPr>
+            <w:tcW w:type="dxa" w:w="1400"/>
+            <w:tcBorders>
+              <w:top w:val="single" w:color="D2D2D7" w:sz="4"/>
+              <w:left w:val="single" w:color="D2D2D7" w:sz="4"/>
+              <w:bottom w:val="single" w:color="D2D2D7" w:sz="4"/>
+              <w:right w:val="single" w:color="D2D2D7" w:sz="4"/>
+            </w:tcBorders>
+            <w:tcMar>
+              <w:top w:type="dxa" w:w="80"/>
+              <w:left w:type="dxa" w:w="120"/>
+              <w:bottom w:type="dxa" w:w="80"/>
+              <w:right w:type="dxa" w:w="120"/>
+            </w:tcMar>
+          </w:tcPr>
+          <w:p>
+            <w:r>
+              <w:t xml:space="preserve">3.0</w:t>
+            </w:r>
+          </w:p>
+        </w:tc>
+        <w:tc>
+          <w:tcPr>
+            <w:tcW w:type="dxa" w:w="1600"/>
+            <w:tcBorders>
+              <w:top w:val="single" w:color="D2D2D7" w:sz="4"/>
+              <w:left w:val="single" w:color="D2D2D7" w:sz="4"/>
+              <w:bottom w:val="single" w:color="D2D2D7" w:sz="4"/>
+              <w:right w:val="single" w:color="D2D2D7" w:sz="4"/>
+            </w:tcBorders>
+            <w:tcMar>
+              <w:top w:type="dxa" w:w="80"/>
+              <w:left w:type="dxa" w:w="120"/>
+              <w:bottom w:type="dxa" w:w="80"/>
+              <w:right w:type="dxa" w:w="120"/>
+            </w:tcMar>
+          </w:tcPr>
+          <w:p>
+            <w:r>
+              <w:t xml:space="preserve">2026-10-01</w:t>
+            </w:r>
+          </w:p>
+        </w:tc>
+        <w:tc>
+          <w:tcPr>
+            <w:tcW w:type="dxa" w:w="6026"/>
+            <w:tcBorders>
+              <w:top w:val="single" w:color="D2D2D7" w:sz="4"/>
+              <w:left w:val="single" w:color="D2D2D7" w:sz="4"/>
+              <w:bottom w:val="single" w:color="D2D2D7" w:sz="4"/>
+              <w:right w:val="single" w:color="D2D2D7" w:sz="4"/>
+            </w:tcBorders>
+            <w:tcMar>
+              <w:top w:type="dxa" w:w="80"/>
+              <w:left w:type="dxa" w:w="120"/>
+              <w:bottom w:type="dxa" w:w="80"/>
+              <w:right w:type="dxa" w:w="120"/>
+            </w:tcMar>
+          </w:tcPr>
+          <w:p>
+            <w:r>
+              <w:t xml:space="preserve">Cập nhật theo giao diện tiếng Việt mới: thanh điều hướng năm mục, nút tài khoản, thanh tiến trình (2.1–2.2); tên nút và bộ lọc (chương 3); đổi tên khu vực cá nhân (chương 4); trang Tổng quan và phân quyền dạng bảng (5.1); Quản lý nguồn chia đôi (5.2); trang duyệt chia đôi và khung thông tin cùng trang (5.4); crawler, trích xuất AI, chỉ số dạng bảng (5.8, 5.9, 5.11). Chụp lại hình 1–13, 16–22; thêm hình 21b, 21c; bỏ hình minh họa crawler cũ; hình các nhãn màu thành hình 23.</w:t>
             </w:r>
           </w:p>
         </w:tc>

</xml_diff>

<commit_message>
Prepare the first Vercel deploy; update the guide and taxonomy plans
- apps/web/vercel.json runs functions in syd1, next to the Supabase
  database in ap-southeast-2 (Sydney).
- docs/architecture/deploy-vercel.md: Vercel and Supabase Auth settings,
  which environment variables belong in Vercel and which never do, and
  the open decisions (environment separation, domain).
- /admin: switching 7/30 days keeps the scroll position.
- User Guide v3.1: country overview, compact fact card, sources table
  and inspector, editor-only details, new 5.12 admin overview.
- Field taxonomy: owner answers recorded; design changed to an open
  taxonomy (all ISCED-F 2013 fields + career paths managed in the UI by
  taxonomy.manage holders); phase 1 plan rewritten. Nothing built yet.

Co-Authored-By: Claude Opus 5.5 <noreply@anthropic.com>
</commit_message>
<xml_diff>
--- a/documents/User_Guide.docx
+++ b/documents/User_Guide.docx
@@ -59,7 +59,7 @@
         <w:spacing w:after="120" w:line="300"/>
       </w:pPr>
       <w:r>
-        <w:t xml:space="preserve">Phiên bản: 3.0 · Ngày: 2026-10-01 · Áp dụng cho các tính năng đến hết Slice 10a, với giao diện tiếng Việt mới ở mọi trang.</w:t>
+        <w:t xml:space="preserve">Phiên bản: 3.1 · Ngày: 2026-10-03 · Áp dụng cho các tính năng đến hết Slice 10a, giao diện tiếng Việt, trang quốc gia và thẻ thông tin dành cho người xem.</w:t>
       </w:r>
     </w:p>
     <w:p>
@@ -138,7 +138,7 @@
         <w:pageBreakBefore/>
       </w:pPr>
       <w:r>
-        <w:t xml:space="preserve">Có gì mới trong phiên bản 3.0</w:t>
+        <w:t xml:space="preserve">Có gì mới trong phiên bản 3.1</w:t>
       </w:r>
     </w:p>
     <w:tbl>
@@ -266,7 +266,7 @@
           </w:tcPr>
           <w:p>
             <w:r>
-              <w:t xml:space="preserve">Toàn bộ giao diện bằng tiếng Việt; thanh điều hướng gọn còn năm mục (Quốc gia, Du học, Làm việc &amp; Visa, So sánh, Bằng chứng)</w:t>
+              <w:t xml:space="preserve">Trang quốc gia mới: thẻ Du học, Visa &amp; cư trú, Làm việc có số đếm; dòng “Duyệt gần nhất”; tab “Bạn muốn biết gì?”</w:t>
             </w:r>
           </w:p>
         </w:tc>
@@ -288,7 +288,7 @@
           </w:tcPr>
           <w:p>
             <w:r>
-              <w:t xml:space="preserve">Mọi trang</w:t>
+              <w:t xml:space="preserve">Quốc gia → một nước</w:t>
             </w:r>
           </w:p>
         </w:tc>
@@ -310,7 +310,7 @@
           </w:tcPr>
           <w:p>
             <w:r>
-              <w:t xml:space="preserve">2.1</w:t>
+              <w:t xml:space="preserve">3.1</w:t>
             </w:r>
           </w:p>
         </w:tc>
@@ -337,7 +337,7 @@
           </w:tcPr>
           <w:p>
             <w:r>
-              <w:t xml:space="preserve">Trang chủ theo mục tiêu (Đi du học, Đi làm, Visa và cư trú, So sánh quốc gia); quốc gia và trường hiện dạng thẻ</w:t>
+              <w:t xml:space="preserve">Thẻ thông tin gọn: câu trả lời trước, một dòng nguồn, bấm “Xem bằng chứng” để xem chi tiết</w:t>
             </w:r>
           </w:p>
         </w:tc>
@@ -359,7 +359,7 @@
           </w:tcPr>
           <w:p>
             <w:r>
-              <w:t xml:space="preserve">Trang chủ, Quốc gia, Trường đại học</w:t>
+              <w:t xml:space="preserve">Mọi trang có thông tin</w:t>
             </w:r>
           </w:p>
         </w:tc>
@@ -381,7 +381,7 @@
           </w:tcPr>
           <w:p>
             <w:r>
-              <w:t xml:space="preserve">2.1, 3.1, 3.2</w:t>
+              <w:t xml:space="preserve">3.8</w:t>
             </w:r>
           </w:p>
         </w:tc>
@@ -408,7 +408,7 @@
           </w:tcPr>
           <w:p>
             <w:r>
-              <w:t xml:space="preserve">Nút tài khoản ở góc phải mọi trang: Đăng nhập, Không gian của tôi, Biên tập (kèm số đề xuất chờ duyệt), Đăng xuất. Chỉ hiện nút bạn có quyền dùng</w:t>
+              <w:t xml:space="preserve">Bộ lọc Chủ đề (Học phí &amp; chi phí, Tuyển sinh &amp; hạn nộp, Visa &amp; giấy phép, Lương &amp; việc làm)</w:t>
             </w:r>
           </w:p>
         </w:tc>
@@ -430,7 +430,7 @@
           </w:tcPr>
           <w:p>
             <w:r>
-              <w:t xml:space="preserve">Thanh trên cùng</w:t>
+              <w:t xml:space="preserve">Bằng chứng → Thông tin</w:t>
             </w:r>
           </w:p>
         </w:tc>
@@ -452,7 +452,7 @@
           </w:tcPr>
           <w:p>
             <w:r>
-              <w:t xml:space="preserve">2.1, 2.2</w:t>
+              <w:t xml:space="preserve">3.8</w:t>
             </w:r>
           </w:p>
         </w:tc>
@@ -479,7 +479,7 @@
           </w:tcPr>
           <w:p>
             <w:r>
-              <w:t xml:space="preserve">Thanh tiến trình mảnh ở mép trên khi chuyển trang</w:t>
+              <w:t xml:space="preserve">Trang Nguồn dạng bảng; bấm một hàng mở khung chi tiết bên phải</w:t>
             </w:r>
           </w:p>
         </w:tc>
@@ -501,7 +501,7 @@
           </w:tcPr>
           <w:p>
             <w:r>
-              <w:t xml:space="preserve">Mọi trang</w:t>
+              <w:t xml:space="preserve">Bằng chứng → Nguồn</w:t>
             </w:r>
           </w:p>
         </w:tc>
@@ -523,7 +523,7 @@
           </w:tcPr>
           <w:p>
             <w:r>
-              <w:t xml:space="preserve">2.1</w:t>
+              <w:t xml:space="preserve">3.9</w:t>
             </w:r>
           </w:p>
         </w:tc>
@@ -550,7 +550,7 @@
           </w:tcPr>
           <w:p>
             <w:r>
-              <w:t xml:space="preserve">Trang duyệt chia đôi màn hình; khung “Các thông tin khác từ cùng trang này”</w:t>
+              <w:t xml:space="preserve">Thông tin vận hành (crawl, ghi chú nội bộ, nhãn AI, trạng thái nghiên cứu) chỉ biên tập viên thấy</w:t>
             </w:r>
           </w:p>
         </w:tc>
@@ -572,7 +572,7 @@
           </w:tcPr>
           <w:p>
             <w:r>
-              <w:t xml:space="preserve">Bốn trang duyệt</w:t>
+              <w:t xml:space="preserve">Quốc gia, Nguồn, thẻ thông tin</w:t>
             </w:r>
           </w:p>
         </w:tc>
@@ -594,7 +594,7 @@
           </w:tcPr>
           <w:p>
             <w:r>
-              <w:t xml:space="preserve">5.4</w:t>
+              <w:t xml:space="preserve">1.1, 3.1, 3.8, 3.9</w:t>
             </w:r>
           </w:p>
         </w:tc>
@@ -621,7 +621,7 @@
           </w:tcPr>
           <w:p>
             <w:r>
-              <w:t xml:space="preserve">Quản lý nguồn chia đôi màn hình, form chia nhóm, giải thích từng tier ngay trong form</w:t>
+              <w:t xml:space="preserve">Bảng điều khiển quản trị có biểu đồ</w:t>
             </w:r>
           </w:p>
         </w:tc>
@@ -643,7 +643,7 @@
           </w:tcPr>
           <w:p>
             <w:r>
-              <w:t xml:space="preserve">Quản lý nguồn</w:t>
+              <w:t xml:space="preserve">Biên tập → Bảng điều khiển quản trị</w:t>
             </w:r>
           </w:p>
         </w:tc>
@@ -665,149 +665,7 @@
           </w:tcPr>
           <w:p>
             <w:r>
-              <w:t xml:space="preserve">5.2</w:t>
-            </w:r>
-          </w:p>
-        </w:tc>
-      </w:tr>
-      <w:tr>
-        <w:trPr>
-          <w:cantSplit/>
-        </w:trPr>
-        <w:tc>
-          <w:tcPr>
-            <w:tcW w:type="dxa" w:w="4300"/>
-            <w:tcBorders>
-              <w:top w:val="single" w:color="D2D2D7" w:sz="4"/>
-              <w:left w:val="single" w:color="D2D2D7" w:sz="4"/>
-              <w:bottom w:val="single" w:color="D2D2D7" w:sz="4"/>
-              <w:right w:val="single" w:color="D2D2D7" w:sz="4"/>
-            </w:tcBorders>
-            <w:tcMar>
-              <w:top w:type="dxa" w:w="80"/>
-              <w:left w:type="dxa" w:w="120"/>
-              <w:bottom w:type="dxa" w:w="80"/>
-              <w:right w:type="dxa" w:w="120"/>
-            </w:tcMar>
-          </w:tcPr>
-          <w:p>
-            <w:r>
-              <w:t xml:space="preserve">Bảng có thể sắp xếp và khung chi tiết trượt từ bên phải; xem “Quyền hiện có” của một người dùng</w:t>
-            </w:r>
-          </w:p>
-        </w:tc>
-        <w:tc>
-          <w:tcPr>
-            <w:tcW w:type="dxa" w:w="3100"/>
-            <w:tcBorders>
-              <w:top w:val="single" w:color="D2D2D7" w:sz="4"/>
-              <w:left w:val="single" w:color="D2D2D7" w:sz="4"/>
-              <w:bottom w:val="single" w:color="D2D2D7" w:sz="4"/>
-              <w:right w:val="single" w:color="D2D2D7" w:sz="4"/>
-            </w:tcBorders>
-            <w:tcMar>
-              <w:top w:type="dxa" w:w="80"/>
-              <w:left w:type="dxa" w:w="120"/>
-              <w:bottom w:type="dxa" w:w="80"/>
-              <w:right w:type="dxa" w:w="120"/>
-            </w:tcMar>
-          </w:tcPr>
-          <w:p>
-            <w:r>
-              <w:t xml:space="preserve">Người dùng &amp; phân quyền, Crawler, Trích xuất AI, Chỉ số so sánh</w:t>
-            </w:r>
-          </w:p>
-        </w:tc>
-        <w:tc>
-          <w:tcPr>
-            <w:tcW w:type="dxa" w:w="1626"/>
-            <w:tcBorders>
-              <w:top w:val="single" w:color="D2D2D7" w:sz="4"/>
-              <w:left w:val="single" w:color="D2D2D7" w:sz="4"/>
-              <w:bottom w:val="single" w:color="D2D2D7" w:sz="4"/>
-              <w:right w:val="single" w:color="D2D2D7" w:sz="4"/>
-            </w:tcBorders>
-            <w:tcMar>
-              <w:top w:type="dxa" w:w="80"/>
-              <w:left w:type="dxa" w:w="120"/>
-              <w:bottom w:type="dxa" w:w="80"/>
-              <w:right w:type="dxa" w:w="120"/>
-            </w:tcMar>
-          </w:tcPr>
-          <w:p>
-            <w:r>
-              <w:t xml:space="preserve">5.1, 5.8, 5.9, 5.11</w:t>
-            </w:r>
-          </w:p>
-        </w:tc>
-      </w:tr>
-      <w:tr>
-        <w:trPr>
-          <w:cantSplit/>
-        </w:trPr>
-        <w:tc>
-          <w:tcPr>
-            <w:tcW w:type="dxa" w:w="4300"/>
-            <w:tcBorders>
-              <w:top w:val="single" w:color="D2D2D7" w:sz="4"/>
-              <w:left w:val="single" w:color="D2D2D7" w:sz="4"/>
-              <w:bottom w:val="single" w:color="D2D2D7" w:sz="4"/>
-              <w:right w:val="single" w:color="D2D2D7" w:sz="4"/>
-            </w:tcBorders>
-            <w:tcMar>
-              <w:top w:type="dxa" w:w="80"/>
-              <w:left w:type="dxa" w:w="120"/>
-              <w:bottom w:type="dxa" w:w="80"/>
-              <w:right w:type="dxa" w:w="120"/>
-            </w:tcMar>
-          </w:tcPr>
-          <w:p>
-            <w:r>
-              <w:t xml:space="preserve">Khu vực cá nhân đổi tên: Không gian của tôi, Dự án nghiên cứu, Kế hoạch châu Âu</w:t>
-            </w:r>
-          </w:p>
-        </w:tc>
-        <w:tc>
-          <w:tcPr>
-            <w:tcW w:type="dxa" w:w="3100"/>
-            <w:tcBorders>
-              <w:top w:val="single" w:color="D2D2D7" w:sz="4"/>
-              <w:left w:val="single" w:color="D2D2D7" w:sz="4"/>
-              <w:bottom w:val="single" w:color="D2D2D7" w:sz="4"/>
-              <w:right w:val="single" w:color="D2D2D7" w:sz="4"/>
-            </w:tcBorders>
-            <w:tcMar>
-              <w:top w:type="dxa" w:w="80"/>
-              <w:left w:type="dxa" w:w="120"/>
-              <w:bottom w:type="dxa" w:w="80"/>
-              <w:right w:type="dxa" w:w="120"/>
-            </w:tcMar>
-          </w:tcPr>
-          <w:p>
-            <w:r>
-              <w:t xml:space="preserve">Không gian của tôi</w:t>
-            </w:r>
-          </w:p>
-        </w:tc>
-        <w:tc>
-          <w:tcPr>
-            <w:tcW w:type="dxa" w:w="1626"/>
-            <w:tcBorders>
-              <w:top w:val="single" w:color="D2D2D7" w:sz="4"/>
-              <w:left w:val="single" w:color="D2D2D7" w:sz="4"/>
-              <w:bottom w:val="single" w:color="D2D2D7" w:sz="4"/>
-              <w:right w:val="single" w:color="D2D2D7" w:sz="4"/>
-            </w:tcBorders>
-            <w:tcMar>
-              <w:top w:type="dxa" w:w="80"/>
-              <w:left w:type="dxa" w:w="120"/>
-              <w:bottom w:type="dxa" w:w="80"/>
-              <w:right w:type="dxa" w:w="120"/>
-            </w:tcMar>
-          </w:tcPr>
-          <w:p>
-            <w:r>
-              <w:t xml:space="preserve">4</w:t>
+              <w:t xml:space="preserve">5.12</w:t>
             </w:r>
           </w:p>
         </w:tc>
@@ -836,7 +694,7 @@
         <w:t xml:space="preserve">Ghi chú: </w:t>
       </w:r>
       <w:r>
-        <w:t xml:space="preserve">Phiên bản 3.0 chụp lại hình và cập nhật tên nút theo giao diện tiếng Việt mới. Quy trình nghiệp vụ (đề xuất, duyệt, crawler, AI) không đổi. Các thay đổi trước có trong Lịch sử phiên bản ở cuối tài liệu.</w:t>
+        <w:t xml:space="preserve">Phiên bản 3.1 cập nhật theo các thay đổi giao diện từ 2026-10-01 đến 2026-10-03. Quy trình đề xuất, duyệt, crawler và AI không đổi. Các thay đổi trước có trong Lịch sử phiên bản ở cuối tài liệu.</w:t>
       </w:r>
     </w:p>
     <w:p>
@@ -951,7 +809,7 @@
         <w:t xml:space="preserve">AI chỉ đề xuất, con người quyết định.</w:t>
       </w:r>
       <w:r>
-        <w:t xml:space="preserve"> AI có thể đọc tài liệu và gợi ý thông tin, nhưng mọi gợi ý phải có câu trích nguyên văn và được người duyệt kiểm tra trước khi công khai. Thông tin do AI trích luôn mang nhãn riêng.</w:t>
+        <w:t xml:space="preserve"> AI có thể đọc tài liệu và gợi ý thông tin, nhưng mọi gợi ý phải có câu trích nguyên văn và được người duyệt kiểm tra trước khi công khai. Hệ thống lưu lại thông tin nào do AI tìm ra; biên tập viên thấy nhãn riêng cho các thông tin này.</w:t>
       </w:r>
     </w:p>
     <w:p>
@@ -2292,7 +2150,7 @@
         <w:t xml:space="preserve">Quốc gia</w:t>
       </w:r>
       <w:r>
-        <w:t xml:space="preserve"> trên thanh điều hướng. Mỗi quốc gia là một thẻ, kèm trạng thái nghiên cứu và số nguồn đã đăng ký.</w:t>
+        <w:t xml:space="preserve"> trên thanh điều hướng. Mỗi quốc gia là một thẻ, kèm số nguồn đã đăng ký.</w:t>
       </w:r>
     </w:p>
     <w:p>
@@ -2318,17 +2176,17 @@
         <w:spacing w:after="80" w:line="290"/>
       </w:pPr>
       <w:r>
-        <w:t xml:space="preserve">Trong mục </w:t>
-      </w:r>
-      <w:r>
-        <w:rPr>
-          <w:b/>
-          <w:bCs/>
-        </w:rPr>
-        <w:t xml:space="preserve">Khám phá</w:t>
-      </w:r>
-      <w:r>
-        <w:t xml:space="preserve">, chọn: trường, chương trình, quy định nhập cư, so sánh với quốc gia khác, hoặc nghề nghiệp.</w:t>
+        <w:t xml:space="preserve">Đầu trang ghi </w:t>
+      </w:r>
+      <w:r>
+        <w:rPr>
+          <w:b/>
+          <w:bCs/>
+        </w:rPr>
+        <w:t xml:space="preserve">Duyệt gần nhất</w:t>
+      </w:r>
+      <w:r>
+        <w:t xml:space="preserve"> (ngày gần nhất có nội dung được duyệt) và số nguồn đã xác minh; bấm số nguồn để mở danh sách nguồn của nước đó.</w:t>
       </w:r>
     </w:p>
     <w:p>
@@ -2341,17 +2199,100 @@
         <w:spacing w:after="80" w:line="290"/>
       </w:pPr>
       <w:r>
-        <w:t xml:space="preserve">Mục </w:t>
-      </w:r>
-      <w:r>
-        <w:rPr>
-          <w:b/>
-          <w:bCs/>
-        </w:rPr>
-        <w:t xml:space="preserve">Thông tin có bằng chứng</w:t>
-      </w:r>
-      <w:r>
-        <w:t xml:space="preserve"> hiện 5 thông tin mới nhất về quốc gia; bấm </w:t>
+        <w:t xml:space="preserve">Ba thẻ </w:t>
+      </w:r>
+      <w:r>
+        <w:rPr>
+          <w:b/>
+          <w:bCs/>
+        </w:rPr>
+        <w:t xml:space="preserve">Du học</w:t>
+      </w:r>
+      <w:r>
+        <w:t xml:space="preserve">, </w:t>
+      </w:r>
+      <w:r>
+        <w:rPr>
+          <w:b/>
+          <w:bCs/>
+        </w:rPr>
+        <w:t xml:space="preserve">Visa &amp; cư trú</w:t>
+      </w:r>
+      <w:r>
+        <w:t xml:space="preserve">, </w:t>
+      </w:r>
+      <w:r>
+        <w:rPr>
+          <w:b/>
+          <w:bCs/>
+        </w:rPr>
+        <w:t xml:space="preserve">Làm việc</w:t>
+      </w:r>
+      <w:r>
+        <w:t xml:space="preserve"> cho biết Nordic đã có gì: số trường, chương trình, quy định, số liệu lao động đã duyệt, kèm vài mục mới duyệt. Thẻ chưa có gì ghi rõ, ví dụ “Chưa có trường nào được duyệt”. Bấm link cuối thẻ để mở danh sách đã lọc theo nước.</w:t>
+      </w:r>
+    </w:p>
+    <w:p>
+      <w:pPr>
+        <w:pStyle w:val="ListParagraph"/>
+        <w:numPr>
+          <w:ilvl w:val="0"/>
+          <w:numId w:val="5"/>
+        </w:numPr>
+        <w:spacing w:after="80" w:line="290"/>
+      </w:pPr>
+      <w:r>
+        <w:t xml:space="preserve">Phần </w:t>
+      </w:r>
+      <w:r>
+        <w:rPr>
+          <w:b/>
+          <w:bCs/>
+        </w:rPr>
+        <w:t xml:space="preserve">Bạn muốn biết gì?</w:t>
+      </w:r>
+      <w:r>
+        <w:t xml:space="preserve"> chia thông tin theo câu hỏi, mỗi câu hỏi một tab: </w:t>
+      </w:r>
+      <w:r>
+        <w:rPr>
+          <w:b/>
+          <w:bCs/>
+        </w:rPr>
+        <w:t xml:space="preserve">Học phí &amp; chi phí</w:t>
+      </w:r>
+      <w:r>
+        <w:t xml:space="preserve">, </w:t>
+      </w:r>
+      <w:r>
+        <w:rPr>
+          <w:b/>
+          <w:bCs/>
+        </w:rPr>
+        <w:t xml:space="preserve">Tuyển sinh &amp; hạn nộp</w:t>
+      </w:r>
+      <w:r>
+        <w:t xml:space="preserve">, </w:t>
+      </w:r>
+      <w:r>
+        <w:rPr>
+          <w:b/>
+          <w:bCs/>
+        </w:rPr>
+        <w:t xml:space="preserve">Visa &amp; giấy phép</w:t>
+      </w:r>
+      <w:r>
+        <w:t xml:space="preserve">, </w:t>
+      </w:r>
+      <w:r>
+        <w:rPr>
+          <w:b/>
+          <w:bCs/>
+        </w:rPr>
+        <w:t xml:space="preserve">Lương &amp; việc làm</w:t>
+      </w:r>
+      <w:r>
+        <w:t xml:space="preserve"> (số bên cạnh là số thông tin). Trang mở sẵn tab đầu tiên có dữ liệu; bấm </w:t>
       </w:r>
       <w:r>
         <w:rPr>
@@ -2361,7 +2302,7 @@
         <w:t xml:space="preserve">Xem tất cả</w:t>
       </w:r>
       <w:r>
-        <w:t xml:space="preserve"> để xem toàn bộ.</w:t>
+        <w:t xml:space="preserve"> để xem đầy đủ ở trang Thông tin.</w:t>
       </w:r>
     </w:p>
     <w:p>
@@ -2374,17 +2315,7 @@
         <w:spacing w:after="80" w:line="290"/>
       </w:pPr>
       <w:r>
-        <w:t xml:space="preserve">Mục </w:t>
-      </w:r>
-      <w:r>
-        <w:rPr>
-          <w:b/>
-          <w:bCs/>
-        </w:rPr>
-        <w:t xml:space="preserve">Nguồn của quốc gia này</w:t>
-      </w:r>
-      <w:r>
-        <w:t xml:space="preserve"> liệt kê các nguồn gắn với quốc gia.</w:t>
+        <w:t xml:space="preserve">Số trên các thẻ chỉ đếm nội dung đã đối chiếu với nguồn và duyệt, không phải tổng số thực tế của quốc gia.</w:t>
       </w:r>
     </w:p>
     <w:p>
@@ -2396,7 +2327,7 @@
       <w:r>
         <w:drawing>
           <wp:inline distT="0" distB="0" distL="0" distR="0">
-            <wp:extent cx="5715000" cy="3366492"/>
+            <wp:extent cx="5715000" cy="4464843"/>
             <wp:effectExtent t="0" r="0" b="0" l="0"/>
             <wp:docPr id="1" name="fig3" descr="Danh sách quốc gia." title="Hình 3"/>
             <wp:cNvGraphicFramePr>
@@ -2421,7 +2352,7 @@
                   <pic:spPr bwMode="auto">
                     <a:xfrm>
                       <a:off x="0" y="0"/>
-                      <a:ext cx="5715000" cy="3366492"/>
+                      <a:ext cx="5715000" cy="4464843"/>
                     </a:xfrm>
                     <a:prstGeom prst="rect">
                       <a:avLst/>
@@ -2459,7 +2390,7 @@
       <w:r>
         <w:drawing>
           <wp:inline distT="0" distB="0" distL="0" distR="0">
-            <wp:extent cx="4389120" cy="8229600"/>
+            <wp:extent cx="5715000" cy="4955976"/>
             <wp:effectExtent t="0" r="0" b="0" l="0"/>
             <wp:docPr id="1" name="fig4" descr="Trang hồ sơ quốc gia." title="Hình 4"/>
             <wp:cNvGraphicFramePr>
@@ -2484,7 +2415,7 @@
                   <pic:spPr bwMode="auto">
                     <a:xfrm>
                       <a:off x="0" y="0"/>
-                      <a:ext cx="4389120" cy="8229600"/>
+                      <a:ext cx="5715000" cy="4955976"/>
                     </a:xfrm>
                     <a:prstGeom prst="rect">
                       <a:avLst/>
@@ -2510,7 +2441,7 @@
           <w:sz w:val="18"/>
           <w:szCs w:val="18"/>
         </w:rPr>
-        <w:t xml:space="preserve">Hình 4. Trang hồ sơ quốc gia.</w:t>
+        <w:t xml:space="preserve">Hình 4. Trang quốc gia: dòng độ mới, ba thẻ chủ đề, dải so sánh và tab câu hỏi.</w:t>
       </w:r>
     </w:p>
     <w:p>
@@ -3924,7 +3855,17 @@
         <w:spacing w:after="120" w:line="300"/>
       </w:pPr>
       <w:r>
-        <w:t xml:space="preserve">Mọi thông tin (học phí, điều kiện, số liệu…) được hiển thị bằng cùng một kiểu thẻ:</w:t>
+        <w:t xml:space="preserve">Người xem thấy mỗi thông tin (học phí, điều kiện, số liệu…) dưới dạng một </w:t>
+      </w:r>
+      <w:r>
+        <w:rPr>
+          <w:b/>
+          <w:bCs/>
+        </w:rPr>
+        <w:t xml:space="preserve">thẻ gọn</w:t>
+      </w:r>
+      <w:r>
+        <w:t xml:space="preserve">: câu trả lời trước, chi tiết kiểm chứng gấp lại.</w:t>
       </w:r>
     </w:p>
     <w:p>
@@ -3937,14 +3878,90 @@
         <w:spacing w:after="60" w:line="290"/>
       </w:pPr>
       <w:r>
-        <w:t xml:space="preserve">Dòng trên cùng: chủ đề, và nhãn trạng thái ở góc phải (</w:t>
-      </w:r>
-      <w:r>
-        <w:rPr>
-          <w:b/>
-          <w:bCs/>
-        </w:rPr>
-        <w:t xml:space="preserve">Chờ duyệt</w:t>
+        <w:t xml:space="preserve">Dòng trên cùng: chủ đề (hoặc tên chỉ số so sánh). Thông tin mâu thuẫn giữa các nguồn mang nhãn đỏ </w:t>
+      </w:r>
+      <w:r>
+        <w:rPr>
+          <w:b/>
+          <w:bCs/>
+        </w:rPr>
+        <w:t xml:space="preserve">Có mâu thuẫn</w:t>
+      </w:r>
+      <w:r>
+        <w:t xml:space="preserve">.</w:t>
+      </w:r>
+    </w:p>
+    <w:p>
+      <w:pPr>
+        <w:pStyle w:val="ListParagraph"/>
+        <w:numPr>
+          <w:ilvl w:val="0"/>
+          <w:numId w:val="2"/>
+        </w:numPr>
+        <w:spacing w:after="60" w:line="290"/>
+      </w:pPr>
+      <w:r>
+        <w:t xml:space="preserve">Giá trị in đậm; có thể kèm nhãn hạn nộp (ví dụ </w:t>
+      </w:r>
+      <w:r>
+        <w:rPr>
+          <w:b/>
+          <w:bCs/>
+        </w:rPr>
+        <w:t xml:space="preserve">Hạn nộp: Xét tuyển liên tục</w:t>
+      </w:r>
+      <w:r>
+        <w:t xml:space="preserve">), kỳ số liệu hoặc chỉ số so sánh.</w:t>
+      </w:r>
+    </w:p>
+    <w:p>
+      <w:pPr>
+        <w:pStyle w:val="ListParagraph"/>
+        <w:numPr>
+          <w:ilvl w:val="0"/>
+          <w:numId w:val="2"/>
+        </w:numPr>
+        <w:spacing w:after="60" w:line="290"/>
+      </w:pPr>
+      <w:r>
+        <w:rPr>
+          <w:b/>
+          <w:bCs/>
+        </w:rPr>
+        <w:t xml:space="preserve">Dòng nguồn luôn hiện</w:t>
+      </w:r>
+      <w:r>
+        <w:t xml:space="preserve">: tên nguồn (bấm để mở trang gốc), tier, ngày lấy trang và trạng thái hiệu lực.</w:t>
+      </w:r>
+    </w:p>
+    <w:p>
+      <w:pPr>
+        <w:pStyle w:val="ListParagraph"/>
+        <w:numPr>
+          <w:ilvl w:val="0"/>
+          <w:numId w:val="2"/>
+        </w:numPr>
+        <w:spacing w:after="60" w:line="290"/>
+      </w:pPr>
+      <w:r>
+        <w:t xml:space="preserve">Bấm </w:t>
+      </w:r>
+      <w:r>
+        <w:rPr>
+          <w:b/>
+          <w:bCs/>
+        </w:rPr>
+        <w:t xml:space="preserve">Xem bằng chứng</w:t>
+      </w:r>
+      <w:r>
+        <w:t xml:space="preserve"> để mở trích đoạn nguyên văn, hiệu lực chi tiết, ngày lấy trang · ngày duyệt, và các link </w:t>
+      </w:r>
+      <w:r>
+        <w:rPr>
+          <w:b/>
+          <w:bCs/>
+        </w:rPr>
+        <w:t xml:space="preserve">Mở trang gốc</w:t>
       </w:r>
       <w:r>
         <w:t xml:space="preserve">, </w:t>
@@ -3954,30 +3971,86 @@
           <w:b/>
           <w:bCs/>
         </w:rPr>
+        <w:t xml:space="preserve">Tài liệu và các phiên bản</w:t>
+      </w:r>
+      <w:r>
+        <w:t xml:space="preserve">, mục liên quan.</w:t>
+      </w:r>
+    </w:p>
+    <w:p>
+      <w:pPr>
+        <w:pStyle w:val="ListParagraph"/>
+        <w:numPr>
+          <w:ilvl w:val="0"/>
+          <w:numId w:val="2"/>
+        </w:numPr>
+        <w:spacing w:after="60" w:line="290"/>
+      </w:pPr>
+      <w:r>
+        <w:t xml:space="preserve">Khung cam luôn hiện, không bị gấp: </w:t>
+      </w:r>
+      <w:r>
+        <w:rPr>
+          <w:b/>
+          <w:bCs/>
+        </w:rPr>
+        <w:t xml:space="preserve">Không phải nguồn chính thức</w:t>
+      </w:r>
+      <w:r>
+        <w:t xml:space="preserve">, hoặc </w:t>
+      </w:r>
+      <w:r>
+        <w:rPr>
+          <w:b/>
+          <w:bCs/>
+        </w:rPr>
+        <w:t xml:space="preserve">Trang nguồn đã thay đổi từ …</w:t>
+      </w:r>
+      <w:r>
+        <w:t xml:space="preserve"> (thông tin có thể đã cũ; bấm </w:t>
+      </w:r>
+      <w:r>
+        <w:rPr>
+          <w:b/>
+          <w:bCs/>
+        </w:rPr>
+        <w:t xml:space="preserve">Xem phiên bản mới</w:t>
+      </w:r>
+      <w:r>
+        <w:t xml:space="preserve">).</w:t>
+      </w:r>
+    </w:p>
+    <w:p>
+      <w:pPr>
+        <w:pStyle w:val="ListParagraph"/>
+        <w:numPr>
+          <w:ilvl w:val="0"/>
+          <w:numId w:val="2"/>
+        </w:numPr>
+        <w:spacing w:after="60" w:line="290"/>
+      </w:pPr>
+      <w:r>
+        <w:t xml:space="preserve">Biên tập viên đăng nhập thấy </w:t>
+      </w:r>
+      <w:r>
+        <w:rPr>
+          <w:b/>
+          <w:bCs/>
+        </w:rPr>
+        <w:t xml:space="preserve">thẻ đầy đủ</w:t>
+      </w:r>
+      <w:r>
+        <w:t xml:space="preserve"> (hình 14, 15): trích đoạn mở sẵn, nhãn </w:t>
+      </w:r>
+      <w:r>
+        <w:rPr>
+          <w:b/>
+          <w:bCs/>
+        </w:rPr>
         <w:t xml:space="preserve">Đã duyệt bằng chứng</w:t>
       </w:r>
       <w:r>
-        <w:t xml:space="preserve">, </w:t>
-      </w:r>
-      <w:r>
-        <w:rPr>
-          <w:b/>
-          <w:bCs/>
-        </w:rPr>
-        <w:t xml:space="preserve">Có mâu thuẫn</w:t>
-      </w:r>
-      <w:r>
-        <w:t xml:space="preserve">, </w:t>
-      </w:r>
-      <w:r>
-        <w:rPr>
-          <w:b/>
-          <w:bCs/>
-        </w:rPr>
-        <w:t xml:space="preserve">Đã từ chối</w:t>
-      </w:r>
-      <w:r>
-        <w:t xml:space="preserve">).</w:t>
+        <w:t xml:space="preserve">, và nhãn “Trích bởi AI, đã qua người duyệt · &lt;tên mô hình&gt;” cho thông tin do AI tìm ra.</w:t>
       </w:r>
     </w:p>
     <w:p>
@@ -3990,177 +4063,153 @@
         <w:spacing w:after="60" w:line="290"/>
       </w:pPr>
       <w:r>
-        <w:t xml:space="preserve">Giá trị in đậm; có thể kèm nhãn hạn nộp (ví dụ </w:t>
-      </w:r>
-      <w:r>
-        <w:rPr>
-          <w:b/>
-          <w:bCs/>
-        </w:rPr>
-        <w:t xml:space="preserve">Hạn nộp: Xét tuyển liên tục</w:t>
-      </w:r>
-      <w:r>
-        <w:t xml:space="preserve">), kỳ số liệu hoặc chỉ số so sánh.</w:t>
-      </w:r>
-    </w:p>
-    <w:p>
-      <w:pPr>
-        <w:pStyle w:val="ListParagraph"/>
-        <w:numPr>
-          <w:ilvl w:val="0"/>
-          <w:numId w:val="2"/>
-        </w:numPr>
-        <w:spacing w:after="60" w:line="290"/>
-      </w:pPr>
-      <w:r>
-        <w:rPr>
-          <w:b/>
-          <w:bCs/>
-        </w:rPr>
-        <w:t xml:space="preserve">Trích đoạn</w:t>
-      </w:r>
-      <w:r>
-        <w:t xml:space="preserve"> trong khung xám: câu nguyên văn lấy từ nguồn.</w:t>
-      </w:r>
-    </w:p>
-    <w:p>
-      <w:pPr>
-        <w:pStyle w:val="ListParagraph"/>
-        <w:numPr>
-          <w:ilvl w:val="0"/>
-          <w:numId w:val="2"/>
-        </w:numPr>
-        <w:spacing w:after="60" w:line="290"/>
-      </w:pPr>
-      <w:r>
-        <w:rPr>
-          <w:b/>
-          <w:bCs/>
-        </w:rPr>
-        <w:t xml:space="preserve">Nguồn</w:t>
-      </w:r>
-      <w:r>
-        <w:t xml:space="preserve"> (kèm nhãn tier), </w:t>
-      </w:r>
-      <w:r>
-        <w:rPr>
-          <w:b/>
-          <w:bCs/>
-        </w:rPr>
-        <w:t xml:space="preserve">Hiệu lực</w:t>
-      </w:r>
-      <w:r>
-        <w:t xml:space="preserve"> (ghi rõ khi nguồn không nêu thời hạn áp dụng), </w:t>
-      </w:r>
-      <w:r>
-        <w:rPr>
-          <w:b/>
-          <w:bCs/>
-        </w:rPr>
-        <w:t xml:space="preserve">Ngày lấy trang nguồn</w:t>
-      </w:r>
-      <w:r>
-        <w:t xml:space="preserve">, </w:t>
-      </w:r>
-      <w:r>
-        <w:rPr>
-          <w:b/>
-          <w:bCs/>
-        </w:rPr>
-        <w:t xml:space="preserve">Ngày duyệt bằng chứng</w:t>
-      </w:r>
-      <w:r>
-        <w:t xml:space="preserve">.</w:t>
-      </w:r>
-    </w:p>
-    <w:p>
-      <w:pPr>
-        <w:pStyle w:val="ListParagraph"/>
-        <w:numPr>
-          <w:ilvl w:val="0"/>
-          <w:numId w:val="2"/>
-        </w:numPr>
-        <w:spacing w:after="60" w:line="290"/>
-      </w:pPr>
-      <w:r>
-        <w:rPr>
-          <w:b/>
-          <w:bCs/>
-        </w:rPr>
-        <w:t xml:space="preserve">Mở trang gốc</w:t>
-      </w:r>
-      <w:r>
-        <w:t xml:space="preserve"> để đọc trang gốc; </w:t>
-      </w:r>
-      <w:r>
-        <w:rPr>
-          <w:b/>
-          <w:bCs/>
-        </w:rPr>
-        <w:t xml:space="preserve">Tài liệu và các phiên bản</w:t>
-      </w:r>
-      <w:r>
-        <w:t xml:space="preserve"> để xem bản ghi tài liệu trong Nordic.</w:t>
-      </w:r>
-    </w:p>
-    <w:p>
-      <w:pPr>
-        <w:pStyle w:val="ListParagraph"/>
-        <w:numPr>
-          <w:ilvl w:val="0"/>
-          <w:numId w:val="2"/>
-        </w:numPr>
-        <w:spacing w:after="60" w:line="290"/>
-      </w:pPr>
-      <w:r>
-        <w:rPr>
-          <w:b/>
-          <w:bCs/>
-        </w:rPr>
-        <w:t xml:space="preserve">Nhãn AI</w:t>
-      </w:r>
-      <w:r>
-        <w:t xml:space="preserve"> (nếu có): “Trích bởi AI, đã qua người duyệt · &lt;tên mô hình&gt;” nghĩa là thông tin do AI tìm ra trong tài liệu, sau đó một người đã đối chiếu với nguồn. Thông tin nhập tay không có nhãn này.</w:t>
-      </w:r>
-    </w:p>
-    <w:p>
-      <w:pPr>
-        <w:pStyle w:val="ListParagraph"/>
-        <w:numPr>
-          <w:ilvl w:val="0"/>
-          <w:numId w:val="2"/>
-        </w:numPr>
-        <w:spacing w:after="60" w:line="290"/>
-      </w:pPr>
-      <w:r>
-        <w:rPr>
-          <w:b/>
-          <w:bCs/>
-        </w:rPr>
-        <w:t xml:space="preserve">Khung cam “Trang nguồn đã thay đổi từ …”</w:t>
-      </w:r>
-      <w:r>
-        <w:t xml:space="preserve"> (nếu có): hệ thống phát hiện trang nguồn đã đổi nội dung sau khi thông tin được duyệt. Thông tin vẫn hiển thị nhưng </w:t>
-      </w:r>
-      <w:r>
-        <w:rPr>
-          <w:b/>
-          <w:bCs/>
-        </w:rPr>
-        <w:t xml:space="preserve">có thể đã cũ</w:t>
-      </w:r>
-      <w:r>
-        <w:t xml:space="preserve">; bấm </w:t>
-      </w:r>
-      <w:r>
-        <w:rPr>
-          <w:b/>
-          <w:bCs/>
-        </w:rPr>
-        <w:t xml:space="preserve">Xem phiên bản mới</w:t>
-      </w:r>
-      <w:r>
-        <w:t xml:space="preserve"> để đọc bản mới của trang.</w:t>
+        <w:t xml:space="preserve">Trang </w:t>
+      </w:r>
+      <w:r>
+        <w:rPr>
+          <w:b/>
+          <w:bCs/>
+        </w:rPr>
+        <w:t xml:space="preserve">Bằng chứng → Thông tin</w:t>
+      </w:r>
+      <w:r>
+        <w:t xml:space="preserve"> có bộ lọc </w:t>
+      </w:r>
+      <w:r>
+        <w:rPr>
+          <w:b/>
+          <w:bCs/>
+        </w:rPr>
+        <w:t xml:space="preserve">Chủ đề</w:t>
+      </w:r>
+      <w:r>
+        <w:t xml:space="preserve"> (Học phí &amp; chi phí, Tuyển sinh &amp; hạn nộp, Visa &amp; giấy phép, Lương &amp; việc làm, Khác).</w:t>
+      </w:r>
+    </w:p>
+    <w:p>
+      <w:pPr>
+        <w:keepNext/>
+        <w:spacing w:after="60" w:before="120"/>
+        <w:jc w:val="center"/>
+      </w:pPr>
+      <w:r>
+        <w:drawing>
+          <wp:inline distT="0" distB="0" distL="0" distR="0">
+            <wp:extent cx="5715000" cy="1166326"/>
+            <wp:effectExtent t="0" r="0" b="0" l="0"/>
+            <wp:docPr id="301" name="fig13b" descr="Trang chủ và thanh điều hướng." title="Hình 1"/>
+            <wp:cNvGraphicFramePr>
+              <a:graphicFrameLocks xmlns:a="http://schemas.openxmlformats.org/drawingml/2006/main" noChangeAspect="1"/>
+            </wp:cNvGraphicFramePr>
+            <a:graphic xmlns:a="http://schemas.openxmlformats.org/drawingml/2006/main">
+              <a:graphicData uri="http://schemas.openxmlformats.org/drawingml/2006/picture">
+                <pic:pic xmlns:pic="http://schemas.openxmlformats.org/drawingml/2006/picture">
+                  <pic:nvPicPr>
+                    <pic:cNvPr id="0" name="" descr=""/>
+                    <pic:cNvPicPr>
+                      <a:picLocks noChangeAspect="1" noChangeArrowheads="1"/>
+                    </pic:cNvPicPr>
+                  </pic:nvPicPr>
+                  <pic:blipFill>
+                    <a:blip r:embed="rId42" cstate="none"/>
+                    <a:srcRect/>
+                    <a:stretch>
+                      <a:fillRect/>
+                    </a:stretch>
+                  </pic:blipFill>
+                  <pic:spPr bwMode="auto">
+                    <a:xfrm>
+                      <a:off x="0" y="0"/>
+                      <a:ext cx="5715000" cy="1166326"/>
+                    </a:xfrm>
+                    <a:prstGeom prst="rect">
+                      <a:avLst/>
+                    </a:prstGeom>
+                  </pic:spPr>
+                </pic:pic>
+              </a:graphicData>
+            </a:graphic>
+          </wp:inline>
+        </w:drawing>
+      </w:r>
+    </w:p>
+    <w:p>
+      <w:pPr>
+        <w:spacing w:after="240"/>
+        <w:jc w:val="center"/>
+      </w:pPr>
+      <w:r>
+        <w:rPr>
+          <w:i/>
+          <w:iCs/>
+          <w:color w:val="6E6E73"/>
+          <w:sz w:val="18"/>
+          <w:szCs w:val="18"/>
+        </w:rPr>
+        <w:t xml:space="preserve">Hình 13b. Thẻ thông tin gọn mà người xem thấy.</w:t>
+      </w:r>
+    </w:p>
+    <w:p>
+      <w:pPr>
+        <w:keepNext/>
+        <w:spacing w:after="60" w:before="120"/>
+        <w:jc w:val="center"/>
+      </w:pPr>
+      <w:r>
+        <w:drawing>
+          <wp:inline distT="0" distB="0" distL="0" distR="0">
+            <wp:extent cx="5715000" cy="2317362"/>
+            <wp:effectExtent t="0" r="0" b="0" l="0"/>
+            <wp:docPr id="302" name="fig13c" descr="Trang chủ và thanh điều hướng." title="Hình 1"/>
+            <wp:cNvGraphicFramePr>
+              <a:graphicFrameLocks xmlns:a="http://schemas.openxmlformats.org/drawingml/2006/main" noChangeAspect="1"/>
+            </wp:cNvGraphicFramePr>
+            <a:graphic xmlns:a="http://schemas.openxmlformats.org/drawingml/2006/main">
+              <a:graphicData uri="http://schemas.openxmlformats.org/drawingml/2006/picture">
+                <pic:pic xmlns:pic="http://schemas.openxmlformats.org/drawingml/2006/picture">
+                  <pic:nvPicPr>
+                    <pic:cNvPr id="0" name="" descr=""/>
+                    <pic:cNvPicPr>
+                      <a:picLocks noChangeAspect="1" noChangeArrowheads="1"/>
+                    </pic:cNvPicPr>
+                  </pic:nvPicPr>
+                  <pic:blipFill>
+                    <a:blip r:embed="rId43" cstate="none"/>
+                    <a:srcRect/>
+                    <a:stretch>
+                      <a:fillRect/>
+                    </a:stretch>
+                  </pic:blipFill>
+                  <pic:spPr bwMode="auto">
+                    <a:xfrm>
+                      <a:off x="0" y="0"/>
+                      <a:ext cx="5715000" cy="2317362"/>
+                    </a:xfrm>
+                    <a:prstGeom prst="rect">
+                      <a:avLst/>
+                    </a:prstGeom>
+                  </pic:spPr>
+                </pic:pic>
+              </a:graphicData>
+            </a:graphic>
+          </wp:inline>
+        </w:drawing>
+      </w:r>
+    </w:p>
+    <w:p>
+      <w:pPr>
+        <w:spacing w:after="240"/>
+        <w:jc w:val="center"/>
+      </w:pPr>
+      <w:r>
+        <w:rPr>
+          <w:i/>
+          <w:iCs/>
+          <w:color w:val="6E6E73"/>
+          <w:sz w:val="18"/>
+          <w:szCs w:val="18"/>
+        </w:rPr>
+        <w:t xml:space="preserve">Hình 13c. Cùng thẻ sau khi bấm “Xem bằng chứng”.</w:t>
       </w:r>
     </w:p>
     <w:p>
@@ -4270,7 +4319,7 @@
           <w:sz w:val="18"/>
           <w:szCs w:val="18"/>
         </w:rPr>
-        <w:t xml:space="preserve">Hình 14. Minh họa các trạng thái của thẻ thông tin (dữ liệu DEMO).</w:t>
+        <w:t xml:space="preserve">Hình 14. Thẻ đầy đủ mà biên tập viên thấy, với các trạng thái (dữ liệu DEMO).</w:t>
       </w:r>
     </w:p>
     <w:p>
@@ -4291,7 +4340,7 @@
         <w:t xml:space="preserve">Ghi chú: </w:t>
       </w:r>
       <w:r>
-        <w:t xml:space="preserve">“Đã duyệt bằng chứng” nghĩa là người biên tập đã đối chiếu trích đoạn với nguồn. Nhãn này không có nghĩa thông tin chắc chắn còn hiệu lực hôm nay; vì vậy thẻ luôn ghi “Hiệu lực hiện tại chưa được xác minh”.</w:t>
+        <w:t xml:space="preserve">“Đã duyệt bằng chứng” nghĩa là người biên tập đã đối chiếu trích đoạn với nguồn; nhãn này chỉ biên tập viên thấy, vì mọi thông tin người xem thấy đều đã được duyệt. Duyệt không có nghĩa thông tin chắc chắn còn hiệu lực hôm nay; vì vậy thẻ luôn ghi trạng thái hiệu lực.</w:t>
       </w:r>
     </w:p>
     <w:p>
@@ -4406,7 +4455,7 @@
         <w:t xml:space="preserve">Bằng chứng → Nguồn</w:t>
       </w:r>
       <w:r>
-        <w:t xml:space="preserve"> để xem danh sách nguồn; lọc theo quốc gia, tier, trạng thái xác minh, hoặc tìm theo tên/URL.</w:t>
+        <w:t xml:space="preserve">: danh sách nguồn dạng bảng (tên, mức độ, xác minh, quốc gia, tên miền); lọc theo quốc gia, tier, trạng thái xác minh, hoặc tìm theo tên/URL.</w:t>
       </w:r>
     </w:p>
     <w:p>
@@ -4419,7 +4468,40 @@
         <w:spacing w:after="80" w:line="290"/>
       </w:pPr>
       <w:r>
-        <w:t xml:space="preserve">Bấm một nguồn để xem đầy đủ: URL, tier, quốc gia, ngày xác minh gần nhất, trạng thái crawl, ghi chú về thẩm quyền, và các tài liệu đã nhập từ nguồn đó.</w:t>
+        <w:t xml:space="preserve">Bấm một hàng để mở </w:t>
+      </w:r>
+      <w:r>
+        <w:rPr>
+          <w:b/>
+          <w:bCs/>
+        </w:rPr>
+        <w:t xml:space="preserve">khung chi tiết bên phải</w:t>
+      </w:r>
+      <w:r>
+        <w:t xml:space="preserve"> (trên điện thoại trượt từ dưới lên): URL, tier, quốc gia, loại và ngôn ngữ, chủ đề, ngày xác minh gần nhất, và các tài liệu đã nhập. Bấm ✕ hoặc phím Esc để đóng; </w:t>
+      </w:r>
+      <w:r>
+        <w:rPr>
+          <w:b/>
+          <w:bCs/>
+        </w:rPr>
+        <w:t xml:space="preserve">Mở trang riêng của nguồn này</w:t>
+      </w:r>
+      <w:r>
+        <w:t xml:space="preserve"> cho link để chia sẻ.</w:t>
+      </w:r>
+    </w:p>
+    <w:p>
+      <w:pPr>
+        <w:pStyle w:val="ListParagraph"/>
+        <w:numPr>
+          <w:ilvl w:val="0"/>
+          <w:numId w:val="5"/>
+        </w:numPr>
+        <w:spacing w:after="80" w:line="290"/>
+      </w:pPr>
+      <w:r>
+        <w:t xml:space="preserve">Thông tin vận hành của nguồn (crawl, tần suất, căn cứ xác minh, ghi chú nội bộ) chỉ hiện với biên tập viên.</w:t>
       </w:r>
     </w:p>
     <w:p>
@@ -4477,7 +4559,7 @@
       <w:r>
         <w:drawing>
           <wp:inline distT="0" distB="0" distL="0" distR="0">
-            <wp:extent cx="5715000" cy="7143750"/>
+            <wp:extent cx="5715000" cy="5804296"/>
             <wp:effectExtent t="0" r="0" b="0" l="0"/>
             <wp:docPr id="1" name="fig16" descr="Danh sách nguồn." title="Hình 16"/>
             <wp:cNvGraphicFramePr>
@@ -4502,7 +4584,7 @@
                   <pic:spPr bwMode="auto">
                     <a:xfrm>
                       <a:off x="0" y="0"/>
-                      <a:ext cx="5715000" cy="7143750"/>
+                      <a:ext cx="5715000" cy="5804296"/>
                     </a:xfrm>
                     <a:prstGeom prst="rect">
                       <a:avLst/>
@@ -4528,7 +4610,7 @@
           <w:sz w:val="18"/>
           <w:szCs w:val="18"/>
         </w:rPr>
-        <w:t xml:space="preserve">Hình 16. Danh sách nguồn.</w:t>
+        <w:t xml:space="preserve">Hình 16. Danh sách nguồn dạng bảng.</w:t>
       </w:r>
     </w:p>
     <w:p>
@@ -4540,7 +4622,7 @@
       <w:r>
         <w:drawing>
           <wp:inline distT="0" distB="0" distL="0" distR="0">
-            <wp:extent cx="5715000" cy="5420320"/>
+            <wp:extent cx="5715000" cy="4464843"/>
             <wp:effectExtent t="0" r="0" b="0" l="0"/>
             <wp:docPr id="1" name="fig17" descr="Trang chi tiết một nguồn." title="Hình 17"/>
             <wp:cNvGraphicFramePr>
@@ -4565,7 +4647,7 @@
                   <pic:spPr bwMode="auto">
                     <a:xfrm>
                       <a:off x="0" y="0"/>
-                      <a:ext cx="5715000" cy="5420320"/>
+                      <a:ext cx="5715000" cy="4464843"/>
                     </a:xfrm>
                     <a:prstGeom prst="rect">
                       <a:avLst/>
@@ -4591,7 +4673,7 @@
           <w:sz w:val="18"/>
           <w:szCs w:val="18"/>
         </w:rPr>
-        <w:t xml:space="preserve">Hình 17. Trang chi tiết một nguồn.</w:t>
+        <w:t xml:space="preserve">Hình 17. Bấm một nguồn: khung chi tiết bên phải (người xem thường).</w:t>
       </w:r>
     </w:p>
     <w:p>
@@ -6291,7 +6373,17 @@
         <w:t xml:space="preserve">Quản trị</w:t>
       </w:r>
       <w:r>
-        <w:t xml:space="preserve">.</w:t>
+        <w:t xml:space="preserve">. Quản trị viên có thêm ô </w:t>
+      </w:r>
+      <w:r>
+        <w:rPr>
+          <w:b/>
+          <w:bCs/>
+        </w:rPr>
+        <w:t xml:space="preserve">Bảng điều khiển quản trị</w:t>
+      </w:r>
+      <w:r>
+        <w:t xml:space="preserve"> (mục 5.12).</w:t>
       </w:r>
     </w:p>
     <w:p>
@@ -10672,6 +10764,206 @@
     </w:p>
     <w:p>
       <w:pPr>
+        <w:pStyle w:val="Heading2"/>
+      </w:pPr>
+      <w:r>
+        <w:t xml:space="preserve">5.12 Bảng điều khiển quản trị</w:t>
+      </w:r>
+    </w:p>
+    <w:p>
+      <w:pPr>
+        <w:spacing w:after="120" w:line="300"/>
+      </w:pPr>
+      <w:r>
+        <w:t xml:space="preserve">Người có quyền </w:t>
+      </w:r>
+      <w:r>
+        <w:rPr>
+          <w:b/>
+          <w:bCs/>
+        </w:rPr>
+        <w:t xml:space="preserve">Quản lý vai trò</w:t>
+      </w:r>
+      <w:r>
+        <w:t xml:space="preserve"> mở </w:t>
+      </w:r>
+      <w:r>
+        <w:rPr>
+          <w:b/>
+          <w:bCs/>
+        </w:rPr>
+        <w:t xml:space="preserve">Biên tập → Bảng điều khiển quản trị</w:t>
+      </w:r>
+      <w:r>
+        <w:t xml:space="preserve"> (/admin). Trang chỉ để xem, gồm ba phần; mỗi con số đều dẫn tới trang có thể xử lý nó:</w:t>
+      </w:r>
+    </w:p>
+    <w:p>
+      <w:pPr>
+        <w:pStyle w:val="ListParagraph"/>
+        <w:numPr>
+          <w:ilvl w:val="0"/>
+          <w:numId w:val="2"/>
+        </w:numPr>
+        <w:spacing w:after="60" w:line="290"/>
+      </w:pPr>
+      <w:r>
+        <w:rPr>
+          <w:b/>
+          <w:bCs/>
+        </w:rPr>
+        <w:t xml:space="preserve">Tình trạng hệ thống</w:t>
+      </w:r>
+      <w:r>
+        <w:t xml:space="preserve">: crawler (lần chạy gần nhất, số URL đang theo dõi và cần xem lại, biểu đồ kết quả lần lấy gần nhất, cảnh báo khi quá 8 ngày chưa chạy) và trích xuất AI trong 30 ngày (yêu cầu đang chờ, lần chạy lỗi, token theo ngày, cảnh báo khi chưa chọn tài khoản AI).</w:t>
+      </w:r>
+    </w:p>
+    <w:p>
+      <w:pPr>
+        <w:pStyle w:val="ListParagraph"/>
+        <w:numPr>
+          <w:ilvl w:val="0"/>
+          <w:numId w:val="2"/>
+        </w:numPr>
+        <w:spacing w:after="60" w:line="290"/>
+      </w:pPr>
+      <w:r>
+        <w:rPr>
+          <w:b/>
+          <w:bCs/>
+        </w:rPr>
+        <w:t xml:space="preserve">Độ phủ dữ liệu</w:t>
+      </w:r>
+      <w:r>
+        <w:t xml:space="preserve">: biểu đồ thông tin theo quốc gia (đã duyệt, chờ duyệt, mâu thuẫn) và bảng theo nước: nguồn đã xác minh / tổng, thông tin, trường, chương trình, quy định, nghề. Trường, chương trình, quy định và nghề chỉ đếm mục đã duyệt.</w:t>
+      </w:r>
+    </w:p>
+    <w:p>
+      <w:pPr>
+        <w:pStyle w:val="ListParagraph"/>
+        <w:numPr>
+          <w:ilvl w:val="0"/>
+          <w:numId w:val="2"/>
+        </w:numPr>
+        <w:spacing w:after="60" w:line="290"/>
+      </w:pPr>
+      <w:r>
+        <w:rPr>
+          <w:b/>
+          <w:bCs/>
+        </w:rPr>
+        <w:t xml:space="preserve">Hoạt động duyệt</w:t>
+      </w:r>
+      <w:r>
+        <w:t xml:space="preserve">: chọn </w:t>
+      </w:r>
+      <w:r>
+        <w:rPr>
+          <w:b/>
+          <w:bCs/>
+        </w:rPr>
+        <w:t xml:space="preserve">7 ngày</w:t>
+      </w:r>
+      <w:r>
+        <w:t xml:space="preserve"> hoặc </w:t>
+      </w:r>
+      <w:r>
+        <w:rPr>
+          <w:b/>
+          <w:bCs/>
+        </w:rPr>
+        <w:t xml:space="preserve">30 ngày</w:t>
+      </w:r>
+      <w:r>
+        <w:t xml:space="preserve">; biểu đồ quyết định theo ngày (giờ UTC), bảng Duyệt / Từ chối / Mâu thuẫn / Vẫn khớp nguồn mới theo khu vực, và số mục đang chờ cùng mục chờ lâu nhất.</w:t>
+      </w:r>
+    </w:p>
+    <w:p>
+      <w:pPr>
+        <w:keepNext/>
+        <w:spacing w:after="60" w:before="120"/>
+        <w:jc w:val="center"/>
+      </w:pPr>
+      <w:r>
+        <w:drawing>
+          <wp:inline distT="0" distB="0" distL="0" distR="0">
+            <wp:extent cx="4051495" cy="8229600"/>
+            <wp:effectExtent t="0" r="0" b="0" l="0"/>
+            <wp:docPr id="303" name="fig22c" descr="Trang chủ và thanh điều hướng." title="Hình 1"/>
+            <wp:cNvGraphicFramePr>
+              <a:graphicFrameLocks xmlns:a="http://schemas.openxmlformats.org/drawingml/2006/main" noChangeAspect="1"/>
+            </wp:cNvGraphicFramePr>
+            <a:graphic xmlns:a="http://schemas.openxmlformats.org/drawingml/2006/main">
+              <a:graphicData uri="http://schemas.openxmlformats.org/drawingml/2006/picture">
+                <pic:pic xmlns:pic="http://schemas.openxmlformats.org/drawingml/2006/picture">
+                  <pic:nvPicPr>
+                    <pic:cNvPr id="0" name="" descr=""/>
+                    <pic:cNvPicPr>
+                      <a:picLocks noChangeAspect="1" noChangeArrowheads="1"/>
+                    </pic:cNvPicPr>
+                  </pic:nvPicPr>
+                  <pic:blipFill>
+                    <a:blip r:embed="rId44" cstate="none"/>
+                    <a:srcRect/>
+                    <a:stretch>
+                      <a:fillRect/>
+                    </a:stretch>
+                  </pic:blipFill>
+                  <pic:spPr bwMode="auto">
+                    <a:xfrm>
+                      <a:off x="0" y="0"/>
+                      <a:ext cx="4051495" cy="8229600"/>
+                    </a:xfrm>
+                    <a:prstGeom prst="rect">
+                      <a:avLst/>
+                    </a:prstGeom>
+                  </pic:spPr>
+                </pic:pic>
+              </a:graphicData>
+            </a:graphic>
+          </wp:inline>
+        </w:drawing>
+      </w:r>
+    </w:p>
+    <w:p>
+      <w:pPr>
+        <w:spacing w:after="240"/>
+        <w:jc w:val="center"/>
+      </w:pPr>
+      <w:r>
+        <w:rPr>
+          <w:i/>
+          <w:iCs/>
+          <w:color w:val="6E6E73"/>
+          <w:sz w:val="18"/>
+          <w:szCs w:val="18"/>
+        </w:rPr>
+        <w:t xml:space="preserve">Hình 22c. Bảng điều khiển quản trị với biểu đồ (dữ liệu DEMO).</w:t>
+      </w:r>
+    </w:p>
+    <w:p>
+      <w:pPr>
+        <w:pBdr>
+          <w:left w:val="single" w:color="0071E3" w:sz="18" w:space="8"/>
+        </w:pBdr>
+        <w:shd w:fill="EAF3FF" w:color="auto" w:val="clear"/>
+        <w:spacing w:after="200" w:before="120" w:line="290"/>
+        <w:ind w:left="120" w:right="120"/>
+      </w:pPr>
+      <w:r>
+        <w:rPr>
+          <w:b/>
+          <w:bCs/>
+          <w:color w:val="0071E3"/>
+        </w:rPr>
+        <w:t xml:space="preserve">Ghi chú: </w:t>
+      </w:r>
+      <w:r>
+        <w:t xml:space="preserve">Mọi con số là số dòng bạn được phép đọc. Phần nào bạn thiếu quyền đọc sẽ ghi “Cần quyền …” thay vì hiện 0; “Không tải được” nghĩa là truy vấn lỗi; “Chưa đếm đủ” nghĩa là có bảng quá 5.000 dòng. Trang không có điểm số hay xếp hạng.</w:t>
+      </w:r>
+    </w:p>
+    <w:p>
+      <w:pPr>
         <w:pStyle w:val="Heading1"/>
         <w:pageBreakBefore/>
       </w:pPr>
@@ -11114,7 +11406,7 @@
           </w:tcPr>
           <w:p>
             <w:r>
-              <w:t xml:space="preserve">Đề xuất bởi AI / Trích bởi AI, đã qua người duyệt</w:t>
+              <w:t xml:space="preserve">Đề xuất bởi AI / Trích bởi AI, đã qua người duyệt (chỉ biên tập viên thấy)</w:t>
             </w:r>
           </w:p>
         </w:tc>
@@ -12248,7 +12540,7 @@
         <w:pStyle w:val="Heading3"/>
       </w:pPr>
       <w:r>
-        <w:t xml:space="preserve">Thông tin có nhãn AI có đáng tin không?</w:t>
+        <w:t xml:space="preserve">Thông tin do AI tìm ra có đáng tin không?</w:t>
       </w:r>
     </w:p>
     <w:p>
@@ -12256,7 +12548,7 @@
         <w:spacing w:after="120" w:line="300"/>
       </w:pPr>
       <w:r>
-        <w:t xml:space="preserve">Thông tin công khai có nhãn “Trích bởi AI, đã qua người duyệt” đã được một người đối chiếu với trang nguồn, giống như thông tin nhập tay. Nhãn chỉ cho biết ai tìm ra thông tin đó. Đề xuất AI chưa duyệt không bao giờ hiển thị công khai.</w:t>
+        <w:t xml:space="preserve">Thông tin do AI tìm ra chỉ được công khai sau khi một người đã đối chiếu với trang nguồn, giống như thông tin nhập tay; nguồn, ngày lấy trang và hiệu lực luôn hiện trên thẻ. Từ phiên bản 3.1, nhãn AI chỉ biên tập viên thấy. Đề xuất AI chưa duyệt không bao giờ hiển thị công khai.</w:t>
       </w:r>
     </w:p>
     <w:p>
@@ -12795,6 +13087,77 @@
           <w:p>
             <w:r>
               <w:t xml:space="preserve">Cập nhật theo giao diện tiếng Việt mới: thanh điều hướng năm mục, nút tài khoản, thanh tiến trình (2.1–2.2); tên nút và bộ lọc (chương 3); đổi tên khu vực cá nhân (chương 4); trang Tổng quan và phân quyền dạng bảng (5.1); Quản lý nguồn chia đôi (5.2); trang duyệt chia đôi và khung thông tin cùng trang (5.4); crawler, trích xuất AI, chỉ số dạng bảng (5.8, 5.9, 5.11). Chụp lại hình 1–13, 16–22; thêm hình 21b, 21c; bỏ hình minh họa crawler cũ; hình các nhãn màu thành hình 23.</w:t>
+            </w:r>
+          </w:p>
+        </w:tc>
+      </w:tr>
+      <w:tr>
+        <w:trPr>
+          <w:cantSplit/>
+        </w:trPr>
+        <w:tc>
+          <w:tcPr>
+            <w:tcW w:type="dxa" w:w="1400"/>
+            <w:tcBorders>
+              <w:top w:val="single" w:color="D2D2D7" w:sz="4"/>
+              <w:left w:val="single" w:color="D2D2D7" w:sz="4"/>
+              <w:bottom w:val="single" w:color="D2D2D7" w:sz="4"/>
+              <w:right w:val="single" w:color="D2D2D7" w:sz="4"/>
+            </w:tcBorders>
+            <w:tcMar>
+              <w:top w:type="dxa" w:w="80"/>
+              <w:left w:type="dxa" w:w="120"/>
+              <w:bottom w:type="dxa" w:w="80"/>
+              <w:right w:type="dxa" w:w="120"/>
+            </w:tcMar>
+          </w:tcPr>
+          <w:p>
+            <w:r>
+              <w:t xml:space="preserve">3.1</w:t>
+            </w:r>
+          </w:p>
+        </w:tc>
+        <w:tc>
+          <w:tcPr>
+            <w:tcW w:type="dxa" w:w="1600"/>
+            <w:tcBorders>
+              <w:top w:val="single" w:color="D2D2D7" w:sz="4"/>
+              <w:left w:val="single" w:color="D2D2D7" w:sz="4"/>
+              <w:bottom w:val="single" w:color="D2D2D7" w:sz="4"/>
+              <w:right w:val="single" w:color="D2D2D7" w:sz="4"/>
+            </w:tcBorders>
+            <w:tcMar>
+              <w:top w:type="dxa" w:w="80"/>
+              <w:left w:type="dxa" w:w="120"/>
+              <w:bottom w:type="dxa" w:w="80"/>
+              <w:right w:type="dxa" w:w="120"/>
+            </w:tcMar>
+          </w:tcPr>
+          <w:p>
+            <w:r>
+              <w:t xml:space="preserve">2026-10-03</w:t>
+            </w:r>
+          </w:p>
+        </w:tc>
+        <w:tc>
+          <w:tcPr>
+            <w:tcW w:type="dxa" w:w="6026"/>
+            <w:tcBorders>
+              <w:top w:val="single" w:color="D2D2D7" w:sz="4"/>
+              <w:left w:val="single" w:color="D2D2D7" w:sz="4"/>
+              <w:bottom w:val="single" w:color="D2D2D7" w:sz="4"/>
+              <w:right w:val="single" w:color="D2D2D7" w:sz="4"/>
+            </w:tcBorders>
+            <w:tcMar>
+              <w:top w:type="dxa" w:w="80"/>
+              <w:left w:type="dxa" w:w="120"/>
+              <w:bottom w:type="dxa" w:w="80"/>
+              <w:right w:type="dxa" w:w="120"/>
+            </w:tcMar>
+          </w:tcPr>
+          <w:p>
+            <w:r>
+              <w:t xml:space="preserve">Trang quốc gia mới (3.1); thẻ thông tin gọn, bộ lọc Chủ đề và thẻ đầy đủ cho biên tập viên (3.8); trang Nguồn dạng bảng và khung chi tiết (3.9); thông tin vận hành chỉ biên tập viên thấy (1.1, 3.1, 3.8, 3.9, 6.3); thêm 5.12 Bảng điều khiển quản trị. Chụp lại hình 3, 4, 16, 17; thêm hình 13b, 13c, 22c.</w:t>
             </w:r>
           </w:p>
         </w:tc>

</xml_diff>